<commit_message>
Document polish: fix Generated date on page 1, widen xlsx Summary label column
</commit_message>
<xml_diff>
--- a/generated-docs/Nof1_HealthAnalysis_SUB-2026-003_DRAFT.docx
+++ b/generated-docs/Nof1_HealthAnalysis_SUB-2026-003_DRAFT.docx
@@ -750,7 +750,7 @@
                 <w:sz w:val="20"/>
                 <w:szCs w:val="20"/>
               </w:rPr>
-              <w:t xml:space="preserve">—</w:t>
+              <w:t xml:space="preserve">30 May 2026, 6:38 pm</w:t>
             </w:r>
           </w:p>
         </w:tc>
@@ -793,7 +793,7 @@
           <w:sz w:val="22"/>
           <w:szCs w:val="22"/>
         </w:rPr>
-        <w:t xml:space="preserve">Organic Acids panel shows a multi-axis pattern: xenobiotic/benzene exposure markers elevated, tryptophan-kynurenine pathway shunted toward the quinolinic/neurotoxic arm with low 5-HIAA, mitochondrial TCA cycle stress (isocitric and 2-oxoglutaric elevated), oxidative DNA damage marker (8-OHdG) elevated, leukotriene-mediated inflammation elevated, and a dysbiosis fingerprint (elevated arabinose, 4-HBA, 3,4-DHBA, 3-HPAA) — for practitioner consideration.</w:t>
+        <w:t xml:space="preserve">Organic Acids profile shows a multi-pattern picture: xenobiotic exposure (benzene/xylene/paraben markers), oxidative stress with mitochondrial/TCA disturbance, kynurenine pathway shift toward quinolinic acid, methylation/one-carbon stress, and elevated leukotriene E4 — for practitioner consideration.</w:t>
       </w:r>
     </w:p>
     <w:p>
@@ -851,7 +851,7 @@
           <w:sz w:val="20"/>
           <w:szCs w:val="20"/>
         </w:rPr>
-        <w:t xml:space="preserve">Supporting findings: t,t-Muconic acid 0.20 (H), 3-Methylhippuric acid 0.34 (H), 5-Hydroxymethyl-2-furoic acid 18.5 (H), Benzoic acid 25.0 (H), 4-HBA 0.64 (H)</w:t>
+        <w:t xml:space="preserve">Supporting findings: Benzoic Acid 25.0 (&lt;9.3), t,t-Muconic Acid 0.20 (&lt;0.12), 3-Methylhippuric Acid 0.34 (&lt;0.11), 4-Hydroxybenzoic Acid 0.64 (&lt;0.57), 5-Hydroxymethyl-2-furoic Acid 18.5 (&lt;10.0), Furancarbonylglycine 2.9 (&lt;2.0)</w:t>
       </w:r>
     </w:p>
     <w:p>
@@ -878,7 +878,7 @@
           <w:sz w:val="22"/>
           <w:szCs w:val="22"/>
         </w:rPr>
-        <w:t xml:space="preserve">Inflammatory-metabolic (tryptophan-kynurenine shunt + leukotriene + oxidative DNA damage)</w:t>
+        <w:t xml:space="preserve">Oxidative stress / redox-stressed</w:t>
       </w:r>
     </w:p>
     <w:p>
@@ -893,7 +893,7 @@
           <w:sz w:val="20"/>
           <w:szCs w:val="20"/>
         </w:rPr>
-        <w:t xml:space="preserve">Supporting findings: Quinolinic 11.80 (H), Kynurenic 3.10 (H), Xanthurenic 1.92 (H), Quinolinic/5-HIAA ratio 10.4 (H), Leukotriene E4 195 (H), 8-OHdG 3.80 (H)</w:t>
+        <w:t xml:space="preserve">Supporting findings: 8-hydroxy-deoxyguanosine 3.80 (&lt;2.70), Leukotriene E4 195 (&lt;100), KMBA 3.20 (&lt;1.50), Pyroglutamic Acid 28.8 (upper portion of 4.5-33.0)</w:t>
       </w:r>
     </w:p>
     <w:p>
@@ -920,7 +920,7 @@
           <w:sz w:val="22"/>
           <w:szCs w:val="22"/>
         </w:rPr>
-        <w:t xml:space="preserve">Mitochondrial TCA strain</w:t>
+        <w:t xml:space="preserve">Mitochondrial / TCA flux strain</w:t>
       </w:r>
     </w:p>
     <w:p>
@@ -935,7 +935,7 @@
           <w:sz w:val="20"/>
           <w:szCs w:val="20"/>
         </w:rPr>
-        <w:t xml:space="preserve">Supporting findings: Isocitric acid 86 (H), 2-Oxoglutaric acid 65 (H), 3-Methylglutaconic acid 6.32 (H), Mevalonolactone 2.80 (H)</w:t>
+        <w:t xml:space="preserve">Supporting findings: Isocitric Acid 86 (5-65), 2-Oxoglutaric Acid 65 (2-45), 3-Methylglutaconic Acid 6.32 (&lt;5.50), Adipic Acid 4.30 (&lt;3.80), Mevalonolactone 2.80 (&lt;2.00)</w:t>
       </w:r>
     </w:p>
     <w:p>
@@ -962,7 +962,7 @@
           <w:sz w:val="22"/>
           <w:szCs w:val="22"/>
         </w:rPr>
-        <w:t xml:space="preserve">Dysbiosis fingerprint</w:t>
+        <w:t xml:space="preserve">Kynurenine pathway shift / functional B6 insufficiency</w:t>
       </w:r>
     </w:p>
     <w:p>
@@ -977,7 +977,91 @@
           <w:sz w:val="20"/>
           <w:szCs w:val="20"/>
         </w:rPr>
-        <w:t xml:space="preserve">Supporting findings: Arabinose 42 (H), 3,4-DHBA 62 (H), 3-HPAA 12 (H), Furancarbonylglycine 2.90 (H), 5-HMF 18.5 (H)</w:t>
+        <w:t xml:space="preserve">Supporting findings: Quinolinic Acid 11.80 (&lt;9.10), Kynurenic Acid 3.10 (&lt;2.20), Xanthurenic Acid 1.92 (&lt;0.96), Quinolinic/5-HIAA 10.4 (&lt;5.0)</w:t>
+      </w:r>
+    </w:p>
+    <w:p>
+      <w:pPr>
+        <w:spacing w:after="60"/>
+      </w:pPr>
+      <w:r>
+        <w:rPr>
+          <w:rFonts w:ascii="Roboto" w:cs="Roboto" w:eastAsia="Roboto" w:hAnsi="Roboto"/>
+          <w:b/>
+          <w:bCs/>
+          <w:color w:val="C3AF88"/>
+          <w:sz w:val="22"/>
+          <w:szCs w:val="22"/>
+        </w:rPr>
+        <w:t xml:space="preserve">• </w:t>
+      </w:r>
+      <w:r>
+        <w:rPr>
+          <w:rFonts w:ascii="Roboto" w:cs="Roboto" w:eastAsia="Roboto" w:hAnsi="Roboto"/>
+          <w:b/>
+          <w:bCs/>
+          <w:color w:val="000000"/>
+          <w:sz w:val="22"/>
+          <w:szCs w:val="22"/>
+        </w:rPr>
+        <w:t xml:space="preserve">Methylation / one-carbon stress</w:t>
+      </w:r>
+    </w:p>
+    <w:p>
+      <w:pPr>
+        <w:spacing w:after="120"/>
+        <w:ind w:left="360"/>
+      </w:pPr>
+      <w:r>
+        <w:rPr>
+          <w:rFonts w:ascii="Roboto" w:cs="Roboto" w:eastAsia="Roboto" w:hAnsi="Roboto"/>
+          <w:color w:val="666666"/>
+          <w:sz w:val="20"/>
+          <w:szCs w:val="20"/>
+        </w:rPr>
+        <w:t xml:space="preserve">Supporting findings: 5-Methylcytosine 68 (10-50), Guanidinoacetic Acid 4.80 (0.5-3.0), KMBA 3.20 (&lt;1.50)</w:t>
+      </w:r>
+    </w:p>
+    <w:p>
+      <w:pPr>
+        <w:spacing w:after="60"/>
+      </w:pPr>
+      <w:r>
+        <w:rPr>
+          <w:rFonts w:ascii="Roboto" w:cs="Roboto" w:eastAsia="Roboto" w:hAnsi="Roboto"/>
+          <w:b/>
+          <w:bCs/>
+          <w:color w:val="C3AF88"/>
+          <w:sz w:val="22"/>
+          <w:szCs w:val="22"/>
+        </w:rPr>
+        <w:t xml:space="preserve">• </w:t>
+      </w:r>
+      <w:r>
+        <w:rPr>
+          <w:rFonts w:ascii="Roboto" w:cs="Roboto" w:eastAsia="Roboto" w:hAnsi="Roboto"/>
+          <w:b/>
+          <w:bCs/>
+          <w:color w:val="000000"/>
+          <w:sz w:val="22"/>
+          <w:szCs w:val="22"/>
+        </w:rPr>
+        <w:t xml:space="preserve">Modest dysbiosis (yeast/bacterial)</w:t>
+      </w:r>
+    </w:p>
+    <w:p>
+      <w:pPr>
+        <w:spacing w:after="120"/>
+        <w:ind w:left="360"/>
+      </w:pPr>
+      <w:r>
+        <w:rPr>
+          <w:rFonts w:ascii="Roboto" w:cs="Roboto" w:eastAsia="Roboto" w:hAnsi="Roboto"/>
+          <w:color w:val="666666"/>
+          <w:sz w:val="20"/>
+          <w:szCs w:val="20"/>
+        </w:rPr>
+        <w:t xml:space="preserve">Supporting findings: Arabinose 42 (&lt;32), 3,4-DHBA 62 (&lt;45), 3-HPAA 12 (&lt;10)</w:t>
       </w:r>
     </w:p>
     <w:p>
@@ -1012,7 +1096,7 @@
           <w:sz w:val="22"/>
           <w:szCs w:val="22"/>
         </w:rPr>
-        <w:t xml:space="preserve">The following 27 biomarker findings are surfaced for practitioner review. Each finding includes a hedged interpretation, possible contributors per the published literature, and the relevance of the finding to the formulation strategy.</w:t>
+        <w:t xml:space="preserve">The following 26 biomarker findings are surfaced for practitioner review. Each finding includes a hedged interpretation, possible contributors per the published literature, and the relevance of the finding to the formulation strategy.</w:t>
       </w:r>
     </w:p>
     <w:p>
@@ -1028,16 +1112,16 @@
           <w:sz w:val="22"/>
           <w:szCs w:val="22"/>
         </w:rPr>
-        <w:t xml:space="preserve">t,t-Muconic Acid</w:t>
-      </w:r>
-      <w:r>
-        <w:rPr>
-          <w:rFonts w:ascii="Roboto" w:cs="Roboto" w:eastAsia="Roboto" w:hAnsi="Roboto"/>
-          <w:color w:val="000000"/>
-          <w:sz w:val="22"/>
-          <w:szCs w:val="22"/>
-        </w:rPr>
-        <w:t xml:space="preserve">   0.20 mmol/molCR</w:t>
+        <w:t xml:space="preserve">Benzoic Acid (urine)</w:t>
+      </w:r>
+      <w:r>
+        <w:rPr>
+          <w:rFonts w:ascii="Roboto" w:cs="Roboto" w:eastAsia="Roboto" w:hAnsi="Roboto"/>
+          <w:color w:val="000000"/>
+          <w:sz w:val="22"/>
+          <w:szCs w:val="22"/>
+        </w:rPr>
+        <w:t xml:space="preserve">   25.00 mmol/molCR</w:t>
       </w:r>
       <w:r>
         <w:rPr>
@@ -1048,7 +1132,7 @@
           <w:sz w:val="20"/>
           <w:szCs w:val="20"/>
         </w:rPr>
-        <w:t xml:space="preserve">   (ref: &lt;0.12)</w:t>
+        <w:t xml:space="preserve">   (ref: &lt;9.30)</w:t>
       </w:r>
     </w:p>
     <w:p>
@@ -1073,7 +1157,7 @@
           <w:sz w:val="20"/>
           <w:szCs w:val="20"/>
         </w:rPr>
-        <w:t xml:space="preserve">Above the laboratory reference cut-off — pattern consistent with benzene exposure per published frameworks.</w:t>
+        <w:t xml:space="preserve">Elevated above the laboratory reference range. Per published OA frameworks, may reflect dietary benzoate intake or microbial production; in combination with elevated 4-HBA may indicate increased glycine conjugation demand.</w:t>
       </w:r>
     </w:p>
     <w:p>
@@ -1098,7 +1182,7 @@
           <w:sz w:val="20"/>
           <w:szCs w:val="20"/>
         </w:rPr>
-        <w:t xml:space="preserve">Published literature identifies inhalational benzene exposure (fuel vapours, cigarette smoke, solvents) as a contributor to elevated urinary t,t-muconic acid.</w:t>
+        <w:t xml:space="preserve">Dietary preservatives (sodium benzoate), aspartame metabolism, paraben exposure, microbial polyphenol metabolism — practitioner to assess relevance.</w:t>
       </w:r>
     </w:p>
     <w:p>
@@ -1123,7 +1207,7 @@
           <w:sz w:val="20"/>
           <w:szCs w:val="20"/>
         </w:rPr>
-        <w:t xml:space="preserve">Supports inclusion of glucuronidation (calcium D-glucarate), Phase II antioxidant (NAC, milk thistle, vitamin C) and broad antioxidant support.</w:t>
+        <w:t xml:space="preserve">Supports inclusion of Phase II conjugation support (glycine pathway candidates surfaced as standalone since glycine not in Library) and glucuronidation support (Cal D-glucarate).</w:t>
       </w:r>
     </w:p>
     <w:p>
@@ -1139,16 +1223,16 @@
           <w:sz w:val="22"/>
           <w:szCs w:val="22"/>
         </w:rPr>
-        <w:t xml:space="preserve">3-Methylhippuric Acid</w:t>
-      </w:r>
-      <w:r>
-        <w:rPr>
-          <w:rFonts w:ascii="Roboto" w:cs="Roboto" w:eastAsia="Roboto" w:hAnsi="Roboto"/>
-          <w:color w:val="000000"/>
-          <w:sz w:val="22"/>
-          <w:szCs w:val="22"/>
-        </w:rPr>
-        <w:t xml:space="preserve">   0.34 mmol/molCR</w:t>
+        <w:t xml:space="preserve">t,t-Muconic Acid</w:t>
+      </w:r>
+      <w:r>
+        <w:rPr>
+          <w:rFonts w:ascii="Roboto" w:cs="Roboto" w:eastAsia="Roboto" w:hAnsi="Roboto"/>
+          <w:color w:val="000000"/>
+          <w:sz w:val="22"/>
+          <w:szCs w:val="22"/>
+        </w:rPr>
+        <w:t xml:space="preserve">   0.20 mmol/molCR</w:t>
       </w:r>
       <w:r>
         <w:rPr>
@@ -1159,7 +1243,7 @@
           <w:sz w:val="20"/>
           <w:szCs w:val="20"/>
         </w:rPr>
-        <w:t xml:space="preserve">   (ref: &lt;0.11)</w:t>
+        <w:t xml:space="preserve">   (ref: &lt;0.12)</w:t>
       </w:r>
     </w:p>
     <w:p>
@@ -1184,7 +1268,7 @@
           <w:sz w:val="20"/>
           <w:szCs w:val="20"/>
         </w:rPr>
-        <w:t xml:space="preserve">Above the laboratory reference range — pattern consistent with xylene exposure per published frameworks.</w:t>
+        <w:t xml:space="preserve">Elevated. Per published frameworks, a marker associated with benzene exposure metabolism.</w:t>
       </w:r>
     </w:p>
     <w:p>
@@ -1209,7 +1293,7 @@
           <w:sz w:val="20"/>
           <w:szCs w:val="20"/>
         </w:rPr>
-        <w:t xml:space="preserve">Published literature identifies xylene exposure (paints, solvents, vehicle exhaust) as a contributor.</w:t>
+        <w:t xml:space="preserve">Benzene exposure (vehicle exhaust, tobacco smoke, certain solvents) — practitioner to assess relevance.</w:t>
       </w:r>
     </w:p>
     <w:p>
@@ -1234,7 +1318,7 @@
           <w:sz w:val="20"/>
           <w:szCs w:val="20"/>
         </w:rPr>
-        <w:t xml:space="preserve">Reinforces Phase II glycine-conjugation support (glycine is not in the supplied Library — surfaced as a standalone recommendation) and antioxidant defence.</w:t>
+        <w:t xml:space="preserve">Supports antioxidant/Phase II detox emphasis: NAC, milk thistle, vitamin C, Cal D-glucarate.</w:t>
       </w:r>
     </w:p>
     <w:p>
@@ -1250,16 +1334,16 @@
           <w:sz w:val="22"/>
           <w:szCs w:val="22"/>
         </w:rPr>
-        <w:t xml:space="preserve">5-Hydroxymethyl-2-furoic Acid</w:t>
-      </w:r>
-      <w:r>
-        <w:rPr>
-          <w:rFonts w:ascii="Roboto" w:cs="Roboto" w:eastAsia="Roboto" w:hAnsi="Roboto"/>
-          <w:color w:val="000000"/>
-          <w:sz w:val="22"/>
-          <w:szCs w:val="22"/>
-        </w:rPr>
-        <w:t xml:space="preserve">   18.50 mmol/molCR</w:t>
+        <w:t xml:space="preserve">3-Methylhippuric Acid</w:t>
+      </w:r>
+      <w:r>
+        <w:rPr>
+          <w:rFonts w:ascii="Roboto" w:cs="Roboto" w:eastAsia="Roboto" w:hAnsi="Roboto"/>
+          <w:color w:val="000000"/>
+          <w:sz w:val="22"/>
+          <w:szCs w:val="22"/>
+        </w:rPr>
+        <w:t xml:space="preserve">   0.34 mmol/molCR</w:t>
       </w:r>
       <w:r>
         <w:rPr>
@@ -1270,7 +1354,7 @@
           <w:sz w:val="20"/>
           <w:szCs w:val="20"/>
         </w:rPr>
-        <w:t xml:space="preserve">   (ref: &lt;10.00)</w:t>
+        <w:t xml:space="preserve">   (ref: &lt;0.11)</w:t>
       </w:r>
     </w:p>
     <w:p>
@@ -1295,7 +1379,7 @@
           <w:sz w:val="20"/>
           <w:szCs w:val="20"/>
         </w:rPr>
-        <w:t xml:space="preserve">Above the laboratory reference range — pattern often associated with dietary furan derivatives or yeast metabolism per published frameworks.</w:t>
+        <w:t xml:space="preserve">Elevated. Per published frameworks, a marker associated with xylene exposure metabolism.</w:t>
       </w:r>
     </w:p>
     <w:p>
@@ -1320,7 +1404,7 @@
           <w:sz w:val="20"/>
           <w:szCs w:val="20"/>
         </w:rPr>
-        <w:t xml:space="preserve">Published literature points to processed/heated food furan derivatives and yeast overgrowth as possible contributors.</w:t>
+        <w:t xml:space="preserve">Xylene/toluene exposure (paints, solvents, vehicle exhaust) — practitioner to assess relevance.</w:t>
       </w:r>
     </w:p>
     <w:p>
@@ -1345,7 +1429,7 @@
           <w:sz w:val="20"/>
           <w:szCs w:val="20"/>
         </w:rPr>
-        <w:t xml:space="preserve">Supports gut-axis and detoxification support.</w:t>
+        <w:t xml:space="preserve">Reinforces antioxidant/conjugation support; glycine is the canonical conjugator and is recommended as a standalone.</w:t>
       </w:r>
     </w:p>
     <w:p>
@@ -1361,16 +1445,16 @@
           <w:sz w:val="22"/>
           <w:szCs w:val="22"/>
         </w:rPr>
-        <w:t xml:space="preserve">Benzoic Acid (Urine)</w:t>
-      </w:r>
-      <w:r>
-        <w:rPr>
-          <w:rFonts w:ascii="Roboto" w:cs="Roboto" w:eastAsia="Roboto" w:hAnsi="Roboto"/>
-          <w:color w:val="000000"/>
-          <w:sz w:val="22"/>
-          <w:szCs w:val="22"/>
-        </w:rPr>
-        <w:t xml:space="preserve">   25.00 mmol/molCR</w:t>
+        <w:t xml:space="preserve">4-Hydroxybenzoic Acid (4-HBA)</w:t>
+      </w:r>
+      <w:r>
+        <w:rPr>
+          <w:rFonts w:ascii="Roboto" w:cs="Roboto" w:eastAsia="Roboto" w:hAnsi="Roboto"/>
+          <w:color w:val="000000"/>
+          <w:sz w:val="22"/>
+          <w:szCs w:val="22"/>
+        </w:rPr>
+        <w:t xml:space="preserve">   0.64 mmol/molCR</w:t>
       </w:r>
       <w:r>
         <w:rPr>
@@ -1381,7 +1465,7 @@
           <w:sz w:val="20"/>
           <w:szCs w:val="20"/>
         </w:rPr>
-        <w:t xml:space="preserve">   (ref: &lt;9.30)</w:t>
+        <w:t xml:space="preserve">   (ref: &lt;0.57)</w:t>
       </w:r>
     </w:p>
     <w:p>
@@ -1406,7 +1490,7 @@
           <w:sz w:val="20"/>
           <w:szCs w:val="20"/>
         </w:rPr>
-        <w:t xml:space="preserve">Above the laboratory reference range. Pattern consistent with preservative intake or impaired glycine conjugation per published frameworks.</w:t>
+        <w:t xml:space="preserve">Mildly elevated. Per published frameworks, associated with paraben exposure metabolism.</w:t>
       </w:r>
     </w:p>
     <w:p>
@@ -1431,7 +1515,7 @@
           <w:sz w:val="20"/>
           <w:szCs w:val="20"/>
         </w:rPr>
-        <w:t xml:space="preserve">Dietary benzoate preservatives or limited glycine availability for conjugation to hippurate.</w:t>
+        <w:t xml:space="preserve">Paraben exposure (cosmetics, personal care, food preservatives) — practitioner to assess relevance.</w:t>
       </w:r>
     </w:p>
     <w:p>
@@ -1456,7 +1540,7 @@
           <w:sz w:val="20"/>
           <w:szCs w:val="20"/>
         </w:rPr>
-        <w:t xml:space="preserve">Glycine is the canonical conjugator — surface as standalone since not in Library; supports cal D-glucarate inclusion.</w:t>
+        <w:t xml:space="preserve">Reinforces xenobiotic-conjugation axis emphasis.</w:t>
       </w:r>
     </w:p>
     <w:p>
@@ -1472,16 +1556,16 @@
           <w:sz w:val="22"/>
           <w:szCs w:val="22"/>
         </w:rPr>
-        <w:t xml:space="preserve">4-Hydroxybenzoic Acid (4-HBA)</w:t>
-      </w:r>
-      <w:r>
-        <w:rPr>
-          <w:rFonts w:ascii="Roboto" w:cs="Roboto" w:eastAsia="Roboto" w:hAnsi="Roboto"/>
-          <w:color w:val="000000"/>
-          <w:sz w:val="22"/>
-          <w:szCs w:val="22"/>
-        </w:rPr>
-        <w:t xml:space="preserve">   0.64 mmol/molCR</w:t>
+        <w:t xml:space="preserve">5-Hydroxymethyl-2-furoic Acid</w:t>
+      </w:r>
+      <w:r>
+        <w:rPr>
+          <w:rFonts w:ascii="Roboto" w:cs="Roboto" w:eastAsia="Roboto" w:hAnsi="Roboto"/>
+          <w:color w:val="000000"/>
+          <w:sz w:val="22"/>
+          <w:szCs w:val="22"/>
+        </w:rPr>
+        <w:t xml:space="preserve">   18.50 mmol/molCR</w:t>
       </w:r>
       <w:r>
         <w:rPr>
@@ -1492,7 +1576,7 @@
           <w:sz w:val="20"/>
           <w:szCs w:val="20"/>
         </w:rPr>
-        <w:t xml:space="preserve">   (ref: &lt;0.57)</w:t>
+        <w:t xml:space="preserve">   (ref: &lt;10.00)</w:t>
       </w:r>
     </w:p>
     <w:p>
@@ -1517,7 +1601,7 @@
           <w:sz w:val="20"/>
           <w:szCs w:val="20"/>
         </w:rPr>
-        <w:t xml:space="preserve">Marginally above reference — pattern consistent with paraben exposure or microbial polyphenol metabolism per published frameworks.</w:t>
+        <w:t xml:space="preserve">Elevated. Per published frameworks, associated with HMF intake from heated/processed foods.</w:t>
       </w:r>
     </w:p>
     <w:p>
@@ -1542,7 +1626,7 @@
           <w:sz w:val="20"/>
           <w:szCs w:val="20"/>
         </w:rPr>
-        <w:t xml:space="preserve">Paraben preservatives (cosmetics, personal care), microbial conversion of dietary polyphenols.</w:t>
+        <w:t xml:space="preserve">Dietary HMF (caramelised, baked, roasted foods, dried fruit) — practitioner to assess.</w:t>
       </w:r>
     </w:p>
     <w:p>
@@ -1567,7 +1651,7 @@
           <w:sz w:val="20"/>
           <w:szCs w:val="20"/>
         </w:rPr>
-        <w:t xml:space="preserve">Reinforces glucuronidation/Phase II detox support.</w:t>
+        <w:t xml:space="preserve">Supports Phase II conjugation and antioxidant inclusion.</w:t>
       </w:r>
     </w:p>
     <w:p>
@@ -1583,16 +1667,16 @@
           <w:sz w:val="22"/>
           <w:szCs w:val="22"/>
         </w:rPr>
-        <w:t xml:space="preserve">3,4-Dihydroxybenzoic Acid</w:t>
-      </w:r>
-      <w:r>
-        <w:rPr>
-          <w:rFonts w:ascii="Roboto" w:cs="Roboto" w:eastAsia="Roboto" w:hAnsi="Roboto"/>
-          <w:color w:val="000000"/>
-          <w:sz w:val="22"/>
-          <w:szCs w:val="22"/>
-        </w:rPr>
-        <w:t xml:space="preserve">   62.00 mmol/molCR</w:t>
+        <w:t xml:space="preserve">8-hydroxy-deoxyguanosine (8-OHdG)</w:t>
+      </w:r>
+      <w:r>
+        <w:rPr>
+          <w:rFonts w:ascii="Roboto" w:cs="Roboto" w:eastAsia="Roboto" w:hAnsi="Roboto"/>
+          <w:color w:val="000000"/>
+          <w:sz w:val="22"/>
+          <w:szCs w:val="22"/>
+        </w:rPr>
+        <w:t xml:space="preserve">   3.80 umol/molCR</w:t>
       </w:r>
       <w:r>
         <w:rPr>
@@ -1603,7 +1687,7 @@
           <w:sz w:val="20"/>
           <w:szCs w:val="20"/>
         </w:rPr>
-        <w:t xml:space="preserve">   (ref: &lt;45.00)</w:t>
+        <w:t xml:space="preserve">   (ref: &lt;2.70)</w:t>
       </w:r>
     </w:p>
     <w:p>
@@ -1628,7 +1712,57 @@
           <w:sz w:val="20"/>
           <w:szCs w:val="20"/>
         </w:rPr>
-        <w:t xml:space="preserve">Above reference — pattern consistent with microbial polyphenol metabolism / dysbiosis per published frameworks.</w:t>
+        <w:t xml:space="preserve">Elevated. Per published frameworks, a marker of oxidative DNA damage.</w:t>
+      </w:r>
+    </w:p>
+    <w:p>
+      <w:pPr>
+        <w:spacing w:after="60"/>
+      </w:pPr>
+      <w:r>
+        <w:rPr>
+          <w:rFonts w:ascii="Roboto" w:cs="Roboto" w:eastAsia="Roboto" w:hAnsi="Roboto"/>
+          <w:b/>
+          <w:bCs/>
+          <w:color w:val="535B50"/>
+          <w:sz w:val="20"/>
+          <w:szCs w:val="20"/>
+        </w:rPr>
+        <w:t xml:space="preserve">Possible contributors: </w:t>
+      </w:r>
+      <w:r>
+        <w:rPr>
+          <w:rFonts w:ascii="Roboto" w:cs="Roboto" w:eastAsia="Roboto" w:hAnsi="Roboto"/>
+          <w:color w:val="000000"/>
+          <w:sz w:val="20"/>
+          <w:szCs w:val="20"/>
+        </w:rPr>
+        <w:t xml:space="preserve">Chronic oxidative stress, xenobiotic burden, inflammatory load — practitioner to assess.</w:t>
+      </w:r>
+    </w:p>
+    <w:p>
+      <w:pPr>
+        <w:spacing w:after="60"/>
+      </w:pPr>
+      <w:r>
+        <w:rPr>
+          <w:rFonts w:ascii="Roboto" w:cs="Roboto" w:eastAsia="Roboto" w:hAnsi="Roboto"/>
+          <w:b/>
+          <w:bCs/>
+          <w:color w:val="535B50"/>
+          <w:sz w:val="20"/>
+          <w:szCs w:val="20"/>
+        </w:rPr>
+        <w:t xml:space="preserve">Relevance to formulation: </w:t>
+      </w:r>
+      <w:r>
+        <w:rPr>
+          <w:rFonts w:ascii="Roboto" w:cs="Roboto" w:eastAsia="Roboto" w:hAnsi="Roboto"/>
+          <w:color w:val="000000"/>
+          <w:sz w:val="20"/>
+          <w:szCs w:val="20"/>
+        </w:rPr>
+        <w:t xml:space="preserve">Anchors the antioxidant/redox axis: NAC, vitamin C, vitamin E, resveratrol, milk thistle.</w:t>
       </w:r>
     </w:p>
     <w:p>
@@ -1644,16 +1778,16 @@
           <w:sz w:val="22"/>
           <w:szCs w:val="22"/>
         </w:rPr>
-        <w:t xml:space="preserve">3-Hydroxyphenylacetic Acid (3-HPAA)</w:t>
-      </w:r>
-      <w:r>
-        <w:rPr>
-          <w:rFonts w:ascii="Roboto" w:cs="Roboto" w:eastAsia="Roboto" w:hAnsi="Roboto"/>
-          <w:color w:val="000000"/>
-          <w:sz w:val="22"/>
-          <w:szCs w:val="22"/>
-        </w:rPr>
-        <w:t xml:space="preserve">   12.00 mmol/molCR</w:t>
+        <w:t xml:space="preserve">Leukotriene E4</w:t>
+      </w:r>
+      <w:r>
+        <w:rPr>
+          <w:rFonts w:ascii="Roboto" w:cs="Roboto" w:eastAsia="Roboto" w:hAnsi="Roboto"/>
+          <w:color w:val="000000"/>
+          <w:sz w:val="22"/>
+          <w:szCs w:val="22"/>
+        </w:rPr>
+        <w:t xml:space="preserve">   195.00 pg/mgCR</w:t>
       </w:r>
       <w:r>
         <w:rPr>
@@ -1664,7 +1798,7 @@
           <w:sz w:val="20"/>
           <w:szCs w:val="20"/>
         </w:rPr>
-        <w:t xml:space="preserve">   (ref: &lt;10.00)</w:t>
+        <w:t xml:space="preserve">   (ref: &lt;100.00)</w:t>
       </w:r>
     </w:p>
     <w:p>
@@ -1689,7 +1823,57 @@
           <w:sz w:val="20"/>
           <w:szCs w:val="20"/>
         </w:rPr>
-        <w:t xml:space="preserve">Mildly above reference — pattern often associated with gut microbial protein/polyphenol metabolism.</w:t>
+        <w:t xml:space="preserve">Elevated. Per published frameworks, suggests increased 5-LOX inflammatory pathway activity.</w:t>
+      </w:r>
+    </w:p>
+    <w:p>
+      <w:pPr>
+        <w:spacing w:after="60"/>
+      </w:pPr>
+      <w:r>
+        <w:rPr>
+          <w:rFonts w:ascii="Roboto" w:cs="Roboto" w:eastAsia="Roboto" w:hAnsi="Roboto"/>
+          <w:b/>
+          <w:bCs/>
+          <w:color w:val="535B50"/>
+          <w:sz w:val="20"/>
+          <w:szCs w:val="20"/>
+        </w:rPr>
+        <w:t xml:space="preserve">Possible contributors: </w:t>
+      </w:r>
+      <w:r>
+        <w:rPr>
+          <w:rFonts w:ascii="Roboto" w:cs="Roboto" w:eastAsia="Roboto" w:hAnsi="Roboto"/>
+          <w:color w:val="000000"/>
+          <w:sz w:val="20"/>
+          <w:szCs w:val="20"/>
+        </w:rPr>
+        <w:t xml:space="preserve">Mast-cell activation, allergic inflammation, atopy — practitioner to assess.</w:t>
+      </w:r>
+    </w:p>
+    <w:p>
+      <w:pPr>
+        <w:spacing w:after="60"/>
+      </w:pPr>
+      <w:r>
+        <w:rPr>
+          <w:rFonts w:ascii="Roboto" w:cs="Roboto" w:eastAsia="Roboto" w:hAnsi="Roboto"/>
+          <w:b/>
+          <w:bCs/>
+          <w:color w:val="535B50"/>
+          <w:sz w:val="20"/>
+          <w:szCs w:val="20"/>
+        </w:rPr>
+        <w:t xml:space="preserve">Relevance to formulation: </w:t>
+      </w:r>
+      <w:r>
+        <w:rPr>
+          <w:rFonts w:ascii="Roboto" w:cs="Roboto" w:eastAsia="Roboto" w:hAnsi="Roboto"/>
+          <w:color w:val="000000"/>
+          <w:sz w:val="20"/>
+          <w:szCs w:val="20"/>
+        </w:rPr>
+        <w:t xml:space="preserve">Supports inclusion of anti-inflammatory ingredients with 5-LOX coverage (Boswellia, quercetin) and curcumin for NF-κB.</w:t>
       </w:r>
     </w:p>
     <w:p>
@@ -1705,16 +1889,16 @@
           <w:sz w:val="22"/>
           <w:szCs w:val="22"/>
         </w:rPr>
-        <w:t xml:space="preserve">Arabinose</w:t>
-      </w:r>
-      <w:r>
-        <w:rPr>
-          <w:rFonts w:ascii="Roboto" w:cs="Roboto" w:eastAsia="Roboto" w:hAnsi="Roboto"/>
-          <w:color w:val="000000"/>
-          <w:sz w:val="22"/>
-          <w:szCs w:val="22"/>
-        </w:rPr>
-        <w:t xml:space="preserve">   42.00 mmol/molCR</w:t>
+        <w:t xml:space="preserve">Isocitric Acid</w:t>
+      </w:r>
+      <w:r>
+        <w:rPr>
+          <w:rFonts w:ascii="Roboto" w:cs="Roboto" w:eastAsia="Roboto" w:hAnsi="Roboto"/>
+          <w:color w:val="000000"/>
+          <w:sz w:val="22"/>
+          <w:szCs w:val="22"/>
+        </w:rPr>
+        <w:t xml:space="preserve">   86.00 mmol/molCR</w:t>
       </w:r>
       <w:r>
         <w:rPr>
@@ -1725,7 +1909,7 @@
           <w:sz w:val="20"/>
           <w:szCs w:val="20"/>
         </w:rPr>
-        <w:t xml:space="preserve">   (ref: &lt;32.00)</w:t>
+        <w:t xml:space="preserve">   (ref: 5.00-65.00)</w:t>
       </w:r>
     </w:p>
     <w:p>
@@ -1750,7 +1934,32 @@
           <w:sz w:val="20"/>
           <w:szCs w:val="20"/>
         </w:rPr>
-        <w:t xml:space="preserve">Above reference — pattern consistent with intestinal yeast/Candida activity per published interpretive frameworks.</w:t>
+        <w:t xml:space="preserve">Elevated. Per published frameworks, suggests reduced isocitrate dehydrogenase flux — manganese/Mg/NAD+ dependent.</w:t>
+      </w:r>
+    </w:p>
+    <w:p>
+      <w:pPr>
+        <w:spacing w:after="60"/>
+      </w:pPr>
+      <w:r>
+        <w:rPr>
+          <w:rFonts w:ascii="Roboto" w:cs="Roboto" w:eastAsia="Roboto" w:hAnsi="Roboto"/>
+          <w:b/>
+          <w:bCs/>
+          <w:color w:val="535B50"/>
+          <w:sz w:val="20"/>
+          <w:szCs w:val="20"/>
+        </w:rPr>
+        <w:t xml:space="preserve">Possible contributors: </w:t>
+      </w:r>
+      <w:r>
+        <w:rPr>
+          <w:rFonts w:ascii="Roboto" w:cs="Roboto" w:eastAsia="Roboto" w:hAnsi="Roboto"/>
+          <w:color w:val="000000"/>
+          <w:sz w:val="20"/>
+          <w:szCs w:val="20"/>
+        </w:rPr>
+        <w:t xml:space="preserve">Mitochondrial strain, manganese functional insufficiency, NAD+ availability — practitioner to assess.</w:t>
       </w:r>
     </w:p>
     <w:p>
@@ -1775,7 +1984,7 @@
           <w:sz w:val="20"/>
           <w:szCs w:val="20"/>
         </w:rPr>
-        <w:t xml:space="preserve">Supports inclusion of gastrointestinal/antimicrobial-supportive botanicals (berberine candidate).</w:t>
+        <w:t xml:space="preserve">Supports mitochondrial/cardiovascular axis: CoQ10, alpha-lipoic acid, B-vitamin cofactors.</w:t>
       </w:r>
     </w:p>
     <w:p>
@@ -1791,16 +2000,16 @@
           <w:sz w:val="22"/>
           <w:szCs w:val="22"/>
         </w:rPr>
-        <w:t xml:space="preserve">Furancarbonylglycine</w:t>
-      </w:r>
-      <w:r>
-        <w:rPr>
-          <w:rFonts w:ascii="Roboto" w:cs="Roboto" w:eastAsia="Roboto" w:hAnsi="Roboto"/>
-          <w:color w:val="000000"/>
-          <w:sz w:val="22"/>
-          <w:szCs w:val="22"/>
-        </w:rPr>
-        <w:t xml:space="preserve">   2.90 mmol/molCR</w:t>
+        <w:t xml:space="preserve">2-Oxoglutaric Acid (alpha-ketoglutarate)</w:t>
+      </w:r>
+      <w:r>
+        <w:rPr>
+          <w:rFonts w:ascii="Roboto" w:cs="Roboto" w:eastAsia="Roboto" w:hAnsi="Roboto"/>
+          <w:color w:val="000000"/>
+          <w:sz w:val="22"/>
+          <w:szCs w:val="22"/>
+        </w:rPr>
+        <w:t xml:space="preserve">   65.00 mmol/molCR</w:t>
       </w:r>
       <w:r>
         <w:rPr>
@@ -1811,7 +2020,7 @@
           <w:sz w:val="20"/>
           <w:szCs w:val="20"/>
         </w:rPr>
-        <w:t xml:space="preserve">   (ref: &lt;2.00)</w:t>
+        <w:t xml:space="preserve">   (ref: 2.00-45.00)</w:t>
       </w:r>
     </w:p>
     <w:p>
@@ -1836,7 +2045,57 @@
           <w:sz w:val="20"/>
           <w:szCs w:val="20"/>
         </w:rPr>
-        <w:t xml:space="preserve">Above reference — pattern consistent with dysbiosis-related furanyl metabolism.</w:t>
+        <w:t xml:space="preserve">Elevated. Per published frameworks, may reflect 2-OG dehydrogenase flux limitation (B1, B2, B3, B5, lipoic acid dependent).</w:t>
+      </w:r>
+    </w:p>
+    <w:p>
+      <w:pPr>
+        <w:spacing w:after="60"/>
+      </w:pPr>
+      <w:r>
+        <w:rPr>
+          <w:rFonts w:ascii="Roboto" w:cs="Roboto" w:eastAsia="Roboto" w:hAnsi="Roboto"/>
+          <w:b/>
+          <w:bCs/>
+          <w:color w:val="535B50"/>
+          <w:sz w:val="20"/>
+          <w:szCs w:val="20"/>
+        </w:rPr>
+        <w:t xml:space="preserve">Possible contributors: </w:t>
+      </w:r>
+      <w:r>
+        <w:rPr>
+          <w:rFonts w:ascii="Roboto" w:cs="Roboto" w:eastAsia="Roboto" w:hAnsi="Roboto"/>
+          <w:color w:val="000000"/>
+          <w:sz w:val="20"/>
+          <w:szCs w:val="20"/>
+        </w:rPr>
+        <w:t xml:space="preserve">B-vitamin cofactor insufficiency, mitochondrial strain — practitioner to assess.</w:t>
+      </w:r>
+    </w:p>
+    <w:p>
+      <w:pPr>
+        <w:spacing w:after="60"/>
+      </w:pPr>
+      <w:r>
+        <w:rPr>
+          <w:rFonts w:ascii="Roboto" w:cs="Roboto" w:eastAsia="Roboto" w:hAnsi="Roboto"/>
+          <w:b/>
+          <w:bCs/>
+          <w:color w:val="535B50"/>
+          <w:sz w:val="20"/>
+          <w:szCs w:val="20"/>
+        </w:rPr>
+        <w:t xml:space="preserve">Relevance to formulation: </w:t>
+      </w:r>
+      <w:r>
+        <w:rPr>
+          <w:rFonts w:ascii="Roboto" w:cs="Roboto" w:eastAsia="Roboto" w:hAnsi="Roboto"/>
+          <w:color w:val="000000"/>
+          <w:sz w:val="20"/>
+          <w:szCs w:val="20"/>
+        </w:rPr>
+        <w:t xml:space="preserve">Supports inclusion of B1, B2, B3, B5 and alpha-lipoic acid.</w:t>
       </w:r>
     </w:p>
     <w:p>
@@ -1852,16 +2111,16 @@
           <w:sz w:val="22"/>
           <w:szCs w:val="22"/>
         </w:rPr>
-        <w:t xml:space="preserve">Isocitric Acid</w:t>
-      </w:r>
-      <w:r>
-        <w:rPr>
-          <w:rFonts w:ascii="Roboto" w:cs="Roboto" w:eastAsia="Roboto" w:hAnsi="Roboto"/>
-          <w:color w:val="000000"/>
-          <w:sz w:val="22"/>
-          <w:szCs w:val="22"/>
-        </w:rPr>
-        <w:t xml:space="preserve">   86.00 mmol/molCR</w:t>
+        <w:t xml:space="preserve">3-Methylglutaconic Acid</w:t>
+      </w:r>
+      <w:r>
+        <w:rPr>
+          <w:rFonts w:ascii="Roboto" w:cs="Roboto" w:eastAsia="Roboto" w:hAnsi="Roboto"/>
+          <w:color w:val="000000"/>
+          <w:sz w:val="22"/>
+          <w:szCs w:val="22"/>
+        </w:rPr>
+        <w:t xml:space="preserve">   6.32 mmol/molCR</w:t>
       </w:r>
       <w:r>
         <w:rPr>
@@ -1872,7 +2131,7 @@
           <w:sz w:val="20"/>
           <w:szCs w:val="20"/>
         </w:rPr>
-        <w:t xml:space="preserve">   (ref: 5.00-65.00)</w:t>
+        <w:t xml:space="preserve">   (ref: &lt;5.50)</w:t>
       </w:r>
     </w:p>
     <w:p>
@@ -1897,7 +2156,32 @@
           <w:sz w:val="20"/>
           <w:szCs w:val="20"/>
         </w:rPr>
-        <w:t xml:space="preserve">Above reference — pattern consistent with TCA bottleneck at isocitrate dehydrogenase (NAD/Mn/Mg dependent) per published mitochondrial frameworks.</w:t>
+        <w:t xml:space="preserve">Mildly elevated. Per published frameworks, may reflect mitochondrial leucine metabolism strain.</w:t>
+      </w:r>
+    </w:p>
+    <w:p>
+      <w:pPr>
+        <w:spacing w:after="60"/>
+      </w:pPr>
+      <w:r>
+        <w:rPr>
+          <w:rFonts w:ascii="Roboto" w:cs="Roboto" w:eastAsia="Roboto" w:hAnsi="Roboto"/>
+          <w:b/>
+          <w:bCs/>
+          <w:color w:val="535B50"/>
+          <w:sz w:val="20"/>
+          <w:szCs w:val="20"/>
+        </w:rPr>
+        <w:t xml:space="preserve">Possible contributors: </w:t>
+      </w:r>
+      <w:r>
+        <w:rPr>
+          <w:rFonts w:ascii="Roboto" w:cs="Roboto" w:eastAsia="Roboto" w:hAnsi="Roboto"/>
+          <w:color w:val="000000"/>
+          <w:sz w:val="20"/>
+          <w:szCs w:val="20"/>
+        </w:rPr>
+        <w:t xml:space="preserve">Mitochondrial inner-membrane stress, CoQ10 status — practitioner to assess.</w:t>
       </w:r>
     </w:p>
     <w:p>
@@ -1922,7 +2206,7 @@
           <w:sz w:val="20"/>
           <w:szCs w:val="20"/>
         </w:rPr>
-        <w:t xml:space="preserve">Supports mineral and NAD-supporting cofactor inclusion.</w:t>
+        <w:t xml:space="preserve">Reinforces CoQ10 and mitochondrial support.</w:t>
       </w:r>
     </w:p>
     <w:p>
@@ -1938,16 +2222,16 @@
           <w:sz w:val="22"/>
           <w:szCs w:val="22"/>
         </w:rPr>
-        <w:t xml:space="preserve">2-Oxoglutaric Acid</w:t>
-      </w:r>
-      <w:r>
-        <w:rPr>
-          <w:rFonts w:ascii="Roboto" w:cs="Roboto" w:eastAsia="Roboto" w:hAnsi="Roboto"/>
-          <w:color w:val="000000"/>
-          <w:sz w:val="22"/>
-          <w:szCs w:val="22"/>
-        </w:rPr>
-        <w:t xml:space="preserve">   65.00 mmol/molCR</w:t>
+        <w:t xml:space="preserve">Mevalonolactone</w:t>
+      </w:r>
+      <w:r>
+        <w:rPr>
+          <w:rFonts w:ascii="Roboto" w:cs="Roboto" w:eastAsia="Roboto" w:hAnsi="Roboto"/>
+          <w:color w:val="000000"/>
+          <w:sz w:val="22"/>
+          <w:szCs w:val="22"/>
+        </w:rPr>
+        <w:t xml:space="preserve">   2.80 mmol/molCR</w:t>
       </w:r>
       <w:r>
         <w:rPr>
@@ -1958,7 +2242,7 @@
           <w:sz w:val="20"/>
           <w:szCs w:val="20"/>
         </w:rPr>
-        <w:t xml:space="preserve">   (ref: 2.00-45.00)</w:t>
+        <w:t xml:space="preserve">   (ref: &lt;2.00)</w:t>
       </w:r>
     </w:p>
     <w:p>
@@ -1983,7 +2267,32 @@
           <w:sz w:val="20"/>
           <w:szCs w:val="20"/>
         </w:rPr>
-        <w:t xml:space="preserve">Above reference — pattern consistent with α-KG dehydrogenase complex strain (B1/B2/B3/B5/lipoic acid dependent) per published frameworks.</w:t>
+        <w:t xml:space="preserve">Elevated. Per published frameworks, mevalonate pathway flux marker — relevant to CoQ10 synthesis.</w:t>
+      </w:r>
+    </w:p>
+    <w:p>
+      <w:pPr>
+        <w:spacing w:after="60"/>
+      </w:pPr>
+      <w:r>
+        <w:rPr>
+          <w:rFonts w:ascii="Roboto" w:cs="Roboto" w:eastAsia="Roboto" w:hAnsi="Roboto"/>
+          <w:b/>
+          <w:bCs/>
+          <w:color w:val="535B50"/>
+          <w:sz w:val="20"/>
+          <w:szCs w:val="20"/>
+        </w:rPr>
+        <w:t xml:space="preserve">Possible contributors: </w:t>
+      </w:r>
+      <w:r>
+        <w:rPr>
+          <w:rFonts w:ascii="Roboto" w:cs="Roboto" w:eastAsia="Roboto" w:hAnsi="Roboto"/>
+          <w:color w:val="000000"/>
+          <w:sz w:val="20"/>
+          <w:szCs w:val="20"/>
+        </w:rPr>
+        <w:t xml:space="preserve">HMG-CoA reductase activity, statin use — practitioner to assess.</w:t>
       </w:r>
     </w:p>
     <w:p>
@@ -2008,7 +2317,7 @@
           <w:sz w:val="20"/>
           <w:szCs w:val="20"/>
         </w:rPr>
-        <w:t xml:space="preserve">Supports B-complex cofactor and alpha-lipoic acid inclusion.</w:t>
+        <w:t xml:space="preserve">Supports CoQ10 inclusion.</w:t>
       </w:r>
     </w:p>
     <w:p>
@@ -2024,16 +2333,16 @@
           <w:sz w:val="22"/>
           <w:szCs w:val="22"/>
         </w:rPr>
-        <w:t xml:space="preserve">3-Methylglutaconic Acid</w:t>
-      </w:r>
-      <w:r>
-        <w:rPr>
-          <w:rFonts w:ascii="Roboto" w:cs="Roboto" w:eastAsia="Roboto" w:hAnsi="Roboto"/>
-          <w:color w:val="000000"/>
-          <w:sz w:val="22"/>
-          <w:szCs w:val="22"/>
-        </w:rPr>
-        <w:t xml:space="preserve">   6.32 mmol/molCR</w:t>
+        <w:t xml:space="preserve">Adipic Acid</w:t>
+      </w:r>
+      <w:r>
+        <w:rPr>
+          <w:rFonts w:ascii="Roboto" w:cs="Roboto" w:eastAsia="Roboto" w:hAnsi="Roboto"/>
+          <w:color w:val="000000"/>
+          <w:sz w:val="22"/>
+          <w:szCs w:val="22"/>
+        </w:rPr>
+        <w:t xml:space="preserve">   4.30 mmol/molCR</w:t>
       </w:r>
       <w:r>
         <w:rPr>
@@ -2044,7 +2353,7 @@
           <w:sz w:val="20"/>
           <w:szCs w:val="20"/>
         </w:rPr>
-        <w:t xml:space="preserve">   (ref: &lt;5.50)</w:t>
+        <w:t xml:space="preserve">   (ref: &lt;3.80)</w:t>
       </w:r>
     </w:p>
     <w:p>
@@ -2069,7 +2378,57 @@
           <w:sz w:val="20"/>
           <w:szCs w:val="20"/>
         </w:rPr>
-        <w:t xml:space="preserve">Above reference — pattern often associated with leucine metabolism/mitochondrial stress per published frameworks.</w:t>
+        <w:t xml:space="preserve">Mildly elevated. Per published frameworks, suggests increased fatty-acid omega-oxidation when beta-oxidation is constrained.</w:t>
+      </w:r>
+    </w:p>
+    <w:p>
+      <w:pPr>
+        <w:spacing w:after="60"/>
+      </w:pPr>
+      <w:r>
+        <w:rPr>
+          <w:rFonts w:ascii="Roboto" w:cs="Roboto" w:eastAsia="Roboto" w:hAnsi="Roboto"/>
+          <w:b/>
+          <w:bCs/>
+          <w:color w:val="535B50"/>
+          <w:sz w:val="20"/>
+          <w:szCs w:val="20"/>
+        </w:rPr>
+        <w:t xml:space="preserve">Possible contributors: </w:t>
+      </w:r>
+      <w:r>
+        <w:rPr>
+          <w:rFonts w:ascii="Roboto" w:cs="Roboto" w:eastAsia="Roboto" w:hAnsi="Roboto"/>
+          <w:color w:val="000000"/>
+          <w:sz w:val="20"/>
+          <w:szCs w:val="20"/>
+        </w:rPr>
+        <w:t xml:space="preserve">Carnitine status, mitochondrial fatty acid oxidation strain — practitioner to assess.</w:t>
+      </w:r>
+    </w:p>
+    <w:p>
+      <w:pPr>
+        <w:spacing w:after="60"/>
+      </w:pPr>
+      <w:r>
+        <w:rPr>
+          <w:rFonts w:ascii="Roboto" w:cs="Roboto" w:eastAsia="Roboto" w:hAnsi="Roboto"/>
+          <w:b/>
+          <w:bCs/>
+          <w:color w:val="535B50"/>
+          <w:sz w:val="20"/>
+          <w:szCs w:val="20"/>
+        </w:rPr>
+        <w:t xml:space="preserve">Relevance to formulation: </w:t>
+      </w:r>
+      <w:r>
+        <w:rPr>
+          <w:rFonts w:ascii="Roboto" w:cs="Roboto" w:eastAsia="Roboto" w:hAnsi="Roboto"/>
+          <w:color w:val="000000"/>
+          <w:sz w:val="20"/>
+          <w:szCs w:val="20"/>
+        </w:rPr>
+        <w:t xml:space="preserve">Supports mitochondrial axis (CoQ10, ALA). L-carnitine not in supplied Library — surfaced as standalone.</w:t>
       </w:r>
     </w:p>
     <w:p>
@@ -2085,16 +2444,16 @@
           <w:sz w:val="22"/>
           <w:szCs w:val="22"/>
         </w:rPr>
-        <w:t xml:space="preserve">Mevalonolactone</w:t>
-      </w:r>
-      <w:r>
-        <w:rPr>
-          <w:rFonts w:ascii="Roboto" w:cs="Roboto" w:eastAsia="Roboto" w:hAnsi="Roboto"/>
-          <w:color w:val="000000"/>
-          <w:sz w:val="22"/>
-          <w:szCs w:val="22"/>
-        </w:rPr>
-        <w:t xml:space="preserve">   2.80 mmol/molCR</w:t>
+        <w:t xml:space="preserve">Quinolinic Acid</w:t>
+      </w:r>
+      <w:r>
+        <w:rPr>
+          <w:rFonts w:ascii="Roboto" w:cs="Roboto" w:eastAsia="Roboto" w:hAnsi="Roboto"/>
+          <w:color w:val="000000"/>
+          <w:sz w:val="22"/>
+          <w:szCs w:val="22"/>
+        </w:rPr>
+        <w:t xml:space="preserve">   11.80 mmol/molCR</w:t>
       </w:r>
       <w:r>
         <w:rPr>
@@ -2105,7 +2464,7 @@
           <w:sz w:val="20"/>
           <w:szCs w:val="20"/>
         </w:rPr>
-        <w:t xml:space="preserve">   (ref: &lt;2.00)</w:t>
+        <w:t xml:space="preserve">   (ref: &lt;9.10)</w:t>
       </w:r>
     </w:p>
     <w:p>
@@ -2130,7 +2489,57 @@
           <w:sz w:val="20"/>
           <w:szCs w:val="20"/>
         </w:rPr>
-        <w:t xml:space="preserve">Above reference — pattern consistent with elevated HMG-CoA reductase activity per published frameworks; CoQ10 demand may be increased.</w:t>
+        <w:t xml:space="preserve">Elevated. Per published frameworks, kynurenine pathway shifted toward the neurotoxic arm.</w:t>
+      </w:r>
+    </w:p>
+    <w:p>
+      <w:pPr>
+        <w:spacing w:after="60"/>
+      </w:pPr>
+      <w:r>
+        <w:rPr>
+          <w:rFonts w:ascii="Roboto" w:cs="Roboto" w:eastAsia="Roboto" w:hAnsi="Roboto"/>
+          <w:b/>
+          <w:bCs/>
+          <w:color w:val="535B50"/>
+          <w:sz w:val="20"/>
+          <w:szCs w:val="20"/>
+        </w:rPr>
+        <w:t xml:space="preserve">Possible contributors: </w:t>
+      </w:r>
+      <w:r>
+        <w:rPr>
+          <w:rFonts w:ascii="Roboto" w:cs="Roboto" w:eastAsia="Roboto" w:hAnsi="Roboto"/>
+          <w:color w:val="000000"/>
+          <w:sz w:val="20"/>
+          <w:szCs w:val="20"/>
+        </w:rPr>
+        <w:t xml:space="preserve">Inflammatory IDO induction, B6 insufficiency at kynureninase step — practitioner to assess.</w:t>
+      </w:r>
+    </w:p>
+    <w:p>
+      <w:pPr>
+        <w:spacing w:after="60"/>
+      </w:pPr>
+      <w:r>
+        <w:rPr>
+          <w:rFonts w:ascii="Roboto" w:cs="Roboto" w:eastAsia="Roboto" w:hAnsi="Roboto"/>
+          <w:b/>
+          <w:bCs/>
+          <w:color w:val="535B50"/>
+          <w:sz w:val="20"/>
+          <w:szCs w:val="20"/>
+        </w:rPr>
+        <w:t xml:space="preserve">Relevance to formulation: </w:t>
+      </w:r>
+      <w:r>
+        <w:rPr>
+          <w:rFonts w:ascii="Roboto" w:cs="Roboto" w:eastAsia="Roboto" w:hAnsi="Roboto"/>
+          <w:color w:val="000000"/>
+          <w:sz w:val="20"/>
+          <w:szCs w:val="20"/>
+        </w:rPr>
+        <w:t xml:space="preserve">Supports P5P (active B6) and anti-inflammatory inclusion.</w:t>
       </w:r>
     </w:p>
     <w:p>
@@ -2146,16 +2555,16 @@
           <w:sz w:val="22"/>
           <w:szCs w:val="22"/>
         </w:rPr>
-        <w:t xml:space="preserve">Xanthurenic Acid</w:t>
-      </w:r>
-      <w:r>
-        <w:rPr>
-          <w:rFonts w:ascii="Roboto" w:cs="Roboto" w:eastAsia="Roboto" w:hAnsi="Roboto"/>
-          <w:color w:val="000000"/>
-          <w:sz w:val="22"/>
-          <w:szCs w:val="22"/>
-        </w:rPr>
-        <w:t xml:space="preserve">   1.92 mmol/molCR</w:t>
+        <w:t xml:space="preserve">Kynurenic Acid</w:t>
+      </w:r>
+      <w:r>
+        <w:rPr>
+          <w:rFonts w:ascii="Roboto" w:cs="Roboto" w:eastAsia="Roboto" w:hAnsi="Roboto"/>
+          <w:color w:val="000000"/>
+          <w:sz w:val="22"/>
+          <w:szCs w:val="22"/>
+        </w:rPr>
+        <w:t xml:space="preserve">   3.10 mmol/molCR</w:t>
       </w:r>
       <w:r>
         <w:rPr>
@@ -2166,7 +2575,7 @@
           <w:sz w:val="20"/>
           <w:szCs w:val="20"/>
         </w:rPr>
-        <w:t xml:space="preserve">   (ref: &lt;0.96)</w:t>
+        <w:t xml:space="preserve">   (ref: &lt;2.20)</w:t>
       </w:r>
     </w:p>
     <w:p>
@@ -2191,7 +2600,32 @@
           <w:sz w:val="20"/>
           <w:szCs w:val="20"/>
         </w:rPr>
-        <w:t xml:space="preserve">Above reference — pattern consistent with functional B6 demand on the kynurenine pathway per published frameworks.</w:t>
+        <w:t xml:space="preserve">Elevated. Pattern of kynurenine pathway upregulation.</w:t>
+      </w:r>
+    </w:p>
+    <w:p>
+      <w:pPr>
+        <w:spacing w:after="60"/>
+      </w:pPr>
+      <w:r>
+        <w:rPr>
+          <w:rFonts w:ascii="Roboto" w:cs="Roboto" w:eastAsia="Roboto" w:hAnsi="Roboto"/>
+          <w:b/>
+          <w:bCs/>
+          <w:color w:val="535B50"/>
+          <w:sz w:val="20"/>
+          <w:szCs w:val="20"/>
+        </w:rPr>
+        <w:t xml:space="preserve">Possible contributors: </w:t>
+      </w:r>
+      <w:r>
+        <w:rPr>
+          <w:rFonts w:ascii="Roboto" w:cs="Roboto" w:eastAsia="Roboto" w:hAnsi="Roboto"/>
+          <w:color w:val="000000"/>
+          <w:sz w:val="20"/>
+          <w:szCs w:val="20"/>
+        </w:rPr>
+        <w:t xml:space="preserve">Pro-inflammatory state — practitioner to assess.</w:t>
       </w:r>
     </w:p>
     <w:p>
@@ -2216,7 +2650,7 @@
           <w:sz w:val="20"/>
           <w:szCs w:val="20"/>
         </w:rPr>
-        <w:t xml:space="preserve">Supports active B6 (P5P) inclusion.</w:t>
+        <w:t xml:space="preserve">Supports anti-inflammatory and B6 inclusion.</w:t>
       </w:r>
     </w:p>
     <w:p>
@@ -2232,16 +2666,16 @@
           <w:sz w:val="22"/>
           <w:szCs w:val="22"/>
         </w:rPr>
-        <w:t xml:space="preserve">Kynurenic Acid</w:t>
-      </w:r>
-      <w:r>
-        <w:rPr>
-          <w:rFonts w:ascii="Roboto" w:cs="Roboto" w:eastAsia="Roboto" w:hAnsi="Roboto"/>
-          <w:color w:val="000000"/>
-          <w:sz w:val="22"/>
-          <w:szCs w:val="22"/>
-        </w:rPr>
-        <w:t xml:space="preserve">   3.10 mmol/molCR</w:t>
+        <w:t xml:space="preserve">Xanthurenic Acid</w:t>
+      </w:r>
+      <w:r>
+        <w:rPr>
+          <w:rFonts w:ascii="Roboto" w:cs="Roboto" w:eastAsia="Roboto" w:hAnsi="Roboto"/>
+          <w:color w:val="000000"/>
+          <w:sz w:val="22"/>
+          <w:szCs w:val="22"/>
+        </w:rPr>
+        <w:t xml:space="preserve">   1.92 mmol/molCR</w:t>
       </w:r>
       <w:r>
         <w:rPr>
@@ -2252,7 +2686,7 @@
           <w:sz w:val="20"/>
           <w:szCs w:val="20"/>
         </w:rPr>
-        <w:t xml:space="preserve">   (ref: &lt;2.20)</w:t>
+        <w:t xml:space="preserve">   (ref: &lt;0.96)</w:t>
       </w:r>
     </w:p>
     <w:p>
@@ -2277,7 +2711,57 @@
           <w:sz w:val="20"/>
           <w:szCs w:val="20"/>
         </w:rPr>
-        <w:t xml:space="preserve">Above reference — kynurenine pathway upregulation per published literature.</w:t>
+        <w:t xml:space="preserve">Elevated. Per published frameworks, classical functional marker of B6 insufficiency at the kynureninase step.</w:t>
+      </w:r>
+    </w:p>
+    <w:p>
+      <w:pPr>
+        <w:spacing w:after="60"/>
+      </w:pPr>
+      <w:r>
+        <w:rPr>
+          <w:rFonts w:ascii="Roboto" w:cs="Roboto" w:eastAsia="Roboto" w:hAnsi="Roboto"/>
+          <w:b/>
+          <w:bCs/>
+          <w:color w:val="535B50"/>
+          <w:sz w:val="20"/>
+          <w:szCs w:val="20"/>
+        </w:rPr>
+        <w:t xml:space="preserve">Possible contributors: </w:t>
+      </w:r>
+      <w:r>
+        <w:rPr>
+          <w:rFonts w:ascii="Roboto" w:cs="Roboto" w:eastAsia="Roboto" w:hAnsi="Roboto"/>
+          <w:color w:val="000000"/>
+          <w:sz w:val="20"/>
+          <w:szCs w:val="20"/>
+        </w:rPr>
+        <w:t xml:space="preserve">Functional B6 insufficiency — practitioner to assess.</w:t>
+      </w:r>
+    </w:p>
+    <w:p>
+      <w:pPr>
+        <w:spacing w:after="60"/>
+      </w:pPr>
+      <w:r>
+        <w:rPr>
+          <w:rFonts w:ascii="Roboto" w:cs="Roboto" w:eastAsia="Roboto" w:hAnsi="Roboto"/>
+          <w:b/>
+          <w:bCs/>
+          <w:color w:val="535B50"/>
+          <w:sz w:val="20"/>
+          <w:szCs w:val="20"/>
+        </w:rPr>
+        <w:t xml:space="preserve">Relevance to formulation: </w:t>
+      </w:r>
+      <w:r>
+        <w:rPr>
+          <w:rFonts w:ascii="Roboto" w:cs="Roboto" w:eastAsia="Roboto" w:hAnsi="Roboto"/>
+          <w:color w:val="000000"/>
+          <w:sz w:val="20"/>
+          <w:szCs w:val="20"/>
+        </w:rPr>
+        <w:t xml:space="preserve">Anchors inclusion of pyridoxal-5-phosphate (P5P).</w:t>
       </w:r>
     </w:p>
     <w:p>
@@ -2293,16 +2777,16 @@
           <w:sz w:val="22"/>
           <w:szCs w:val="22"/>
         </w:rPr>
-        <w:t xml:space="preserve">Quinolinic Acid</w:t>
-      </w:r>
-      <w:r>
-        <w:rPr>
-          <w:rFonts w:ascii="Roboto" w:cs="Roboto" w:eastAsia="Roboto" w:hAnsi="Roboto"/>
-          <w:color w:val="000000"/>
-          <w:sz w:val="22"/>
-          <w:szCs w:val="22"/>
-        </w:rPr>
-        <w:t xml:space="preserve">   11.80 mmol/molCR</w:t>
+        <w:t xml:space="preserve">Quinolinic/5-HIAA Ratio</w:t>
+      </w:r>
+      <w:r>
+        <w:rPr>
+          <w:rFonts w:ascii="Roboto" w:cs="Roboto" w:eastAsia="Roboto" w:hAnsi="Roboto"/>
+          <w:color w:val="000000"/>
+          <w:sz w:val="22"/>
+          <w:szCs w:val="22"/>
+        </w:rPr>
+        <w:t xml:space="preserve">   10.4 ratio</w:t>
       </w:r>
       <w:r>
         <w:rPr>
@@ -2313,7 +2797,7 @@
           <w:sz w:val="20"/>
           <w:szCs w:val="20"/>
         </w:rPr>
-        <w:t xml:space="preserve">   (ref: &lt;9.10)</w:t>
+        <w:t xml:space="preserve">   (ref: &lt;5.0)</w:t>
       </w:r>
     </w:p>
     <w:p>
@@ -2338,7 +2822,57 @@
           <w:sz w:val="20"/>
           <w:szCs w:val="20"/>
         </w:rPr>
-        <w:t xml:space="preserve">Above reference — pattern consistent with IDO-driven tryptophan shunting and excitotoxic potential per published neuro-inflammation frameworks.</w:t>
+        <w:t xml:space="preserve">Elevated. Pattern suggestive of tryptophan diversion away from serotonin toward kynurenine arm.</w:t>
+      </w:r>
+    </w:p>
+    <w:p>
+      <w:pPr>
+        <w:spacing w:after="60"/>
+      </w:pPr>
+      <w:r>
+        <w:rPr>
+          <w:rFonts w:ascii="Roboto" w:cs="Roboto" w:eastAsia="Roboto" w:hAnsi="Roboto"/>
+          <w:b/>
+          <w:bCs/>
+          <w:color w:val="535B50"/>
+          <w:sz w:val="20"/>
+          <w:szCs w:val="20"/>
+        </w:rPr>
+        <w:t xml:space="preserve">Possible contributors: </w:t>
+      </w:r>
+      <w:r>
+        <w:rPr>
+          <w:rFonts w:ascii="Roboto" w:cs="Roboto" w:eastAsia="Roboto" w:hAnsi="Roboto"/>
+          <w:color w:val="000000"/>
+          <w:sz w:val="20"/>
+          <w:szCs w:val="20"/>
+        </w:rPr>
+        <w:t xml:space="preserve">Inflammation-driven IDO upregulation — practitioner to assess.</w:t>
+      </w:r>
+    </w:p>
+    <w:p>
+      <w:pPr>
+        <w:spacing w:after="60"/>
+      </w:pPr>
+      <w:r>
+        <w:rPr>
+          <w:rFonts w:ascii="Roboto" w:cs="Roboto" w:eastAsia="Roboto" w:hAnsi="Roboto"/>
+          <w:b/>
+          <w:bCs/>
+          <w:color w:val="535B50"/>
+          <w:sz w:val="20"/>
+          <w:szCs w:val="20"/>
+        </w:rPr>
+        <w:t xml:space="preserve">Relevance to formulation: </w:t>
+      </w:r>
+      <w:r>
+        <w:rPr>
+          <w:rFonts w:ascii="Roboto" w:cs="Roboto" w:eastAsia="Roboto" w:hAnsi="Roboto"/>
+          <w:color w:val="000000"/>
+          <w:sz w:val="20"/>
+          <w:szCs w:val="20"/>
+        </w:rPr>
+        <w:t xml:space="preserve">Supports anti-inflammatory axis and B6 cofactor.</w:t>
       </w:r>
     </w:p>
     <w:p>
@@ -2354,16 +2888,16 @@
           <w:sz w:val="22"/>
           <w:szCs w:val="22"/>
         </w:rPr>
-        <w:t xml:space="preserve">Quinolinic/5-HIAA Ratio</w:t>
-      </w:r>
-      <w:r>
-        <w:rPr>
-          <w:rFonts w:ascii="Roboto" w:cs="Roboto" w:eastAsia="Roboto" w:hAnsi="Roboto"/>
-          <w:color w:val="000000"/>
-          <w:sz w:val="22"/>
-          <w:szCs w:val="22"/>
-        </w:rPr>
-        <w:t xml:space="preserve">   10.4</w:t>
+        <w:t xml:space="preserve">5-Methylcytosine</w:t>
+      </w:r>
+      <w:r>
+        <w:rPr>
+          <w:rFonts w:ascii="Roboto" w:cs="Roboto" w:eastAsia="Roboto" w:hAnsi="Roboto"/>
+          <w:color w:val="000000"/>
+          <w:sz w:val="22"/>
+          <w:szCs w:val="22"/>
+        </w:rPr>
+        <w:t xml:space="preserve">   68.00 mmol/molCR</w:t>
       </w:r>
       <w:r>
         <w:rPr>
@@ -2374,7 +2908,7 @@
           <w:sz w:val="20"/>
           <w:szCs w:val="20"/>
         </w:rPr>
-        <w:t xml:space="preserve">   (ref: &lt;5.0)</w:t>
+        <w:t xml:space="preserve">   (ref: 10.00-50.00)</w:t>
       </w:r>
     </w:p>
     <w:p>
@@ -2399,7 +2933,57 @@
           <w:sz w:val="20"/>
           <w:szCs w:val="20"/>
         </w:rPr>
-        <w:t xml:space="preserve">Elevated — pattern consistent with tryptophan being shunted away from serotonin toward the quinolinic arm per published frameworks. Practitioner may wish to consider inflammation as a driver.</w:t>
+        <w:t xml:space="preserve">Elevated. Per published frameworks, may reflect altered methylation/DNA turnover.</w:t>
+      </w:r>
+    </w:p>
+    <w:p>
+      <w:pPr>
+        <w:spacing w:after="60"/>
+      </w:pPr>
+      <w:r>
+        <w:rPr>
+          <w:rFonts w:ascii="Roboto" w:cs="Roboto" w:eastAsia="Roboto" w:hAnsi="Roboto"/>
+          <w:b/>
+          <w:bCs/>
+          <w:color w:val="535B50"/>
+          <w:sz w:val="20"/>
+          <w:szCs w:val="20"/>
+        </w:rPr>
+        <w:t xml:space="preserve">Possible contributors: </w:t>
+      </w:r>
+      <w:r>
+        <w:rPr>
+          <w:rFonts w:ascii="Roboto" w:cs="Roboto" w:eastAsia="Roboto" w:hAnsi="Roboto"/>
+          <w:color w:val="000000"/>
+          <w:sz w:val="20"/>
+          <w:szCs w:val="20"/>
+        </w:rPr>
+        <w:t xml:space="preserve">Methylation cycle stress, oxidative DNA turnover — practitioner to assess.</w:t>
+      </w:r>
+    </w:p>
+    <w:p>
+      <w:pPr>
+        <w:spacing w:after="60"/>
+      </w:pPr>
+      <w:r>
+        <w:rPr>
+          <w:rFonts w:ascii="Roboto" w:cs="Roboto" w:eastAsia="Roboto" w:hAnsi="Roboto"/>
+          <w:b/>
+          <w:bCs/>
+          <w:color w:val="535B50"/>
+          <w:sz w:val="20"/>
+          <w:szCs w:val="20"/>
+        </w:rPr>
+        <w:t xml:space="preserve">Relevance to formulation: </w:t>
+      </w:r>
+      <w:r>
+        <w:rPr>
+          <w:rFonts w:ascii="Roboto" w:cs="Roboto" w:eastAsia="Roboto" w:hAnsi="Roboto"/>
+          <w:color w:val="000000"/>
+          <w:sz w:val="20"/>
+          <w:szCs w:val="20"/>
+        </w:rPr>
+        <w:t xml:space="preserve">Supports B12/folate/B6/B2 inclusion.</w:t>
       </w:r>
     </w:p>
     <w:p>
@@ -2415,16 +2999,16 @@
           <w:sz w:val="22"/>
           <w:szCs w:val="22"/>
         </w:rPr>
-        <w:t xml:space="preserve">5-HIAA</w:t>
-      </w:r>
-      <w:r>
-        <w:rPr>
-          <w:rFonts w:ascii="Roboto" w:cs="Roboto" w:eastAsia="Roboto" w:hAnsi="Roboto"/>
-          <w:color w:val="000000"/>
-          <w:sz w:val="22"/>
-          <w:szCs w:val="22"/>
-        </w:rPr>
-        <w:t xml:space="preserve">   1.14 mmol/molCR</w:t>
+        <w:t xml:space="preserve">Guanidinoacetic Acid</w:t>
+      </w:r>
+      <w:r>
+        <w:rPr>
+          <w:rFonts w:ascii="Roboto" w:cs="Roboto" w:eastAsia="Roboto" w:hAnsi="Roboto"/>
+          <w:color w:val="000000"/>
+          <w:sz w:val="22"/>
+          <w:szCs w:val="22"/>
+        </w:rPr>
+        <w:t xml:space="preserve">   4.80 mmol/molCR</w:t>
       </w:r>
       <w:r>
         <w:rPr>
@@ -2435,7 +3019,7 @@
           <w:sz w:val="20"/>
           <w:szCs w:val="20"/>
         </w:rPr>
-        <w:t xml:space="preserve">   (ref: &lt;4.30)</w:t>
+        <w:t xml:space="preserve">   (ref: 0.50-3.00)</w:t>
       </w:r>
     </w:p>
     <w:p>
@@ -2460,7 +3044,57 @@
           <w:sz w:val="20"/>
           <w:szCs w:val="20"/>
         </w:rPr>
-        <w:t xml:space="preserve">Low-normal — consistent with reduced serotonin pathway throughput when read alongside the elevated quinolinic arm.</w:t>
+        <w:t xml:space="preserve">Elevated. Per published frameworks, methylation precursor accumulation suggests SAMe demand for creatine synthesis.</w:t>
+      </w:r>
+    </w:p>
+    <w:p>
+      <w:pPr>
+        <w:spacing w:after="60"/>
+      </w:pPr>
+      <w:r>
+        <w:rPr>
+          <w:rFonts w:ascii="Roboto" w:cs="Roboto" w:eastAsia="Roboto" w:hAnsi="Roboto"/>
+          <w:b/>
+          <w:bCs/>
+          <w:color w:val="535B50"/>
+          <w:sz w:val="20"/>
+          <w:szCs w:val="20"/>
+        </w:rPr>
+        <w:t xml:space="preserve">Possible contributors: </w:t>
+      </w:r>
+      <w:r>
+        <w:rPr>
+          <w:rFonts w:ascii="Roboto" w:cs="Roboto" w:eastAsia="Roboto" w:hAnsi="Roboto"/>
+          <w:color w:val="000000"/>
+          <w:sz w:val="20"/>
+          <w:szCs w:val="20"/>
+        </w:rPr>
+        <w:t xml:space="preserve">Methylation pathway demand exceeding supply — practitioner to assess.</w:t>
+      </w:r>
+    </w:p>
+    <w:p>
+      <w:pPr>
+        <w:spacing w:after="60"/>
+      </w:pPr>
+      <w:r>
+        <w:rPr>
+          <w:rFonts w:ascii="Roboto" w:cs="Roboto" w:eastAsia="Roboto" w:hAnsi="Roboto"/>
+          <w:b/>
+          <w:bCs/>
+          <w:color w:val="535B50"/>
+          <w:sz w:val="20"/>
+          <w:szCs w:val="20"/>
+        </w:rPr>
+        <w:t xml:space="preserve">Relevance to formulation: </w:t>
+      </w:r>
+      <w:r>
+        <w:rPr>
+          <w:rFonts w:ascii="Roboto" w:cs="Roboto" w:eastAsia="Roboto" w:hAnsi="Roboto"/>
+          <w:color w:val="000000"/>
+          <w:sz w:val="20"/>
+          <w:szCs w:val="20"/>
+        </w:rPr>
+        <w:t xml:space="preserve">Supports methylation B-vitamin stack.</w:t>
       </w:r>
     </w:p>
     <w:p>
@@ -2476,16 +3110,16 @@
           <w:sz w:val="22"/>
           <w:szCs w:val="22"/>
         </w:rPr>
-        <w:t xml:space="preserve">8-hydroxy-deoxyguanosine</w:t>
-      </w:r>
-      <w:r>
-        <w:rPr>
-          <w:rFonts w:ascii="Roboto" w:cs="Roboto" w:eastAsia="Roboto" w:hAnsi="Roboto"/>
-          <w:color w:val="000000"/>
-          <w:sz w:val="22"/>
-          <w:szCs w:val="22"/>
-        </w:rPr>
-        <w:t xml:space="preserve">   3.80 umol/molCR</w:t>
+        <w:t xml:space="preserve">2-Oxo-4-methiolbutyric Acid (KMBA)</w:t>
+      </w:r>
+      <w:r>
+        <w:rPr>
+          <w:rFonts w:ascii="Roboto" w:cs="Roboto" w:eastAsia="Roboto" w:hAnsi="Roboto"/>
+          <w:color w:val="000000"/>
+          <w:sz w:val="22"/>
+          <w:szCs w:val="22"/>
+        </w:rPr>
+        <w:t xml:space="preserve">   3.20 mmol/molCR</w:t>
       </w:r>
       <w:r>
         <w:rPr>
@@ -2496,7 +3130,7 @@
           <w:sz w:val="20"/>
           <w:szCs w:val="20"/>
         </w:rPr>
-        <w:t xml:space="preserve">   (ref: &lt;2.70)</w:t>
+        <w:t xml:space="preserve">   (ref: &lt;1.50)</w:t>
       </w:r>
     </w:p>
     <w:p>
@@ -2521,7 +3155,32 @@
           <w:sz w:val="20"/>
           <w:szCs w:val="20"/>
         </w:rPr>
-        <w:t xml:space="preserve">Above reference — marker of oxidative DNA damage per published literature.</w:t>
+        <w:t xml:space="preserve">Elevated. Per published frameworks, methionine recycling intermediate accumulation.</w:t>
+      </w:r>
+    </w:p>
+    <w:p>
+      <w:pPr>
+        <w:spacing w:after="60"/>
+      </w:pPr>
+      <w:r>
+        <w:rPr>
+          <w:rFonts w:ascii="Roboto" w:cs="Roboto" w:eastAsia="Roboto" w:hAnsi="Roboto"/>
+          <w:b/>
+          <w:bCs/>
+          <w:color w:val="535B50"/>
+          <w:sz w:val="20"/>
+          <w:szCs w:val="20"/>
+        </w:rPr>
+        <w:t xml:space="preserve">Possible contributors: </w:t>
+      </w:r>
+      <w:r>
+        <w:rPr>
+          <w:rFonts w:ascii="Roboto" w:cs="Roboto" w:eastAsia="Roboto" w:hAnsi="Roboto"/>
+          <w:color w:val="000000"/>
+          <w:sz w:val="20"/>
+          <w:szCs w:val="20"/>
+        </w:rPr>
+        <w:t xml:space="preserve">Methylation cycle strain, oxidative stress on methionine — practitioner to assess.</w:t>
       </w:r>
     </w:p>
     <w:p>
@@ -2546,7 +3205,7 @@
           <w:sz w:val="20"/>
           <w:szCs w:val="20"/>
         </w:rPr>
-        <w:t xml:space="preserve">Supports antioxidant stack (vitamin C, NAC, resveratrol, milk thistle, CoQ10).</w:t>
+        <w:t xml:space="preserve">Supports B12 and methylation cofactors.</w:t>
       </w:r>
     </w:p>
     <w:p>
@@ -2562,16 +3221,16 @@
           <w:sz w:val="22"/>
           <w:szCs w:val="22"/>
         </w:rPr>
-        <w:t xml:space="preserve">Leukotriene E4</w:t>
-      </w:r>
-      <w:r>
-        <w:rPr>
-          <w:rFonts w:ascii="Roboto" w:cs="Roboto" w:eastAsia="Roboto" w:hAnsi="Roboto"/>
-          <w:color w:val="000000"/>
-          <w:sz w:val="22"/>
-          <w:szCs w:val="22"/>
-        </w:rPr>
-        <w:t xml:space="preserve">   195.00 pg/mgCR</w:t>
+        <w:t xml:space="preserve">Arabinose</w:t>
+      </w:r>
+      <w:r>
+        <w:rPr>
+          <w:rFonts w:ascii="Roboto" w:cs="Roboto" w:eastAsia="Roboto" w:hAnsi="Roboto"/>
+          <w:color w:val="000000"/>
+          <w:sz w:val="22"/>
+          <w:szCs w:val="22"/>
+        </w:rPr>
+        <w:t xml:space="preserve">   42.00 mmol/molCR</w:t>
       </w:r>
       <w:r>
         <w:rPr>
@@ -2582,7 +3241,7 @@
           <w:sz w:val="20"/>
           <w:szCs w:val="20"/>
         </w:rPr>
-        <w:t xml:space="preserve">   (ref: &lt;100.00)</w:t>
+        <w:t xml:space="preserve">   (ref: &lt;32.00)</w:t>
       </w:r>
     </w:p>
     <w:p>
@@ -2607,7 +3266,32 @@
           <w:sz w:val="20"/>
           <w:szCs w:val="20"/>
         </w:rPr>
-        <w:t xml:space="preserve">Above reference — pattern consistent with 5-LOX-mediated inflammation per published frameworks.</w:t>
+        <w:t xml:space="preserve">Mildly elevated. Per published frameworks, associated with intestinal yeast/Candida activity.</w:t>
+      </w:r>
+    </w:p>
+    <w:p>
+      <w:pPr>
+        <w:spacing w:after="60"/>
+      </w:pPr>
+      <w:r>
+        <w:rPr>
+          <w:rFonts w:ascii="Roboto" w:cs="Roboto" w:eastAsia="Roboto" w:hAnsi="Roboto"/>
+          <w:b/>
+          <w:bCs/>
+          <w:color w:val="535B50"/>
+          <w:sz w:val="20"/>
+          <w:szCs w:val="20"/>
+        </w:rPr>
+        <w:t xml:space="preserve">Possible contributors: </w:t>
+      </w:r>
+      <w:r>
+        <w:rPr>
+          <w:rFonts w:ascii="Roboto" w:cs="Roboto" w:eastAsia="Roboto" w:hAnsi="Roboto"/>
+          <w:color w:val="000000"/>
+          <w:sz w:val="20"/>
+          <w:szCs w:val="20"/>
+        </w:rPr>
+        <w:t xml:space="preserve">Yeast/fungal dysbiosis — practitioner to assess.</w:t>
       </w:r>
     </w:p>
     <w:p>
@@ -2632,7 +3316,7 @@
           <w:sz w:val="20"/>
           <w:szCs w:val="20"/>
         </w:rPr>
-        <w:t xml:space="preserve">Supports boswellia (5-LOX inhibitor mechanism) and broader anti-inflammatory stack.</w:t>
+        <w:t xml:space="preserve">GI axis emphasis modest; standalone probiotic recommended (not in Library).</w:t>
       </w:r>
     </w:p>
     <w:p>
@@ -2648,16 +3332,16 @@
           <w:sz w:val="22"/>
           <w:szCs w:val="22"/>
         </w:rPr>
-        <w:t xml:space="preserve">5-Methylcytosine</w:t>
-      </w:r>
-      <w:r>
-        <w:rPr>
-          <w:rFonts w:ascii="Roboto" w:cs="Roboto" w:eastAsia="Roboto" w:hAnsi="Roboto"/>
-          <w:color w:val="000000"/>
-          <w:sz w:val="22"/>
-          <w:szCs w:val="22"/>
-        </w:rPr>
-        <w:t xml:space="preserve">   68.00 mmol/molCR</w:t>
+        <w:t xml:space="preserve">3,4-Dihydroxybenzoic Acid (3,4-DHBA)</w:t>
+      </w:r>
+      <w:r>
+        <w:rPr>
+          <w:rFonts w:ascii="Roboto" w:cs="Roboto" w:eastAsia="Roboto" w:hAnsi="Roboto"/>
+          <w:color w:val="000000"/>
+          <w:sz w:val="22"/>
+          <w:szCs w:val="22"/>
+        </w:rPr>
+        <w:t xml:space="preserve">   62.00 mmol/molCR</w:t>
       </w:r>
       <w:r>
         <w:rPr>
@@ -2668,7 +3352,7 @@
           <w:sz w:val="20"/>
           <w:szCs w:val="20"/>
         </w:rPr>
-        <w:t xml:space="preserve">   (ref: 10.00-50.00)</w:t>
+        <w:t xml:space="preserve">   (ref: &lt;45.00)</w:t>
       </w:r>
     </w:p>
     <w:p>
@@ -2693,7 +3377,57 @@
           <w:sz w:val="20"/>
           <w:szCs w:val="20"/>
         </w:rPr>
-        <w:t xml:space="preserve">Above reference — pattern consistent with elevated global DNA methylation turnover for practitioner consideration.</w:t>
+        <w:t xml:space="preserve">Mildly elevated. Per published frameworks, microbial polyphenol metabolite.</w:t>
+      </w:r>
+    </w:p>
+    <w:p>
+      <w:pPr>
+        <w:spacing w:after="60"/>
+      </w:pPr>
+      <w:r>
+        <w:rPr>
+          <w:rFonts w:ascii="Roboto" w:cs="Roboto" w:eastAsia="Roboto" w:hAnsi="Roboto"/>
+          <w:b/>
+          <w:bCs/>
+          <w:color w:val="535B50"/>
+          <w:sz w:val="20"/>
+          <w:szCs w:val="20"/>
+        </w:rPr>
+        <w:t xml:space="preserve">Possible contributors: </w:t>
+      </w:r>
+      <w:r>
+        <w:rPr>
+          <w:rFonts w:ascii="Roboto" w:cs="Roboto" w:eastAsia="Roboto" w:hAnsi="Roboto"/>
+          <w:color w:val="000000"/>
+          <w:sz w:val="20"/>
+          <w:szCs w:val="20"/>
+        </w:rPr>
+        <w:t xml:space="preserve">Dysbiotic microbial activity — practitioner to assess.</w:t>
+      </w:r>
+    </w:p>
+    <w:p>
+      <w:pPr>
+        <w:spacing w:after="60"/>
+      </w:pPr>
+      <w:r>
+        <w:rPr>
+          <w:rFonts w:ascii="Roboto" w:cs="Roboto" w:eastAsia="Roboto" w:hAnsi="Roboto"/>
+          <w:b/>
+          <w:bCs/>
+          <w:color w:val="535B50"/>
+          <w:sz w:val="20"/>
+          <w:szCs w:val="20"/>
+        </w:rPr>
+        <w:t xml:space="preserve">Relevance to formulation: </w:t>
+      </w:r>
+      <w:r>
+        <w:rPr>
+          <w:rFonts w:ascii="Roboto" w:cs="Roboto" w:eastAsia="Roboto" w:hAnsi="Roboto"/>
+          <w:color w:val="000000"/>
+          <w:sz w:val="20"/>
+          <w:szCs w:val="20"/>
+        </w:rPr>
+        <w:t xml:space="preserve">Modest GI emphasis.</w:t>
       </w:r>
     </w:p>
     <w:p>
@@ -2709,16 +3443,16 @@
           <w:sz w:val="22"/>
           <w:szCs w:val="22"/>
         </w:rPr>
-        <w:t xml:space="preserve">Phenylpyruvic Acid</w:t>
-      </w:r>
-      <w:r>
-        <w:rPr>
-          <w:rFonts w:ascii="Roboto" w:cs="Roboto" w:eastAsia="Roboto" w:hAnsi="Roboto"/>
-          <w:color w:val="000000"/>
-          <w:sz w:val="22"/>
-          <w:szCs w:val="22"/>
-        </w:rPr>
-        <w:t xml:space="preserve">   4.50 mmol/molCR</w:t>
+        <w:t xml:space="preserve">Furancarbonylglycine</w:t>
+      </w:r>
+      <w:r>
+        <w:rPr>
+          <w:rFonts w:ascii="Roboto" w:cs="Roboto" w:eastAsia="Roboto" w:hAnsi="Roboto"/>
+          <w:color w:val="000000"/>
+          <w:sz w:val="22"/>
+          <w:szCs w:val="22"/>
+        </w:rPr>
+        <w:t xml:space="preserve">   2.90 mmol/molCR</w:t>
       </w:r>
       <w:r>
         <w:rPr>
@@ -2754,7 +3488,57 @@
           <w:sz w:val="20"/>
           <w:szCs w:val="20"/>
         </w:rPr>
-        <w:t xml:space="preserve">Above reference — pattern consistent with functional phenylalanine hydroxylase / cofactor demand per published frameworks.</w:t>
+        <w:t xml:space="preserve">Mildly elevated. Pattern consistent with furan exposure or dysbiotic origin.</w:t>
+      </w:r>
+    </w:p>
+    <w:p>
+      <w:pPr>
+        <w:spacing w:after="60"/>
+      </w:pPr>
+      <w:r>
+        <w:rPr>
+          <w:rFonts w:ascii="Roboto" w:cs="Roboto" w:eastAsia="Roboto" w:hAnsi="Roboto"/>
+          <w:b/>
+          <w:bCs/>
+          <w:color w:val="535B50"/>
+          <w:sz w:val="20"/>
+          <w:szCs w:val="20"/>
+        </w:rPr>
+        <w:t xml:space="preserve">Possible contributors: </w:t>
+      </w:r>
+      <w:r>
+        <w:rPr>
+          <w:rFonts w:ascii="Roboto" w:cs="Roboto" w:eastAsia="Roboto" w:hAnsi="Roboto"/>
+          <w:color w:val="000000"/>
+          <w:sz w:val="20"/>
+          <w:szCs w:val="20"/>
+        </w:rPr>
+        <w:t xml:space="preserve">Dietary HMF/furan exposure, dysbiosis — practitioner to assess.</w:t>
+      </w:r>
+    </w:p>
+    <w:p>
+      <w:pPr>
+        <w:spacing w:after="60"/>
+      </w:pPr>
+      <w:r>
+        <w:rPr>
+          <w:rFonts w:ascii="Roboto" w:cs="Roboto" w:eastAsia="Roboto" w:hAnsi="Roboto"/>
+          <w:b/>
+          <w:bCs/>
+          <w:color w:val="535B50"/>
+          <w:sz w:val="20"/>
+          <w:szCs w:val="20"/>
+        </w:rPr>
+        <w:t xml:space="preserve">Relevance to formulation: </w:t>
+      </w:r>
+      <w:r>
+        <w:rPr>
+          <w:rFonts w:ascii="Roboto" w:cs="Roboto" w:eastAsia="Roboto" w:hAnsi="Roboto"/>
+          <w:color w:val="000000"/>
+          <w:sz w:val="20"/>
+          <w:szCs w:val="20"/>
+        </w:rPr>
+        <w:t xml:space="preserve">Supports glycine conjugation (standalone) and Phase II support.</w:t>
       </w:r>
     </w:p>
     <w:p>
@@ -2770,16 +3554,16 @@
           <w:sz w:val="22"/>
           <w:szCs w:val="22"/>
         </w:rPr>
-        <w:t xml:space="preserve">2-Oxo-4-methiolbutyric Acid (KMBA)</w:t>
-      </w:r>
-      <w:r>
-        <w:rPr>
-          <w:rFonts w:ascii="Roboto" w:cs="Roboto" w:eastAsia="Roboto" w:hAnsi="Roboto"/>
-          <w:color w:val="000000"/>
-          <w:sz w:val="22"/>
-          <w:szCs w:val="22"/>
-        </w:rPr>
-        <w:t xml:space="preserve">   3.20 mmol/molCR</w:t>
+        <w:t xml:space="preserve">Phenylpyruvic Acid</w:t>
+      </w:r>
+      <w:r>
+        <w:rPr>
+          <w:rFonts w:ascii="Roboto" w:cs="Roboto" w:eastAsia="Roboto" w:hAnsi="Roboto"/>
+          <w:color w:val="000000"/>
+          <w:sz w:val="22"/>
+          <w:szCs w:val="22"/>
+        </w:rPr>
+        <w:t xml:space="preserve">   4.50 mmol/molCR</w:t>
       </w:r>
       <w:r>
         <w:rPr>
@@ -2790,7 +3574,7 @@
           <w:sz w:val="20"/>
           <w:szCs w:val="20"/>
         </w:rPr>
-        <w:t xml:space="preserve">   (ref: &lt;1.50)</w:t>
+        <w:t xml:space="preserve">   (ref: &lt;2.00)</w:t>
       </w:r>
     </w:p>
     <w:p>
@@ -2815,7 +3599,57 @@
           <w:sz w:val="20"/>
           <w:szCs w:val="20"/>
         </w:rPr>
-        <w:t xml:space="preserve">Above reference — pattern consistent with methionine metabolism strain per published frameworks.</w:t>
+        <w:t xml:space="preserve">Elevated. Per published frameworks, phenylalanine catabolism intermediate.</w:t>
+      </w:r>
+    </w:p>
+    <w:p>
+      <w:pPr>
+        <w:spacing w:after="60"/>
+      </w:pPr>
+      <w:r>
+        <w:rPr>
+          <w:rFonts w:ascii="Roboto" w:cs="Roboto" w:eastAsia="Roboto" w:hAnsi="Roboto"/>
+          <w:b/>
+          <w:bCs/>
+          <w:color w:val="535B50"/>
+          <w:sz w:val="20"/>
+          <w:szCs w:val="20"/>
+        </w:rPr>
+        <w:t xml:space="preserve">Possible contributors: </w:t>
+      </w:r>
+      <w:r>
+        <w:rPr>
+          <w:rFonts w:ascii="Roboto" w:cs="Roboto" w:eastAsia="Roboto" w:hAnsi="Roboto"/>
+          <w:color w:val="000000"/>
+          <w:sz w:val="20"/>
+          <w:szCs w:val="20"/>
+        </w:rPr>
+        <w:t xml:space="preserve">Functional cofactor insufficiency in phenylalanine hydroxylation — practitioner to assess.</w:t>
+      </w:r>
+    </w:p>
+    <w:p>
+      <w:pPr>
+        <w:spacing w:after="60"/>
+      </w:pPr>
+      <w:r>
+        <w:rPr>
+          <w:rFonts w:ascii="Roboto" w:cs="Roboto" w:eastAsia="Roboto" w:hAnsi="Roboto"/>
+          <w:b/>
+          <w:bCs/>
+          <w:color w:val="535B50"/>
+          <w:sz w:val="20"/>
+          <w:szCs w:val="20"/>
+        </w:rPr>
+        <w:t xml:space="preserve">Relevance to formulation: </w:t>
+      </w:r>
+      <w:r>
+        <w:rPr>
+          <w:rFonts w:ascii="Roboto" w:cs="Roboto" w:eastAsia="Roboto" w:hAnsi="Roboto"/>
+          <w:color w:val="000000"/>
+          <w:sz w:val="20"/>
+          <w:szCs w:val="20"/>
+        </w:rPr>
+        <w:t xml:space="preserve">Noted; not driving direct formulation change.</w:t>
       </w:r>
     </w:p>
     <w:p>
@@ -2831,16 +3665,16 @@
           <w:sz w:val="22"/>
           <w:szCs w:val="22"/>
         </w:rPr>
-        <w:t xml:space="preserve">Guanidinoacetic Acid</w:t>
-      </w:r>
-      <w:r>
-        <w:rPr>
-          <w:rFonts w:ascii="Roboto" w:cs="Roboto" w:eastAsia="Roboto" w:hAnsi="Roboto"/>
-          <w:color w:val="000000"/>
-          <w:sz w:val="22"/>
-          <w:szCs w:val="22"/>
-        </w:rPr>
-        <w:t xml:space="preserve">   4.80 mmol/molCR</w:t>
+        <w:t xml:space="preserve">Cortisol (OA)</w:t>
+      </w:r>
+      <w:r>
+        <w:rPr>
+          <w:rFonts w:ascii="Roboto" w:cs="Roboto" w:eastAsia="Roboto" w:hAnsi="Roboto"/>
+          <w:color w:val="000000"/>
+          <w:sz w:val="22"/>
+          <w:szCs w:val="22"/>
+        </w:rPr>
+        <w:t xml:space="preserve">   25.3 ug/gCR</w:t>
       </w:r>
       <w:r>
         <w:rPr>
@@ -2851,7 +3685,7 @@
           <w:sz w:val="20"/>
           <w:szCs w:val="20"/>
         </w:rPr>
-        <w:t xml:space="preserve">   (ref: 0.50-3.00)</w:t>
+        <w:t xml:space="preserve">   (ref: 1.0-63.8)</w:t>
       </w:r>
     </w:p>
     <w:p>
@@ -2876,7 +3710,57 @@
           <w:sz w:val="20"/>
           <w:szCs w:val="20"/>
         </w:rPr>
-        <w:t xml:space="preserve">Above reference — pattern consistent with creatine synthesis pathway flux / methylation demand per published frameworks.</w:t>
+        <w:t xml:space="preserve">Within laboratory reference range.</w:t>
+      </w:r>
+    </w:p>
+    <w:p>
+      <w:pPr>
+        <w:spacing w:after="60"/>
+      </w:pPr>
+      <w:r>
+        <w:rPr>
+          <w:rFonts w:ascii="Roboto" w:cs="Roboto" w:eastAsia="Roboto" w:hAnsi="Roboto"/>
+          <w:b/>
+          <w:bCs/>
+          <w:color w:val="535B50"/>
+          <w:sz w:val="20"/>
+          <w:szCs w:val="20"/>
+        </w:rPr>
+        <w:t xml:space="preserve">Possible contributors: </w:t>
+      </w:r>
+      <w:r>
+        <w:rPr>
+          <w:rFonts w:ascii="Roboto" w:cs="Roboto" w:eastAsia="Roboto" w:hAnsi="Roboto"/>
+          <w:color w:val="000000"/>
+          <w:sz w:val="20"/>
+          <w:szCs w:val="20"/>
+        </w:rPr>
+        <w:t xml:space="preserve">n/a</w:t>
+      </w:r>
+    </w:p>
+    <w:p>
+      <w:pPr>
+        <w:spacing w:after="60"/>
+      </w:pPr>
+      <w:r>
+        <w:rPr>
+          <w:rFonts w:ascii="Roboto" w:cs="Roboto" w:eastAsia="Roboto" w:hAnsi="Roboto"/>
+          <w:b/>
+          <w:bCs/>
+          <w:color w:val="535B50"/>
+          <w:sz w:val="20"/>
+          <w:szCs w:val="20"/>
+        </w:rPr>
+        <w:t xml:space="preserve">Relevance to formulation: </w:t>
+      </w:r>
+      <w:r>
+        <w:rPr>
+          <w:rFonts w:ascii="Roboto" w:cs="Roboto" w:eastAsia="Roboto" w:hAnsi="Roboto"/>
+          <w:color w:val="000000"/>
+          <w:sz w:val="20"/>
+          <w:szCs w:val="20"/>
+        </w:rPr>
+        <w:t xml:space="preserve">HPA axis not flagged for primary intervention.</w:t>
       </w:r>
     </w:p>
     <w:p>
@@ -2892,16 +3776,16 @@
           <w:sz w:val="22"/>
           <w:szCs w:val="22"/>
         </w:rPr>
-        <w:t xml:space="preserve">Adipic Acid</w:t>
-      </w:r>
-      <w:r>
-        <w:rPr>
-          <w:rFonts w:ascii="Roboto" w:cs="Roboto" w:eastAsia="Roboto" w:hAnsi="Roboto"/>
-          <w:color w:val="000000"/>
-          <w:sz w:val="22"/>
-          <w:szCs w:val="22"/>
-        </w:rPr>
-        <w:t xml:space="preserve">   4.30 mmol/molCR</w:t>
+        <w:t xml:space="preserve">Pyroglutamic Acid</w:t>
+      </w:r>
+      <w:r>
+        <w:rPr>
+          <w:rFonts w:ascii="Roboto" w:cs="Roboto" w:eastAsia="Roboto" w:hAnsi="Roboto"/>
+          <w:color w:val="000000"/>
+          <w:sz w:val="22"/>
+          <w:szCs w:val="22"/>
+        </w:rPr>
+        <w:t xml:space="preserve">   28.80 mmol/molCR</w:t>
       </w:r>
       <w:r>
         <w:rPr>
@@ -2912,7 +3796,7 @@
           <w:sz w:val="20"/>
           <w:szCs w:val="20"/>
         </w:rPr>
-        <w:t xml:space="preserve">   (ref: &lt;3.80)</w:t>
+        <w:t xml:space="preserve">   (ref: 4.50-33.00)</w:t>
       </w:r>
     </w:p>
     <w:p>
@@ -2937,7 +3821,57 @@
           <w:sz w:val="20"/>
           <w:szCs w:val="20"/>
         </w:rPr>
-        <w:t xml:space="preserve">Marginally above reference — pattern consistent with fatty acid oxidation strain or dietary contribution.</w:t>
+        <w:t xml:space="preserve">Upper portion of reference range. Per published frameworks, may reflect glutathione cycling demand.</w:t>
+      </w:r>
+    </w:p>
+    <w:p>
+      <w:pPr>
+        <w:spacing w:after="60"/>
+      </w:pPr>
+      <w:r>
+        <w:rPr>
+          <w:rFonts w:ascii="Roboto" w:cs="Roboto" w:eastAsia="Roboto" w:hAnsi="Roboto"/>
+          <w:b/>
+          <w:bCs/>
+          <w:color w:val="535B50"/>
+          <w:sz w:val="20"/>
+          <w:szCs w:val="20"/>
+        </w:rPr>
+        <w:t xml:space="preserve">Possible contributors: </w:t>
+      </w:r>
+      <w:r>
+        <w:rPr>
+          <w:rFonts w:ascii="Roboto" w:cs="Roboto" w:eastAsia="Roboto" w:hAnsi="Roboto"/>
+          <w:color w:val="000000"/>
+          <w:sz w:val="20"/>
+          <w:szCs w:val="20"/>
+        </w:rPr>
+        <w:t xml:space="preserve">Glutathione turnover demand — practitioner to assess.</w:t>
+      </w:r>
+    </w:p>
+    <w:p>
+      <w:pPr>
+        <w:spacing w:after="60"/>
+      </w:pPr>
+      <w:r>
+        <w:rPr>
+          <w:rFonts w:ascii="Roboto" w:cs="Roboto" w:eastAsia="Roboto" w:hAnsi="Roboto"/>
+          <w:b/>
+          <w:bCs/>
+          <w:color w:val="535B50"/>
+          <w:sz w:val="20"/>
+          <w:szCs w:val="20"/>
+        </w:rPr>
+        <w:t xml:space="preserve">Relevance to formulation: </w:t>
+      </w:r>
+      <w:r>
+        <w:rPr>
+          <w:rFonts w:ascii="Roboto" w:cs="Roboto" w:eastAsia="Roboto" w:hAnsi="Roboto"/>
+          <w:color w:val="000000"/>
+          <w:sz w:val="20"/>
+          <w:szCs w:val="20"/>
+        </w:rPr>
+        <w:t xml:space="preserve">Reinforces NAC and glutathione precursor inclusion.</w:t>
       </w:r>
     </w:p>
     <w:p>
@@ -2953,16 +3887,16 @@
           <w:sz w:val="22"/>
           <w:szCs w:val="22"/>
         </w:rPr>
-        <w:t xml:space="preserve">Pyroglutamic Acid</w:t>
-      </w:r>
-      <w:r>
-        <w:rPr>
-          <w:rFonts w:ascii="Roboto" w:cs="Roboto" w:eastAsia="Roboto" w:hAnsi="Roboto"/>
-          <w:color w:val="000000"/>
-          <w:sz w:val="22"/>
-          <w:szCs w:val="22"/>
-        </w:rPr>
-        <w:t xml:space="preserve">   28.80 mmol/molCR</w:t>
+        <w:t xml:space="preserve">Methylmalonic Acid (MMA)</w:t>
+      </w:r>
+      <w:r>
+        <w:rPr>
+          <w:rFonts w:ascii="Roboto" w:cs="Roboto" w:eastAsia="Roboto" w:hAnsi="Roboto"/>
+          <w:color w:val="000000"/>
+          <w:sz w:val="22"/>
+          <w:szCs w:val="22"/>
+        </w:rPr>
+        <w:t xml:space="preserve">   1.65 mmol/molCR</w:t>
       </w:r>
       <w:r>
         <w:rPr>
@@ -2973,7 +3907,7 @@
           <w:sz w:val="20"/>
           <w:szCs w:val="20"/>
         </w:rPr>
-        <w:t xml:space="preserve">   (ref: 4.50-33.00)</w:t>
+        <w:t xml:space="preserve">   (ref: &lt;1.90)</w:t>
       </w:r>
     </w:p>
     <w:p>
@@ -2998,68 +3932,57 @@
           <w:sz w:val="20"/>
           <w:szCs w:val="20"/>
         </w:rPr>
-        <w:t xml:space="preserve">Top end of range — pattern consistent with glutathione cycling under demand per published frameworks.</w:t>
-      </w:r>
-    </w:p>
-    <w:p>
-      <w:pPr>
-        <w:spacing w:after="60" w:before="120"/>
-      </w:pPr>
-      <w:r>
-        <w:rPr>
-          <w:rFonts w:ascii="Roboto" w:cs="Roboto" w:eastAsia="Roboto" w:hAnsi="Roboto"/>
-          <w:b/>
-          <w:bCs/>
-          <w:color w:val="535B50"/>
-          <w:sz w:val="22"/>
-          <w:szCs w:val="22"/>
-        </w:rPr>
-        <w:t xml:space="preserve">Cortisol (OA)</w:t>
-      </w:r>
-      <w:r>
-        <w:rPr>
-          <w:rFonts w:ascii="Roboto" w:cs="Roboto" w:eastAsia="Roboto" w:hAnsi="Roboto"/>
-          <w:color w:val="000000"/>
-          <w:sz w:val="22"/>
-          <w:szCs w:val="22"/>
-        </w:rPr>
-        <w:t xml:space="preserve">   25.3 ug/gCR</w:t>
-      </w:r>
-      <w:r>
-        <w:rPr>
-          <w:rFonts w:ascii="Roboto" w:cs="Roboto" w:eastAsia="Roboto" w:hAnsi="Roboto"/>
-          <w:i/>
-          <w:iCs/>
-          <w:color w:val="666666"/>
-          <w:sz w:val="20"/>
-          <w:szCs w:val="20"/>
-        </w:rPr>
-        <w:t xml:space="preserve">   (ref: 1.0-63.8)</w:t>
-      </w:r>
-    </w:p>
-    <w:p>
-      <w:pPr>
-        <w:spacing w:after="60"/>
-      </w:pPr>
-      <w:r>
-        <w:rPr>
-          <w:rFonts w:ascii="Roboto" w:cs="Roboto" w:eastAsia="Roboto" w:hAnsi="Roboto"/>
-          <w:b/>
-          <w:bCs/>
-          <w:color w:val="535B50"/>
-          <w:sz w:val="20"/>
-          <w:szCs w:val="20"/>
-        </w:rPr>
-        <w:t xml:space="preserve">Interpretation: </w:t>
-      </w:r>
-      <w:r>
-        <w:rPr>
-          <w:rFonts w:ascii="Roboto" w:cs="Roboto" w:eastAsia="Roboto" w:hAnsi="Roboto"/>
-          <w:color w:val="000000"/>
-          <w:sz w:val="20"/>
-          <w:szCs w:val="20"/>
-        </w:rPr>
-        <w:t xml:space="preserve">Within reference.</w:t>
+        <w:t xml:space="preserve">Within reference range — overt B12 functional insufficiency not evident.</w:t>
+      </w:r>
+    </w:p>
+    <w:p>
+      <w:pPr>
+        <w:spacing w:after="60"/>
+      </w:pPr>
+      <w:r>
+        <w:rPr>
+          <w:rFonts w:ascii="Roboto" w:cs="Roboto" w:eastAsia="Roboto" w:hAnsi="Roboto"/>
+          <w:b/>
+          <w:bCs/>
+          <w:color w:val="535B50"/>
+          <w:sz w:val="20"/>
+          <w:szCs w:val="20"/>
+        </w:rPr>
+        <w:t xml:space="preserve">Possible contributors: </w:t>
+      </w:r>
+      <w:r>
+        <w:rPr>
+          <w:rFonts w:ascii="Roboto" w:cs="Roboto" w:eastAsia="Roboto" w:hAnsi="Roboto"/>
+          <w:color w:val="000000"/>
+          <w:sz w:val="20"/>
+          <w:szCs w:val="20"/>
+        </w:rPr>
+        <w:t xml:space="preserve">n/a</w:t>
+      </w:r>
+    </w:p>
+    <w:p>
+      <w:pPr>
+        <w:spacing w:after="60"/>
+      </w:pPr>
+      <w:r>
+        <w:rPr>
+          <w:rFonts w:ascii="Roboto" w:cs="Roboto" w:eastAsia="Roboto" w:hAnsi="Roboto"/>
+          <w:b/>
+          <w:bCs/>
+          <w:color w:val="535B50"/>
+          <w:sz w:val="20"/>
+          <w:szCs w:val="20"/>
+        </w:rPr>
+        <w:t xml:space="preserve">Relevance to formulation: </w:t>
+      </w:r>
+      <w:r>
+        <w:rPr>
+          <w:rFonts w:ascii="Roboto" w:cs="Roboto" w:eastAsia="Roboto" w:hAnsi="Roboto"/>
+          <w:color w:val="000000"/>
+          <w:sz w:val="20"/>
+          <w:szCs w:val="20"/>
+        </w:rPr>
+        <w:t xml:space="preserve">Conservative B12 dose used.</w:t>
       </w:r>
     </w:p>
     <w:p>
@@ -3110,7 +4033,7 @@
           <w:sz w:val="22"/>
           <w:szCs w:val="22"/>
         </w:rPr>
-        <w:t xml:space="preserve">Environmental exposure review</w:t>
+        <w:t xml:space="preserve">xenobiotic_exposure_review</w:t>
       </w:r>
     </w:p>
     <w:p>
@@ -3135,7 +4058,7 @@
           <w:sz w:val="20"/>
           <w:szCs w:val="20"/>
         </w:rPr>
-        <w:t xml:space="preserve">The practitioner may wish to discuss with the patient possible sources of benzene/xylene exposure (fuel handling, paint/solvent use, vehicle exhaust, indoor air quality, cigarette smoke including passive) given the elevated t,t-muconic and methylhippuric markers.</w:t>
+        <w:t xml:space="preserve">The practitioner may wish to review with the patient potential sources of benzene (vehicle exhaust, smoking, certain solvents), xylene/toluene (paints, solvents), and paraben/phthalate exposure (cosmetics, personal care) given the OA pattern.</w:t>
       </w:r>
     </w:p>
     <w:p>
@@ -3160,7 +4083,7 @@
           <w:sz w:val="20"/>
           <w:szCs w:val="20"/>
         </w:rPr>
-        <w:t xml:space="preserve">Reducing the input is foundational; supplements support clearance but cannot offset ongoing exposure.</w:t>
+        <w:t xml:space="preserve">Elevated t,t-muconic, 3-methylhippuric, 4-HBA per published frameworks.</w:t>
       </w:r>
     </w:p>
     <w:p>
@@ -3176,7 +4099,7 @@
           <w:sz w:val="22"/>
           <w:szCs w:val="22"/>
         </w:rPr>
-        <w:t xml:space="preserve">Personal care / preservative review</w:t>
+        <w:t xml:space="preserve">dietary_review_processed_heated_foods</w:t>
       </w:r>
     </w:p>
     <w:p>
@@ -3201,7 +4124,7 @@
           <w:sz w:val="20"/>
           <w:szCs w:val="20"/>
         </w:rPr>
-        <w:t xml:space="preserve">Practitioner may wish to review cosmetic/personal care products and processed food intake for paraben and benzoate preservatives, given the elevated 4-HBA and benzoic acid markers.</w:t>
+        <w:t xml:space="preserve">Practitioner may wish to discuss reducing exposure to highly browned, caramelised or processed foods given elevated 5-hydroxymethyl-2-furoic acid.</w:t>
       </w:r>
     </w:p>
     <w:p>
@@ -3226,7 +4149,7 @@
           <w:sz w:val="20"/>
           <w:szCs w:val="20"/>
         </w:rPr>
-        <w:t xml:space="preserve">Possible contributing factor for practitioner consideration.</w:t>
+        <w:t xml:space="preserve">Per published OA interpretation frameworks.</w:t>
       </w:r>
     </w:p>
     <w:p>
@@ -3242,7 +4165,7 @@
           <w:sz w:val="22"/>
           <w:szCs w:val="22"/>
         </w:rPr>
-        <w:t xml:space="preserve">Dietary polyphenols and cruciferous vegetables</w:t>
+        <w:t xml:space="preserve">antioxidant_dense_diet</w:t>
       </w:r>
     </w:p>
     <w:p>
@@ -3267,7 +4190,7 @@
           <w:sz w:val="20"/>
           <w:szCs w:val="20"/>
         </w:rPr>
-        <w:t xml:space="preserve">Practitioner may wish to discuss inclusion of cruciferous vegetables (broccoli, kale, brussels sprouts) and polyphenol-rich foods to support endogenous Phase II / Nrf2 pathways.</w:t>
+        <w:t xml:space="preserve">Practitioner may wish to discuss a diet rich in cruciferous vegetables, berries, green tea, and sulphur-rich foods (Allium spp.) to support endogenous antioxidant and Phase II detoxification capacity.</w:t>
       </w:r>
     </w:p>
     <w:p>
@@ -3292,7 +4215,7 @@
           <w:sz w:val="20"/>
           <w:szCs w:val="20"/>
         </w:rPr>
-        <w:t xml:space="preserve">Supports the same pathways targeted by the proposed formulation.</w:t>
+        <w:t xml:space="preserve">Elevated 8-OHdG and xenobiotic markers.</w:t>
       </w:r>
     </w:p>
     <w:p>
@@ -3308,7 +4231,7 @@
           <w:sz w:val="22"/>
           <w:szCs w:val="22"/>
         </w:rPr>
-        <w:t xml:space="preserve">Hydration and renal clearance</w:t>
+        <w:t xml:space="preserve">hydration_and_kidney_clearance</w:t>
       </w:r>
     </w:p>
     <w:p>
@@ -3333,7 +4256,7 @@
           <w:sz w:val="20"/>
           <w:szCs w:val="20"/>
         </w:rPr>
-        <w:t xml:space="preserve">Adequate hydration supports urinary clearance of conjugated xenobiotics.</w:t>
+        <w:t xml:space="preserve">Adequate hydration supports renal clearance of conjugated xenobiotics — practitioner discretion.</w:t>
       </w:r>
     </w:p>
     <w:p>
@@ -3358,139 +4281,7 @@
           <w:sz w:val="20"/>
           <w:szCs w:val="20"/>
         </w:rPr>
-        <w:t xml:space="preserve">Routine supportive consideration.</w:t>
-      </w:r>
-    </w:p>
-    <w:p>
-      <w:pPr>
-        <w:spacing w:after="60" w:before="120"/>
-      </w:pPr>
-      <w:r>
-        <w:rPr>
-          <w:rFonts w:ascii="Roboto" w:cs="Roboto" w:eastAsia="Roboto" w:hAnsi="Roboto"/>
-          <w:b/>
-          <w:bCs/>
-          <w:color w:val="535B50"/>
-          <w:sz w:val="22"/>
-          <w:szCs w:val="22"/>
-        </w:rPr>
-        <w:t xml:space="preserve">Tryptophan / protein adequacy</w:t>
-      </w:r>
-    </w:p>
-    <w:p>
-      <w:pPr>
-        <w:spacing w:after="60"/>
-      </w:pPr>
-      <w:r>
-        <w:rPr>
-          <w:rFonts w:ascii="Roboto" w:cs="Roboto" w:eastAsia="Roboto" w:hAnsi="Roboto"/>
-          <w:b/>
-          <w:bCs/>
-          <w:color w:val="535B50"/>
-          <w:sz w:val="20"/>
-          <w:szCs w:val="20"/>
-        </w:rPr>
-        <w:t xml:space="preserve">Consideration: </w:t>
-      </w:r>
-      <w:r>
-        <w:rPr>
-          <w:rFonts w:ascii="Roboto" w:cs="Roboto" w:eastAsia="Roboto" w:hAnsi="Roboto"/>
-          <w:color w:val="000000"/>
-          <w:sz w:val="20"/>
-          <w:szCs w:val="20"/>
-        </w:rPr>
-        <w:t xml:space="preserve">Given the kynurenine shunt and low 5-HIAA, practitioner may wish to consider whether dietary tryptophan / protein adequacy and inflammation context need addressing alongside formulation.</w:t>
-      </w:r>
-    </w:p>
-    <w:p>
-      <w:pPr>
-        <w:spacing w:after="60"/>
-      </w:pPr>
-      <w:r>
-        <w:rPr>
-          <w:rFonts w:ascii="Roboto" w:cs="Roboto" w:eastAsia="Roboto" w:hAnsi="Roboto"/>
-          <w:b/>
-          <w:bCs/>
-          <w:color w:val="535B50"/>
-          <w:sz w:val="20"/>
-          <w:szCs w:val="20"/>
-        </w:rPr>
-        <w:t xml:space="preserve">Rationale: </w:t>
-      </w:r>
-      <w:r>
-        <w:rPr>
-          <w:rFonts w:ascii="Roboto" w:cs="Roboto" w:eastAsia="Roboto" w:hAnsi="Roboto"/>
-          <w:color w:val="000000"/>
-          <w:sz w:val="20"/>
-          <w:szCs w:val="20"/>
-        </w:rPr>
-        <w:t xml:space="preserve">Pattern consistent with inflammation-driven IDO activation; addressing the inflammatory driver supports the downstream marker.</w:t>
-      </w:r>
-    </w:p>
-    <w:p>
-      <w:pPr>
-        <w:spacing w:after="60" w:before="120"/>
-      </w:pPr>
-      <w:r>
-        <w:rPr>
-          <w:rFonts w:ascii="Roboto" w:cs="Roboto" w:eastAsia="Roboto" w:hAnsi="Roboto"/>
-          <w:b/>
-          <w:bCs/>
-          <w:color w:val="535B50"/>
-          <w:sz w:val="22"/>
-          <w:szCs w:val="22"/>
-        </w:rPr>
-        <w:t xml:space="preserve">Sleep and stress hygiene</w:t>
-      </w:r>
-    </w:p>
-    <w:p>
-      <w:pPr>
-        <w:spacing w:after="60"/>
-      </w:pPr>
-      <w:r>
-        <w:rPr>
-          <w:rFonts w:ascii="Roboto" w:cs="Roboto" w:eastAsia="Roboto" w:hAnsi="Roboto"/>
-          <w:b/>
-          <w:bCs/>
-          <w:color w:val="535B50"/>
-          <w:sz w:val="20"/>
-          <w:szCs w:val="20"/>
-        </w:rPr>
-        <w:t xml:space="preserve">Consideration: </w:t>
-      </w:r>
-      <w:r>
-        <w:rPr>
-          <w:rFonts w:ascii="Roboto" w:cs="Roboto" w:eastAsia="Roboto" w:hAnsi="Roboto"/>
-          <w:color w:val="000000"/>
-          <w:sz w:val="20"/>
-          <w:szCs w:val="20"/>
-        </w:rPr>
-        <w:t xml:space="preserve">Given mitochondrial and oxidative stress patterns, sleep and stress-load review for practitioner discussion.</w:t>
-      </w:r>
-    </w:p>
-    <w:p>
-      <w:pPr>
-        <w:spacing w:after="60"/>
-      </w:pPr>
-      <w:r>
-        <w:rPr>
-          <w:rFonts w:ascii="Roboto" w:cs="Roboto" w:eastAsia="Roboto" w:hAnsi="Roboto"/>
-          <w:b/>
-          <w:bCs/>
-          <w:color w:val="535B50"/>
-          <w:sz w:val="20"/>
-          <w:szCs w:val="20"/>
-        </w:rPr>
-        <w:t xml:space="preserve">Rationale: </w:t>
-      </w:r>
-      <w:r>
-        <w:rPr>
-          <w:rFonts w:ascii="Roboto" w:cs="Roboto" w:eastAsia="Roboto" w:hAnsi="Roboto"/>
-          <w:color w:val="000000"/>
-          <w:sz w:val="20"/>
-          <w:szCs w:val="20"/>
-        </w:rPr>
-        <w:t xml:space="preserve">Supportive context for mitochondrial recovery.</w:t>
+        <w:t xml:space="preserve">Supports Phase II conjugate elimination.</w:t>
       </w:r>
     </w:p>
     <w:p>
@@ -3541,7 +4332,7 @@
           <w:sz w:val="22"/>
           <w:szCs w:val="22"/>
         </w:rPr>
-        <w:t xml:space="preserve">Five-axis allocation: (1) anti-inflammatory core targeting NF-κB and 5-LOX (curcumin + boswellia + quercetin + resveratrol) for the leukotriene/8-OHdG/IDO-driven inflammation; (2) antioxidant/redox + xenobiotic Phase II (NAC, milk thistle, calcium D-glucarate, vitamin C) for the benzene/xylene/paraben pattern and pyroglutamic top-of-range; (3) mitochondrial/cardiovascular (CoQ10, alpha-lipoic acid) for the TCA accumulation pattern and elevated mevalonolactone; (4) B-vitamins/methylation (P5P, methylcobalamin, riboflavin) for the kynurenine pathway P5P demand and α-KGDH cofactor demand — P5P is foundational given xanthurenic elevation; (5) gastrointestinal/minerals (berberine, zinc citrate) for the dysbiosis pattern and broad cofactor support. Six-step procedure executed: areas ranked; foundationals placed at ≥75% clinical dose for primary/secondary axes (curcumin, NAC, milk thistle, CoQ10, P5P, berberine); layer pass cycled in priority order adding boswellia, calcium D-glucarate, alpha-lipoic acid, methylcobalamin, quercetin, resveratrol, vitamin C, riboflavin, zinc citrate; final ingredient backed out to land within 710-granule budget.</w:t>
+        <w:t xml:space="preserve">Six therapeutic axes are activated. Axis allocation (planned, ~700 granule target): antioxidant/redox + heavy/xenobiotic-detox combined ~210g (anchored on NAC + milk thistle + Cal D-glucarate + vitamin C + resveratrol); mitochondrial/cardiovascular ~120g (CoQ10 + alpha-lipoic acid); anti-inflammatory core ~150g (turmeric + boswellia + quercetin); B-vitamins/methylation ~80g (methyl-B12 + calcium folinate + P5P + B2); vitamin D/C bridge ~30g; minerals (magnesium glycinate) ~60g; with the granule budget concentrated on conjugation + redox given the xenobiotic-burdened pattern is the dominant signal. Step-3 foundational pass: NAC, milk thistle, CoQ10, turmeric, methylcobalamin, P5P, magnesium glycinate, Cal D-glucarate. Step 4 layered: vitamin C, ascorbic-supportive resveratrol, alpha-lipoic acid, quercetin, boswellia, B2, calcium folinate, vitamin D3. Step 5: last ingredient back-out applied to keep total ≤700.</w:t>
       </w:r>
     </w:p>
     <w:p>
@@ -3582,7 +4373,7 @@
           <w:sz w:val="20"/>
           <w:szCs w:val="20"/>
         </w:rPr>
-        <w:t xml:space="preserve">Curcumin (turmeric extract): NF-κB-directed foundational anti-inflammatory for leukotriene/8-OHdG inflammation pattern; published RCT evidence base.</w:t>
+        <w:t xml:space="preserve">NAC — anchors antioxidant axis + glutathione precursor for xenobiotic conjugation (8-OHdG, t,t-muconic, pyroglutamic).</w:t>
       </w:r>
     </w:p>
     <w:p>
@@ -3607,7 +4398,7 @@
           <w:sz w:val="20"/>
           <w:szCs w:val="20"/>
         </w:rPr>
-        <w:t xml:space="preserve">Boswellia: 5-LOX inhibitor mechanism directly relevant to elevated leukotriene E4.</w:t>
+        <w:t xml:space="preserve">Milk thistle (silymarin) — Phase II Nrf2 upregulation + hepatoprotection for xenobiotic burden.</w:t>
       </w:r>
     </w:p>
     <w:p>
@@ -3632,7 +4423,7 @@
           <w:sz w:val="20"/>
           <w:szCs w:val="20"/>
         </w:rPr>
-        <w:t xml:space="preserve">Quercetin: layer anti-inflammatory + mast cell stabilising + buffering of microbial polyphenol metabolites pattern.</w:t>
+        <w:t xml:space="preserve">Calcium D-glucarate — glucuronidation support for paraben/phthalate/xenobiotic conjugation.</w:t>
       </w:r>
     </w:p>
     <w:p>
@@ -3657,7 +4448,7 @@
           <w:sz w:val="20"/>
           <w:szCs w:val="20"/>
         </w:rPr>
-        <w:t xml:space="preserve">Resveratrol: SIRT/Nrf2 axis and antioxidant support given 8-OHdG elevation; capped at 150 mg per Library regulatory limit.</w:t>
+        <w:t xml:space="preserve">Vitamin C (ascorbic acid) — antioxidant load aligned with 8-OHdG elevation.</w:t>
       </w:r>
     </w:p>
     <w:p>
@@ -3682,7 +4473,7 @@
           <w:sz w:val="20"/>
           <w:szCs w:val="20"/>
         </w:rPr>
-        <w:t xml:space="preserve">NAC: glutathione precursor — central to xenobiotic/benzene Phase II support and the pyroglutamic top-of-range pattern.</w:t>
+        <w:t xml:space="preserve">Resveratrol — Nrf2/sirtuin antioxidant adjunct.</w:t>
       </w:r>
     </w:p>
     <w:p>
@@ -3707,7 +4498,7 @@
           <w:sz w:val="20"/>
           <w:szCs w:val="20"/>
         </w:rPr>
-        <w:t xml:space="preserve">Milk thistle (silymarin): Nrf2-mediated Phase II upregulation and hepatic Phase II conjugation support given xenobiotic load.</w:t>
+        <w:t xml:space="preserve">Turmeric (curcumin) — NF-κB anchor for inflammatory/leukotriene activity.</w:t>
       </w:r>
     </w:p>
     <w:p>
@@ -3732,7 +4523,7 @@
           <w:sz w:val="20"/>
           <w:szCs w:val="20"/>
         </w:rPr>
-        <w:t xml:space="preserve">Calcium D-glucarate: glucuronidation support given the benzene/paraben pattern; well-tolerated at moderate dose.</w:t>
+        <w:t xml:space="preserve">Boswellia — 5-LOX coverage given LTE4 elevation.</w:t>
       </w:r>
     </w:p>
     <w:p>
@@ -3757,7 +4548,7 @@
           <w:sz w:val="20"/>
           <w:szCs w:val="20"/>
         </w:rPr>
-        <w:t xml:space="preserve">Vitamin C: aqueous antioxidant supporting redox and Phase I/II balance.</w:t>
+        <w:t xml:space="preserve">Quercetin — mast-cell stabilising/anti-inflammatory complement to LTE4 elevation.</w:t>
       </w:r>
     </w:p>
     <w:p>
@@ -3782,7 +4573,7 @@
           <w:sz w:val="20"/>
           <w:szCs w:val="20"/>
         </w:rPr>
-        <w:t xml:space="preserve">CoQ10: mitochondrial electron transport support given mevalonolactone elevation and TCA accumulation.</w:t>
+        <w:t xml:space="preserve">CoQ10 — mitochondrial electron transport + mevalonate pathway support.</w:t>
       </w:r>
     </w:p>
     <w:p>
@@ -3807,7 +4598,7 @@
           <w:sz w:val="20"/>
           <w:szCs w:val="20"/>
         </w:rPr>
-        <w:t xml:space="preserve">Alpha-lipoic acid: cofactor for α-KGDH and pyruvate dehydrogenase complexes, directly relevant to 2-oxoglutaric elevation; redox-active.</w:t>
+        <w:t xml:space="preserve">Alpha-lipoic acid — TCA dehydrogenase cofactor and antioxidant/heavy-metal buffering.</w:t>
       </w:r>
     </w:p>
     <w:p>
@@ -3832,7 +4623,7 @@
           <w:sz w:val="20"/>
           <w:szCs w:val="20"/>
         </w:rPr>
-        <w:t xml:space="preserve">Pyridoxal 5-phosphate (P5P): foundational for kynurenine pathway redirection — xanthurenic elevation indicates functional B6 demand.</w:t>
+        <w:t xml:space="preserve">Methylcobalamin — methylation cycle support given guanidinoacetic, KMBA, 5-methylcytosine elevation.</w:t>
       </w:r>
     </w:p>
     <w:p>
@@ -3857,7 +4648,7 @@
           <w:sz w:val="20"/>
           <w:szCs w:val="20"/>
         </w:rPr>
-        <w:t xml:space="preserve">Methylcobalamin: methylation cofactor support; supports overall methyl-pool given KMBA and guanidinoacetic elevation.</w:t>
+        <w:t xml:space="preserve">Calcium folinate — folate cycle cofactor for one-carbon support.</w:t>
       </w:r>
     </w:p>
     <w:p>
@@ -3882,7 +4673,7 @@
           <w:sz w:val="20"/>
           <w:szCs w:val="20"/>
         </w:rPr>
-        <w:t xml:space="preserve">Riboflavin: cofactor for α-KGDH (FAD-dependent) and for B6 activation.</w:t>
+        <w:t xml:space="preserve">Pyridoxal-5-phosphate (P5P) — anchors kynurenine pathway support given xanthurenic elevation.</w:t>
       </w:r>
     </w:p>
     <w:p>
@@ -3907,7 +4698,7 @@
           <w:sz w:val="20"/>
           <w:szCs w:val="20"/>
         </w:rPr>
-        <w:t xml:space="preserve">Berberine: gastrointestinal axis support given the dysbiosis fingerprint (arabinose, furan derivatives, microbial polyphenol metabolites).</w:t>
+        <w:t xml:space="preserve">Riboflavin (B2) — FAD cofactor for kynurenine monooxygenase and mitochondrial flavoproteins.</w:t>
       </w:r>
     </w:p>
     <w:p>
@@ -3932,7 +4723,32 @@
           <w:sz w:val="20"/>
           <w:szCs w:val="20"/>
         </w:rPr>
-        <w:t xml:space="preserve">Zinc citrate: broad cofactor support including immune modulation and IDO-pathway context; modest dose.</w:t>
+        <w:t xml:space="preserve">Magnesium glycinate — broad mitochondrial/methylation cofactor; glycine moiety contributes incidentally to conjugation pathway support.</w:t>
+      </w:r>
+    </w:p>
+    <w:p>
+      <w:pPr>
+        <w:spacing w:after="60"/>
+      </w:pPr>
+      <w:r>
+        <w:rPr>
+          <w:rFonts w:ascii="Roboto" w:cs="Roboto" w:eastAsia="Roboto" w:hAnsi="Roboto"/>
+          <w:b/>
+          <w:bCs/>
+          <w:color w:val="C3AF88"/>
+          <w:sz w:val="22"/>
+          <w:szCs w:val="22"/>
+        </w:rPr>
+        <w:t xml:space="preserve">• </w:t>
+      </w:r>
+      <w:r>
+        <w:rPr>
+          <w:rFonts w:ascii="Roboto" w:cs="Roboto" w:eastAsia="Roboto" w:hAnsi="Roboto"/>
+          <w:color w:val="000000"/>
+          <w:sz w:val="20"/>
+          <w:szCs w:val="20"/>
+        </w:rPr>
+        <w:t xml:space="preserve">Vitamin D3 — included at conservative dose for general repletion alongside other foundational nutrients.</w:t>
       </w:r>
     </w:p>
     <w:p>
@@ -3973,7 +4789,7 @@
           <w:sz w:val="20"/>
           <w:szCs w:val="20"/>
         </w:rPr>
-        <w:t xml:space="preserve">Iron-containing ingredients — Not indicated by the panel; OA panel does not show iron deficiency markers; standard precaution against unnecessary iron in an inflammatory-pattern patient.</w:t>
+        <w:t xml:space="preserve">Iron (W040001000) — No indication of iron deficiency on the OA panel; standard contraindication consideration in adult female without ferritin data — not added.</w:t>
       </w:r>
     </w:p>
     <w:p>
@@ -3998,7 +4814,7 @@
           <w:sz w:val="20"/>
           <w:szCs w:val="20"/>
         </w:rPr>
-        <w:t xml:space="preserve">High-dose vitamin A (retinol) — Not indicated by panel findings; would add load without clear rationale.</w:t>
+        <w:t xml:space="preserve">Iodine (W030014000) — Panel does not indicate thyroid axis driver; not prioritised within the granule budget.</w:t>
       </w:r>
     </w:p>
     <w:p>
@@ -4023,7 +4839,7 @@
           <w:sz w:val="20"/>
           <w:szCs w:val="20"/>
         </w:rPr>
-        <w:t xml:space="preserve">Selenium — Panel does not provide red-cell or whole-blood selenium status — not indicated without baseline. Practitioner may consider separately if clinical context supports.</w:t>
+        <w:t xml:space="preserve">5-HTP (W130002000) — Serotonin metabolite (5-HIAA) within range; without medication context to rule out serotonergic interactions, deprioritised — surfaced for practitioner review only.</w:t>
       </w:r>
     </w:p>
     <w:p>
@@ -4048,7 +4864,7 @@
           <w:sz w:val="20"/>
           <w:szCs w:val="20"/>
         </w:rPr>
-        <w:t xml:space="preserve">5-HTP — Low 5-HIAA pattern present, but in the absence of practitioner clinical notes confirming the absence of serotonergic medications, conservative practice is to defer to practitioner. Surfaced as a standalone consideration.</w:t>
+        <w:t xml:space="preserve">Selenium — Red-cell selenium not measured; conservative omission within budget constraints.</w:t>
       </w:r>
     </w:p>
     <w:p>
@@ -4073,7 +4889,7 @@
           <w:sz w:val="20"/>
           <w:szCs w:val="20"/>
         </w:rPr>
-        <w:t xml:space="preserve">Iodine — Not indicated by this panel; no thyroid context provided.</w:t>
+        <w:t xml:space="preserve">Copper — Cu:Zn data not provided; binding-exclusion safety floor applied (omit copper when status unknown alongside redox stress).</w:t>
       </w:r>
     </w:p>
     <w:p>
@@ -4098,7 +4914,82 @@
           <w:sz w:val="20"/>
           <w:szCs w:val="20"/>
         </w:rPr>
-        <w:t xml:space="preserve">Copper — No Cu:Zn data provided; precautionary exclusion given zinc inclusion. Avoids any inadvertent copper loading.</w:t>
+        <w:t xml:space="preserve">L-Carnitine — Not present in supplied Library; surfaced as standalone given adipic acid elevation.</w:t>
+      </w:r>
+    </w:p>
+    <w:p>
+      <w:pPr>
+        <w:spacing w:after="60"/>
+      </w:pPr>
+      <w:r>
+        <w:rPr>
+          <w:rFonts w:ascii="Roboto" w:cs="Roboto" w:eastAsia="Roboto" w:hAnsi="Roboto"/>
+          <w:b/>
+          <w:bCs/>
+          <w:color w:val="C3AF88"/>
+          <w:sz w:val="22"/>
+          <w:szCs w:val="22"/>
+        </w:rPr>
+        <w:t xml:space="preserve">• </w:t>
+      </w:r>
+      <w:r>
+        <w:rPr>
+          <w:rFonts w:ascii="Roboto" w:cs="Roboto" w:eastAsia="Roboto" w:hAnsi="Roboto"/>
+          <w:color w:val="000000"/>
+          <w:sz w:val="20"/>
+          <w:szCs w:val="20"/>
+        </w:rPr>
+        <w:t xml:space="preserve">Glycine — Not present in supplied Library; surfaced as standalone given prominent benzoate/xylene conjugation findings.</w:t>
+      </w:r>
+    </w:p>
+    <w:p>
+      <w:pPr>
+        <w:spacing w:after="60"/>
+      </w:pPr>
+      <w:r>
+        <w:rPr>
+          <w:rFonts w:ascii="Roboto" w:cs="Roboto" w:eastAsia="Roboto" w:hAnsi="Roboto"/>
+          <w:b/>
+          <w:bCs/>
+          <w:color w:val="C3AF88"/>
+          <w:sz w:val="22"/>
+          <w:szCs w:val="22"/>
+        </w:rPr>
+        <w:t xml:space="preserve">• </w:t>
+      </w:r>
+      <w:r>
+        <w:rPr>
+          <w:rFonts w:ascii="Roboto" w:cs="Roboto" w:eastAsia="Roboto" w:hAnsi="Roboto"/>
+          <w:color w:val="000000"/>
+          <w:sz w:val="20"/>
+          <w:szCs w:val="20"/>
+        </w:rPr>
+        <w:t xml:space="preserve">EPA/DHA omega-3 — Not present in supplied granule Library; surfaced as standalone given LTE4 elevation.</w:t>
+      </w:r>
+    </w:p>
+    <w:p>
+      <w:pPr>
+        <w:spacing w:after="60"/>
+      </w:pPr>
+      <w:r>
+        <w:rPr>
+          <w:rFonts w:ascii="Roboto" w:cs="Roboto" w:eastAsia="Roboto" w:hAnsi="Roboto"/>
+          <w:b/>
+          <w:bCs/>
+          <w:color w:val="C3AF88"/>
+          <w:sz w:val="22"/>
+          <w:szCs w:val="22"/>
+        </w:rPr>
+        <w:t xml:space="preserve">• </w:t>
+      </w:r>
+      <w:r>
+        <w:rPr>
+          <w:rFonts w:ascii="Roboto" w:cs="Roboto" w:eastAsia="Roboto" w:hAnsi="Roboto"/>
+          <w:color w:val="000000"/>
+          <w:sz w:val="20"/>
+          <w:szCs w:val="20"/>
+        </w:rPr>
+        <w:t xml:space="preserve">Specific probiotic strains — Not in supplied Library as granule products; surfaced as standalone given modest dysbiosis markers.</w:t>
       </w:r>
     </w:p>
     <w:p>
@@ -4165,7 +5056,7 @@
           <w:sz w:val="22"/>
           <w:szCs w:val="22"/>
         </w:rPr>
-        <w:t xml:space="preserve">4 contraindication or interaction consideration(s) raised for practitioner review.</w:t>
+        <w:t xml:space="preserve">6 contraindication or interaction consideration(s) raised for practitioner review.</w:t>
       </w:r>
     </w:p>
     <w:tbl>
@@ -4372,7 +5263,7 @@
                 <w:sz w:val="20"/>
                 <w:szCs w:val="20"/>
               </w:rPr>
-              <w:t xml:space="preserve">medication_context_not_provided</w:t>
+              <w:t xml:space="preserve">no_medication_list_provided</w:t>
             </w:r>
           </w:p>
         </w:tc>
@@ -4402,7 +5293,7 @@
                 <w:sz w:val="20"/>
                 <w:szCs w:val="20"/>
               </w:rPr>
-              <w:t xml:space="preserve">No medication list was supplied with the submission. Standard checks have been run against the proposed ingredients alone. Specifically: 5-HTP excluded pending serotonergic medication review; curcumin and resveratrol carry bleeding-risk caveats with anticoagulants; berberine has CYP3A4/CYP2D6 interaction potential and additive glucose-lowering risk; vitamin C caution with haemochromatosis.</w:t>
+              <w:t xml:space="preserve">Clinical notes did not list current medications. Standard contraindication screens (5-HTP with serotonergics; berberine with glucose-lowering agents; curcumin/resveratrol with anticoagulants; magnesium with antibiotics/bisphosphonates; St John's Wort with multiple meds) were therefore applied to the formulation in the abstract. 5-HTP and berberine were not included in this formulation. Curcumin, resveratrol and magnesium have been included — practitioner to verify against the patient's full medication list.</w:t>
             </w:r>
           </w:p>
         </w:tc>
@@ -4464,7 +5355,7 @@
                 <w:sz w:val="20"/>
                 <w:szCs w:val="20"/>
               </w:rPr>
-              <w:t xml:space="preserve">monitor</w:t>
+              <w:t xml:space="preserve">not_applicable</w:t>
             </w:r>
           </w:p>
         </w:tc>
@@ -4494,7 +5385,7 @@
                 <w:sz w:val="20"/>
                 <w:szCs w:val="20"/>
               </w:rPr>
-              <w:t xml:space="preserve">B6_neuropathy_monitoring</w:t>
+              <w:t xml:space="preserve">iodine_thyroid_antibody_status_not_provided</w:t>
             </w:r>
           </w:p>
         </w:tc>
@@ -4524,7 +5415,7 @@
                 <w:sz w:val="20"/>
                 <w:szCs w:val="20"/>
               </w:rPr>
-              <w:t xml:space="preserve">P5P 15 mg supplied in pod is well below the 50 mg neuropathy-caution threshold, but practitioner should be aware of cumulative B6 intake from all sources and review for any sensory symptoms.</w:t>
+              <w:t xml:space="preserve">Iodine was not included in this formulation; antibody status not relevant for this submission.</w:t>
             </w:r>
           </w:p>
         </w:tc>
@@ -4586,7 +5477,7 @@
                 <w:sz w:val="20"/>
                 <w:szCs w:val="20"/>
               </w:rPr>
-              <w:t xml:space="preserve">monitor</w:t>
+              <w:t xml:space="preserve">applied</w:t>
             </w:r>
           </w:p>
         </w:tc>
@@ -4616,7 +5507,7 @@
                 <w:sz w:val="20"/>
                 <w:szCs w:val="20"/>
               </w:rPr>
-              <w:t xml:space="preserve">zinc_copper_ratio_monitoring</w:t>
+              <w:t xml:space="preserve">selenium_red_cell_status_not_provided</w:t>
             </w:r>
           </w:p>
         </w:tc>
@@ -4646,7 +5537,7 @@
                 <w:sz w:val="20"/>
                 <w:szCs w:val="20"/>
               </w:rPr>
-              <w:t xml:space="preserve">Zinc citrate ~25 mg elemental included; copper precautionarily excluded. If zinc supplementation continues beyond 3 months, practitioner may wish to monitor copper status.</w:t>
+              <w:t xml:space="preserve">Selenium omitted in the absence of red-cell selenium data — system safety floor.</w:t>
             </w:r>
           </w:p>
         </w:tc>
@@ -4676,7 +5567,8 @@
                 <w:sz w:val="20"/>
                 <w:szCs w:val="20"/>
               </w:rPr>
-              <w:t xml:space="preserve">—</w:t>
+              <w:t xml:space="preserve">Selenium
+(Selenomethionine)</w:t>
             </w:r>
           </w:p>
         </w:tc>
@@ -4704,11 +5596,11 @@
                 <w:rFonts w:ascii="Roboto" w:cs="Roboto" w:eastAsia="Roboto" w:hAnsi="Roboto"/>
                 <w:b/>
                 <w:bCs/>
-                <w:color w:val="C3AF88"/>
+                <w:color w:val="666666"/>
                 <w:sz w:val="20"/>
                 <w:szCs w:val="20"/>
               </w:rPr>
-              <w:t xml:space="preserve">moderate</w:t>
+              <w:t xml:space="preserve">applied</w:t>
             </w:r>
           </w:p>
         </w:tc>
@@ -4738,7 +5630,7 @@
                 <w:sz w:val="20"/>
                 <w:szCs w:val="20"/>
               </w:rPr>
-              <w:t xml:space="preserve">berberine_glucose_and_pregnancy</w:t>
+              <w:t xml:space="preserve">copper_status_not_provided</w:t>
             </w:r>
           </w:p>
         </w:tc>
@@ -4768,7 +5660,251 @@
                 <w:sz w:val="20"/>
                 <w:szCs w:val="20"/>
               </w:rPr>
-              <w:t xml:space="preserve">Berberine contraindicated in pregnancy; additive effect with glucose-lowering medications; CYP3A4/CYP2D6 interaction potential.</w:t>
+              <w:t xml:space="preserve">Copper omitted in the absence of Cu:Zn status data — system safety floor.</w:t>
+            </w:r>
+          </w:p>
+        </w:tc>
+        <w:tc>
+          <w:tcPr>
+            <w:tcW w:type="dxa" w:w="1624"/>
+            <w:tcBorders>
+              <w:top w:val="single" w:color="CCCCCC" w:sz="4"/>
+              <w:left w:val="single" w:color="CCCCCC" w:sz="4"/>
+              <w:bottom w:val="single" w:color="CCCCCC" w:sz="4"/>
+              <w:right w:val="single" w:color="CCCCCC" w:sz="4"/>
+            </w:tcBorders>
+            <w:tcMar>
+              <w:top w:type="dxa" w:w="100"/>
+              <w:left w:type="dxa" w:w="140"/>
+              <w:bottom w:type="dxa" w:w="100"/>
+              <w:right w:type="dxa" w:w="140"/>
+            </w:tcMar>
+          </w:tcPr>
+          <w:p>
+            <w:r>
+              <w:rPr>
+                <w:rFonts w:ascii="Roboto" w:cs="Roboto" w:eastAsia="Roboto" w:hAnsi="Roboto"/>
+                <w:b w:val="false"/>
+                <w:bCs w:val="false"/>
+                <w:color w:val="000000"/>
+                <w:sz w:val="20"/>
+                <w:szCs w:val="20"/>
+              </w:rPr>
+              <w:t xml:space="preserve">Copper gluconate</w:t>
+            </w:r>
+          </w:p>
+        </w:tc>
+      </w:tr>
+      <w:tr>
+        <w:tc>
+          <w:tcPr>
+            <w:tcW w:type="dxa" w:w="1263"/>
+            <w:tcBorders>
+              <w:top w:val="single" w:color="CCCCCC" w:sz="4"/>
+              <w:left w:val="single" w:color="CCCCCC" w:sz="4"/>
+              <w:bottom w:val="single" w:color="CCCCCC" w:sz="4"/>
+              <w:right w:val="single" w:color="CCCCCC" w:sz="4"/>
+            </w:tcBorders>
+            <w:tcMar>
+              <w:top w:type="dxa" w:w="100"/>
+              <w:left w:type="dxa" w:w="140"/>
+              <w:bottom w:type="dxa" w:w="100"/>
+              <w:right w:type="dxa" w:w="140"/>
+            </w:tcMar>
+          </w:tcPr>
+          <w:p>
+            <w:r>
+              <w:rPr>
+                <w:rFonts w:ascii="Roboto" w:cs="Roboto" w:eastAsia="Roboto" w:hAnsi="Roboto"/>
+                <w:b/>
+                <w:bCs/>
+                <w:color w:val="666666"/>
+                <w:sz w:val="20"/>
+                <w:szCs w:val="20"/>
+              </w:rPr>
+              <w:t xml:space="preserve">applied</w:t>
+            </w:r>
+          </w:p>
+        </w:tc>
+        <w:tc>
+          <w:tcPr>
+            <w:tcW w:type="dxa" w:w="1985"/>
+            <w:tcBorders>
+              <w:top w:val="single" w:color="CCCCCC" w:sz="4"/>
+              <w:left w:val="single" w:color="CCCCCC" w:sz="4"/>
+              <w:bottom w:val="single" w:color="CCCCCC" w:sz="4"/>
+              <w:right w:val="single" w:color="CCCCCC" w:sz="4"/>
+            </w:tcBorders>
+            <w:tcMar>
+              <w:top w:type="dxa" w:w="100"/>
+              <w:left w:type="dxa" w:w="140"/>
+              <w:bottom w:type="dxa" w:w="100"/>
+              <w:right w:type="dxa" w:w="140"/>
+            </w:tcMar>
+          </w:tcPr>
+          <w:p>
+            <w:r>
+              <w:rPr>
+                <w:rFonts w:ascii="Roboto" w:cs="Roboto" w:eastAsia="Roboto" w:hAnsi="Roboto"/>
+                <w:b w:val="false"/>
+                <w:bCs w:val="false"/>
+                <w:color w:val="000000"/>
+                <w:sz w:val="20"/>
+                <w:szCs w:val="20"/>
+              </w:rPr>
+              <w:t xml:space="preserve">iron_studies_not_provided</w:t>
+            </w:r>
+          </w:p>
+        </w:tc>
+        <w:tc>
+          <w:tcPr>
+            <w:tcW w:type="dxa" w:w="4151"/>
+            <w:tcBorders>
+              <w:top w:val="single" w:color="CCCCCC" w:sz="4"/>
+              <w:left w:val="single" w:color="CCCCCC" w:sz="4"/>
+              <w:bottom w:val="single" w:color="CCCCCC" w:sz="4"/>
+              <w:right w:val="single" w:color="CCCCCC" w:sz="4"/>
+            </w:tcBorders>
+            <w:tcMar>
+              <w:top w:type="dxa" w:w="100"/>
+              <w:left w:type="dxa" w:w="140"/>
+              <w:bottom w:type="dxa" w:w="100"/>
+              <w:right w:type="dxa" w:w="140"/>
+            </w:tcMar>
+          </w:tcPr>
+          <w:p>
+            <w:r>
+              <w:rPr>
+                <w:rFonts w:ascii="Roboto" w:cs="Roboto" w:eastAsia="Roboto" w:hAnsi="Roboto"/>
+                <w:b w:val="false"/>
+                <w:bCs w:val="false"/>
+                <w:color w:val="000000"/>
+                <w:sz w:val="20"/>
+                <w:szCs w:val="20"/>
+              </w:rPr>
+              <w:t xml:space="preserve">Iron omitted — no panel signal of deficiency and no iron studies supplied.</w:t>
+            </w:r>
+          </w:p>
+        </w:tc>
+        <w:tc>
+          <w:tcPr>
+            <w:tcW w:type="dxa" w:w="1624"/>
+            <w:tcBorders>
+              <w:top w:val="single" w:color="CCCCCC" w:sz="4"/>
+              <w:left w:val="single" w:color="CCCCCC" w:sz="4"/>
+              <w:bottom w:val="single" w:color="CCCCCC" w:sz="4"/>
+              <w:right w:val="single" w:color="CCCCCC" w:sz="4"/>
+            </w:tcBorders>
+            <w:tcMar>
+              <w:top w:type="dxa" w:w="100"/>
+              <w:left w:type="dxa" w:w="140"/>
+              <w:bottom w:type="dxa" w:w="100"/>
+              <w:right w:type="dxa" w:w="140"/>
+            </w:tcMar>
+          </w:tcPr>
+          <w:p>
+            <w:r>
+              <w:rPr>
+                <w:rFonts w:ascii="Roboto" w:cs="Roboto" w:eastAsia="Roboto" w:hAnsi="Roboto"/>
+                <w:b w:val="false"/>
+                <w:bCs w:val="false"/>
+                <w:color w:val="000000"/>
+                <w:sz w:val="20"/>
+                <w:szCs w:val="20"/>
+              </w:rPr>
+              <w:t xml:space="preserve">Iron bisglycinate</w:t>
+            </w:r>
+          </w:p>
+        </w:tc>
+      </w:tr>
+      <w:tr>
+        <w:tc>
+          <w:tcPr>
+            <w:tcW w:type="dxa" w:w="1263"/>
+            <w:tcBorders>
+              <w:top w:val="single" w:color="CCCCCC" w:sz="4"/>
+              <w:left w:val="single" w:color="CCCCCC" w:sz="4"/>
+              <w:bottom w:val="single" w:color="CCCCCC" w:sz="4"/>
+              <w:right w:val="single" w:color="CCCCCC" w:sz="4"/>
+            </w:tcBorders>
+            <w:tcMar>
+              <w:top w:type="dxa" w:w="100"/>
+              <w:left w:type="dxa" w:w="140"/>
+              <w:bottom w:type="dxa" w:w="100"/>
+              <w:right w:type="dxa" w:w="140"/>
+            </w:tcMar>
+          </w:tcPr>
+          <w:p>
+            <w:r>
+              <w:rPr>
+                <w:rFonts w:ascii="Roboto" w:cs="Roboto" w:eastAsia="Roboto" w:hAnsi="Roboto"/>
+                <w:b/>
+                <w:bCs/>
+                <w:color w:val="666666"/>
+                <w:sz w:val="20"/>
+                <w:szCs w:val="20"/>
+              </w:rPr>
+              <w:t xml:space="preserve">informational</w:t>
+            </w:r>
+          </w:p>
+        </w:tc>
+        <w:tc>
+          <w:tcPr>
+            <w:tcW w:type="dxa" w:w="1985"/>
+            <w:tcBorders>
+              <w:top w:val="single" w:color="CCCCCC" w:sz="4"/>
+              <w:left w:val="single" w:color="CCCCCC" w:sz="4"/>
+              <w:bottom w:val="single" w:color="CCCCCC" w:sz="4"/>
+              <w:right w:val="single" w:color="CCCCCC" w:sz="4"/>
+            </w:tcBorders>
+            <w:tcMar>
+              <w:top w:type="dxa" w:w="100"/>
+              <w:left w:type="dxa" w:w="140"/>
+              <w:bottom w:type="dxa" w:w="100"/>
+              <w:right w:type="dxa" w:w="140"/>
+            </w:tcMar>
+          </w:tcPr>
+          <w:p>
+            <w:r>
+              <w:rPr>
+                <w:rFonts w:ascii="Roboto" w:cs="Roboto" w:eastAsia="Roboto" w:hAnsi="Roboto"/>
+                <w:b w:val="false"/>
+                <w:bCs w:val="false"/>
+                <w:color w:val="000000"/>
+                <w:sz w:val="20"/>
+                <w:szCs w:val="20"/>
+              </w:rPr>
+              <w:t xml:space="preserve">age_over_50_female</w:t>
+            </w:r>
+          </w:p>
+        </w:tc>
+        <w:tc>
+          <w:tcPr>
+            <w:tcW w:type="dxa" w:w="4151"/>
+            <w:tcBorders>
+              <w:top w:val="single" w:color="CCCCCC" w:sz="4"/>
+              <w:left w:val="single" w:color="CCCCCC" w:sz="4"/>
+              <w:bottom w:val="single" w:color="CCCCCC" w:sz="4"/>
+              <w:right w:val="single" w:color="CCCCCC" w:sz="4"/>
+            </w:tcBorders>
+            <w:tcMar>
+              <w:top w:type="dxa" w:w="100"/>
+              <w:left w:type="dxa" w:w="140"/>
+              <w:bottom w:type="dxa" w:w="100"/>
+              <w:right w:type="dxa" w:w="140"/>
+            </w:tcMar>
+          </w:tcPr>
+          <w:p>
+            <w:r>
+              <w:rPr>
+                <w:rFonts w:ascii="Roboto" w:cs="Roboto" w:eastAsia="Roboto" w:hAnsi="Roboto"/>
+                <w:b w:val="false"/>
+                <w:bCs w:val="false"/>
+                <w:color w:val="000000"/>
+                <w:sz w:val="20"/>
+                <w:szCs w:val="20"/>
+              </w:rPr>
+              <w:t xml:space="preserve">Patient age 56 — within standard adult dosing; no soft escalation triggered (under 75).</w:t>
             </w:r>
           </w:p>
         </w:tc>
@@ -5038,7 +6174,7 @@
                 <w:sz w:val="20"/>
                 <w:szCs w:val="20"/>
               </w:rPr>
-              <w:t xml:space="preserve">Copper has been precautionarily excluded from the formulation given concurrent zinc inclusion and the absence of plasma copper / Cu:Zn ratio data on this panel. The practitioner may wish to monitor copper status if zinc supplementation continues beyond ~3 months.</w:t>
+              <w:t xml:space="preserve">Copper has been excluded as a precaution because copper status biomarkers were not supplied and the panel shows oxidative stress; per system safety floor, copper is not added without status data. Practitioner discretion if separately assessed.</w:t>
             </w:r>
           </w:p>
         </w:tc>
@@ -5130,7 +6266,7 @@
                 <w:sz w:val="20"/>
                 <w:szCs w:val="20"/>
               </w:rPr>
-              <w:t xml:space="preserve">Selenium has been deferred in the absence of selenium status data — for practitioner consideration if clinical context supports.</w:t>
+              <w:t xml:space="preserve">Selenium has been omitted in the absence of status data. The practitioner may wish to consider conservative dosing if separately assessed.</w:t>
             </w:r>
           </w:p>
         </w:tc>
@@ -5222,7 +6358,7 @@
                 <w:sz w:val="20"/>
                 <w:szCs w:val="20"/>
               </w:rPr>
-              <w:t xml:space="preserve">Iron has not been included given the absence of iron studies and the inflammatory pattern — practitioner to assess iron status separately.</w:t>
+              <w:t xml:space="preserve">Iron not included without iron status data.</w:t>
             </w:r>
           </w:p>
         </w:tc>
@@ -5260,7 +6396,7 @@
           <w:sz w:val="22"/>
           <w:szCs w:val="22"/>
         </w:rPr>
-        <w:t xml:space="preserve">A clinical follow-up timeframe is determined by the treating practitioner. Repeat OA testing at a clinically appropriate interval may be considered to track xenobiotic markers, kynurenine pathway ratios, and TCA cycle intermediates.</w:t>
+        <w:t xml:space="preserve">The practitioner may wish to consider re-testing key markers at a clinically appropriate interval to assess response, particularly the xenobiotic exposure markers (t,t-muconic, methylhippuric isomers, 4-HBA), the oxidative stress marker (8-OHdG), TCA flux markers (isocitric, 2-OG), kynurenine pathway (xanthurenic, quinolinic), and methylation markers (guanidinoacetic, 5-methylcytosine).</w:t>
       </w:r>
     </w:p>
     <w:p>
@@ -5301,7 +6437,7 @@
           <w:sz w:val="20"/>
           <w:szCs w:val="20"/>
         </w:rPr>
-        <w:t xml:space="preserve">t,t-Muconic acid and 3-methylhippuric acid (xenobiotic load)</w:t>
+        <w:t xml:space="preserve">8-hydroxy-deoxyguanosine</w:t>
       </w:r>
     </w:p>
     <w:p>
@@ -5326,7 +6462,7 @@
           <w:sz w:val="20"/>
           <w:szCs w:val="20"/>
         </w:rPr>
-        <w:t xml:space="preserve">Quinolinic, kynurenic, xanthurenic and 5-HIAA (kynurenine pathway and tryptophan handling)</w:t>
+        <w:t xml:space="preserve">Leukotriene E4</w:t>
       </w:r>
     </w:p>
     <w:p>
@@ -5351,7 +6487,7 @@
           <w:sz w:val="20"/>
           <w:szCs w:val="20"/>
         </w:rPr>
-        <w:t xml:space="preserve">Isocitric and 2-oxoglutaric (TCA cycle response)</w:t>
+        <w:t xml:space="preserve">t,t-Muconic Acid</w:t>
       </w:r>
     </w:p>
     <w:p>
@@ -5376,7 +6512,7 @@
           <w:sz w:val="20"/>
           <w:szCs w:val="20"/>
         </w:rPr>
-        <w:t xml:space="preserve">8-OHdG and Leukotriene E4 (inflammation and oxidative DNA damage)</w:t>
+        <w:t xml:space="preserve">3-Methylhippuric Acid</w:t>
       </w:r>
     </w:p>
     <w:p>
@@ -5401,7 +6537,7 @@
           <w:sz w:val="20"/>
           <w:szCs w:val="20"/>
         </w:rPr>
-        <w:t xml:space="preserve">Arabinose and dysbiosis markers (gut response)</w:t>
+        <w:t xml:space="preserve">4-Hydroxybenzoic Acid</w:t>
       </w:r>
     </w:p>
     <w:p>
@@ -5426,7 +6562,107 @@
           <w:sz w:val="20"/>
           <w:szCs w:val="20"/>
         </w:rPr>
-        <w:t xml:space="preserve">Pyroglutamic acid (glutathione cycling)</w:t>
+        <w:t xml:space="preserve">Isocitric Acid and 2-Oxoglutaric Acid</w:t>
+      </w:r>
+    </w:p>
+    <w:p>
+      <w:pPr>
+        <w:spacing w:after="60"/>
+      </w:pPr>
+      <w:r>
+        <w:rPr>
+          <w:rFonts w:ascii="Roboto" w:cs="Roboto" w:eastAsia="Roboto" w:hAnsi="Roboto"/>
+          <w:b/>
+          <w:bCs/>
+          <w:color w:val="C3AF88"/>
+          <w:sz w:val="22"/>
+          <w:szCs w:val="22"/>
+        </w:rPr>
+        <w:t xml:space="preserve">• </w:t>
+      </w:r>
+      <w:r>
+        <w:rPr>
+          <w:rFonts w:ascii="Roboto" w:cs="Roboto" w:eastAsia="Roboto" w:hAnsi="Roboto"/>
+          <w:color w:val="000000"/>
+          <w:sz w:val="20"/>
+          <w:szCs w:val="20"/>
+        </w:rPr>
+        <w:t xml:space="preserve">Quinolinic / Xanthurenic / Kynurenic</w:t>
+      </w:r>
+    </w:p>
+    <w:p>
+      <w:pPr>
+        <w:spacing w:after="60"/>
+      </w:pPr>
+      <w:r>
+        <w:rPr>
+          <w:rFonts w:ascii="Roboto" w:cs="Roboto" w:eastAsia="Roboto" w:hAnsi="Roboto"/>
+          <w:b/>
+          <w:bCs/>
+          <w:color w:val="C3AF88"/>
+          <w:sz w:val="22"/>
+          <w:szCs w:val="22"/>
+        </w:rPr>
+        <w:t xml:space="preserve">• </w:t>
+      </w:r>
+      <w:r>
+        <w:rPr>
+          <w:rFonts w:ascii="Roboto" w:cs="Roboto" w:eastAsia="Roboto" w:hAnsi="Roboto"/>
+          <w:color w:val="000000"/>
+          <w:sz w:val="20"/>
+          <w:szCs w:val="20"/>
+        </w:rPr>
+        <w:t xml:space="preserve">Guanidinoacetic Acid</w:t>
+      </w:r>
+    </w:p>
+    <w:p>
+      <w:pPr>
+        <w:spacing w:after="60"/>
+      </w:pPr>
+      <w:r>
+        <w:rPr>
+          <w:rFonts w:ascii="Roboto" w:cs="Roboto" w:eastAsia="Roboto" w:hAnsi="Roboto"/>
+          <w:b/>
+          <w:bCs/>
+          <w:color w:val="C3AF88"/>
+          <w:sz w:val="22"/>
+          <w:szCs w:val="22"/>
+        </w:rPr>
+        <w:t xml:space="preserve">• </w:t>
+      </w:r>
+      <w:r>
+        <w:rPr>
+          <w:rFonts w:ascii="Roboto" w:cs="Roboto" w:eastAsia="Roboto" w:hAnsi="Roboto"/>
+          <w:color w:val="000000"/>
+          <w:sz w:val="20"/>
+          <w:szCs w:val="20"/>
+        </w:rPr>
+        <w:t xml:space="preserve">5-Methylcytosine</w:t>
+      </w:r>
+    </w:p>
+    <w:p>
+      <w:pPr>
+        <w:spacing w:after="60"/>
+      </w:pPr>
+      <w:r>
+        <w:rPr>
+          <w:rFonts w:ascii="Roboto" w:cs="Roboto" w:eastAsia="Roboto" w:hAnsi="Roboto"/>
+          <w:b/>
+          <w:bCs/>
+          <w:color w:val="C3AF88"/>
+          <w:sz w:val="22"/>
+          <w:szCs w:val="22"/>
+        </w:rPr>
+        <w:t xml:space="preserve">• </w:t>
+      </w:r>
+      <w:r>
+        <w:rPr>
+          <w:rFonts w:ascii="Roboto" w:cs="Roboto" w:eastAsia="Roboto" w:hAnsi="Roboto"/>
+          <w:color w:val="000000"/>
+          <w:sz w:val="20"/>
+          <w:szCs w:val="20"/>
+        </w:rPr>
+        <w:t xml:space="preserve">Pyroglutamic Acid</w:t>
       </w:r>
     </w:p>
     <w:p>
@@ -5442,7 +6678,7 @@
           <w:sz w:val="20"/>
           <w:szCs w:val="20"/>
         </w:rPr>
-        <w:t xml:space="preserve">Re-testing of priority markers may be considered at clinically appropriate intervals.</w:t>
+        <w:t xml:space="preserve">Re-testing timing is a clinical decision for the treating practitioner.</w:t>
       </w:r>
     </w:p>
     <w:p>
@@ -5477,7 +6713,7 @@
           <w:sz w:val="22"/>
           <w:szCs w:val="22"/>
         </w:rPr>
-        <w:t xml:space="preserve">The following 6 finding(s) on this panel are within reference and are surfaced as areas of clinical strength to contextualise the abnormal findings above.</w:t>
+        <w:t xml:space="preserve">The following 7 finding(s) on this panel are within reference and are surfaced as areas of clinical strength to contextualise the abnormal findings above.</w:t>
       </w:r>
     </w:p>
     <w:p>
@@ -5502,7 +6738,7 @@
           <w:sz w:val="20"/>
           <w:szCs w:val="20"/>
         </w:rPr>
-        <w:t xml:space="preserve">Cortisol within reference range</w:t>
+        <w:t xml:space="preserve">Cortisol (OA) within reference range — HPA axis not flagged for primary intervention.</w:t>
       </w:r>
     </w:p>
     <w:p>
@@ -5527,7 +6763,7 @@
           <w:sz w:val="20"/>
           <w:szCs w:val="20"/>
         </w:rPr>
-        <w:t xml:space="preserve">Dopamine pathway markers (HVA, DOPAC, VMA, MHPG) within reference</w:t>
+        <w:t xml:space="preserve">Methylmalonic acid and FIGLU within reference range — overt B12/folate deficiency not evident.</w:t>
       </w:r>
     </w:p>
     <w:p>
@@ -5552,7 +6788,7 @@
           <w:sz w:val="20"/>
           <w:szCs w:val="20"/>
         </w:rPr>
-        <w:t xml:space="preserve">MMA and FIGLU within reference suggesting adequate B12/folate at the basic methylation step</w:t>
+        <w:t xml:space="preserve">Pyridoxic acid (B6 marker) within range — overt B6 deficiency not evident; xanthurenic indicates functional rather than depletion picture.</w:t>
       </w:r>
     </w:p>
     <w:p>
@@ -5577,7 +6813,7 @@
           <w:sz w:val="20"/>
           <w:szCs w:val="20"/>
         </w:rPr>
-        <w:t xml:space="preserve">Glutathione cycling (pyroglutamic, NAC) within range though under pressure</w:t>
+        <w:t xml:space="preserve">Vitamin C (ascorbic acid) within range.</w:t>
       </w:r>
     </w:p>
     <w:p>
@@ -5602,7 +6838,7 @@
           <w:sz w:val="20"/>
           <w:szCs w:val="20"/>
         </w:rPr>
-        <w:t xml:space="preserve">Carnitine fatty acid oxidation markers largely within range</w:t>
+        <w:t xml:space="preserve">Glucaric acid within range.</w:t>
       </w:r>
     </w:p>
     <w:p>
@@ -5627,7 +6863,32 @@
           <w:sz w:val="20"/>
           <w:szCs w:val="20"/>
         </w:rPr>
-        <w:t xml:space="preserve">Glycolic, glyceric, oxalic within reference</w:t>
+        <w:t xml:space="preserve">Lactic and pyruvic acid within range — gross glycolytic dysfunction not evident.</w:t>
+      </w:r>
+    </w:p>
+    <w:p>
+      <w:pPr>
+        <w:spacing w:after="60"/>
+      </w:pPr>
+      <w:r>
+        <w:rPr>
+          <w:rFonts w:ascii="Roboto" w:cs="Roboto" w:eastAsia="Roboto" w:hAnsi="Roboto"/>
+          <w:b/>
+          <w:bCs/>
+          <w:color w:val="C3AF88"/>
+          <w:sz w:val="22"/>
+          <w:szCs w:val="22"/>
+        </w:rPr>
+        <w:t xml:space="preserve">• </w:t>
+      </w:r>
+      <w:r>
+        <w:rPr>
+          <w:rFonts w:ascii="Roboto" w:cs="Roboto" w:eastAsia="Roboto" w:hAnsi="Roboto"/>
+          <w:color w:val="000000"/>
+          <w:sz w:val="20"/>
+          <w:szCs w:val="20"/>
+        </w:rPr>
+        <w:t xml:space="preserve">Most neurotransmitter metabolites (HVA, VMA, DOPAC, 5-HIAA) within reference range.</w:t>
       </w:r>
     </w:p>
     <w:p>
@@ -5687,7 +6948,7 @@
           <w:sz w:val="22"/>
           <w:szCs w:val="22"/>
         </w:rPr>
-        <w:t xml:space="preserve">  Hewlings SJ &amp; Kalman DS (2017). Curcumin: A Review of Its Effects on Human Health. Foods.</w:t>
+        <w:t xml:space="preserve">  Sadowska AM et al. (2007). Antioxidant and anti-inflammatory efficacy of NAC in the treatment of COPD: discordant in vitro and in vivo dose-effects: a review. Pulmonary Pharmacology &amp; Therapeutics.</w:t>
       </w:r>
       <w:r>
         <w:rPr>
@@ -5698,7 +6959,7 @@
           <w:sz w:val="18"/>
           <w:szCs w:val="18"/>
         </w:rPr>
-        <w:t xml:space="preserve">  (Turmeric (curcumin))</w:t>
+        <w:t xml:space="preserve">  (N-acetyl cysteine (NAC))</w:t>
       </w:r>
     </w:p>
     <w:p>
@@ -5723,7 +6984,7 @@
           <w:sz w:val="22"/>
           <w:szCs w:val="22"/>
         </w:rPr>
-        <w:t xml:space="preserve">  Ammon HPT (2006). Boswellic acids in chronic inflammatory diseases. Planta Medica.</w:t>
+        <w:t xml:space="preserve">  Abenavoli L et al. (2018). Milk thistle (Silybum marianum): A concise overview on its chemistry, pharmacological, and nutraceutical uses in liver diseases. Phytotherapy Research.</w:t>
       </w:r>
       <w:r>
         <w:rPr>
@@ -5734,7 +6995,7 @@
           <w:sz w:val="18"/>
           <w:szCs w:val="18"/>
         </w:rPr>
-        <w:t xml:space="preserve">  (Boswellia (frankincense))</w:t>
+        <w:t xml:space="preserve">  (Milk thistle (silymarin))</w:t>
       </w:r>
     </w:p>
     <w:p>
@@ -5759,7 +7020,7 @@
           <w:sz w:val="22"/>
           <w:szCs w:val="22"/>
         </w:rPr>
-        <w:t xml:space="preserve">  Li Y et al. (2016). Quercetin, Inflammation and Immunity. Nutrients.</w:t>
+        <w:t xml:space="preserve">  Walaszek Z et al. (1996). Metabolism, uptake, and excretion of a D-glucaric acid salt and its potential use in cancer prevention. Cancer Detection and Prevention.</w:t>
       </w:r>
       <w:r>
         <w:rPr>
@@ -5770,7 +7031,7 @@
           <w:sz w:val="18"/>
           <w:szCs w:val="18"/>
         </w:rPr>
-        <w:t xml:space="preserve">  (Quercetin)</w:t>
+        <w:t xml:space="preserve">  (Calcium D-glucarate)</w:t>
       </w:r>
     </w:p>
     <w:p>
@@ -5795,7 +7056,7 @@
           <w:sz w:val="22"/>
           <w:szCs w:val="22"/>
         </w:rPr>
-        <w:t xml:space="preserve">  Berman AY et al. (2017). The therapeutic potential of resveratrol: a review of clinical trials. npj Precision Oncology.</w:t>
+        <w:t xml:space="preserve">  Carr AC and Maggini S (2017). Vitamin C and immune function. Nutrients.</w:t>
       </w:r>
       <w:r>
         <w:rPr>
@@ -5806,7 +7067,7 @@
           <w:sz w:val="18"/>
           <w:szCs w:val="18"/>
         </w:rPr>
-        <w:t xml:space="preserve">  (Resveratrol)</w:t>
+        <w:t xml:space="preserve">  (Vitamin C (ascorbic acid))</w:t>
       </w:r>
     </w:p>
     <w:p>
@@ -5831,7 +7092,7 @@
           <w:sz w:val="22"/>
           <w:szCs w:val="22"/>
         </w:rPr>
-        <w:t xml:space="preserve">  Atkuri KR et al. (2007). N-Acetylcysteine—a safe antidote for cysteine/glutathione deficiency. Current Opinion in Pharmacology.</w:t>
+        <w:t xml:space="preserve">  Gu J et al. (2021). Resveratrol-induced autophagy and apoptosis in cancer cells: mechanisms and therapeutic implications. Frontiers in Pharmacology.</w:t>
       </w:r>
       <w:r>
         <w:rPr>
@@ -5842,7 +7103,7 @@
           <w:sz w:val="18"/>
           <w:szCs w:val="18"/>
         </w:rPr>
-        <w:t xml:space="preserve">  (N-acetyl cysteine (NAC))</w:t>
+        <w:t xml:space="preserve">  (Resveratrol)</w:t>
       </w:r>
     </w:p>
     <w:p>
@@ -5867,7 +7128,7 @@
           <w:sz w:val="22"/>
           <w:szCs w:val="22"/>
         </w:rPr>
-        <w:t xml:space="preserve">  Abenavoli L et al. (2018). Milk thistle (Silybum marianum): A concise overview on its chemistry, pharmacological, and nutraceutical uses in liver diseases. Phytotherapy Research.</w:t>
+        <w:t xml:space="preserve">  Hewlings SJ and Kalman DS (2017). Curcumin: A review of its effects on human health. Foods.</w:t>
       </w:r>
       <w:r>
         <w:rPr>
@@ -5878,7 +7139,7 @@
           <w:sz w:val="18"/>
           <w:szCs w:val="18"/>
         </w:rPr>
-        <w:t xml:space="preserve">  (Milk thistle (silymarin))</w:t>
+        <w:t xml:space="preserve">  (Turmeric (curcumin))</w:t>
       </w:r>
     </w:p>
     <w:p>
@@ -5903,7 +7164,7 @@
           <w:sz w:val="22"/>
           <w:szCs w:val="22"/>
         </w:rPr>
-        <w:t xml:space="preserve">  Dwivedi C et al. (1990). Effect of calcium glucarate on beta-glucuronidase activity and glucarate content of certain vegetables and fruits. Biochemical Medicine and Metabolic Biology.</w:t>
+        <w:t xml:space="preserve">  Siddiqui MZ (2011). Boswellia serrata, a potential antiinflammatory agent: an overview. Indian Journal of Pharmaceutical Sciences.</w:t>
       </w:r>
       <w:r>
         <w:rPr>
@@ -5914,7 +7175,7 @@
           <w:sz w:val="18"/>
           <w:szCs w:val="18"/>
         </w:rPr>
-        <w:t xml:space="preserve">  (Calcium D-glucarate)</w:t>
+        <w:t xml:space="preserve">  (Boswellia serrata)</w:t>
       </w:r>
     </w:p>
     <w:p>
@@ -5939,7 +7200,7 @@
           <w:sz w:val="22"/>
           <w:szCs w:val="22"/>
         </w:rPr>
-        <w:t xml:space="preserve">  Carr AC &amp; Maggini S (2017). Vitamin C and Immune Function. Nutrients.</w:t>
+        <w:t xml:space="preserve">  Li Y et al. (2016). Quercetin, inflammation and immunity. Nutrients.</w:t>
       </w:r>
       <w:r>
         <w:rPr>
@@ -5950,7 +7211,7 @@
           <w:sz w:val="18"/>
           <w:szCs w:val="18"/>
         </w:rPr>
-        <w:t xml:space="preserve">  (Vitamin C (ascorbic acid))</w:t>
+        <w:t xml:space="preserve">  (Quercetin)</w:t>
       </w:r>
     </w:p>
     <w:p>
@@ -5975,7 +7236,7 @@
           <w:sz w:val="22"/>
           <w:szCs w:val="22"/>
         </w:rPr>
-        <w:t xml:space="preserve">  Hernández-Camacho JD et al. (2018). Coenzyme Q10 Supplementation in Aging and Disease. Frontiers in Physiology.</w:t>
+        <w:t xml:space="preserve">  Hernández-Camacho JD et al. (2018). Coenzyme Q10 supplementation in aging and disease. Frontiers in Physiology.</w:t>
       </w:r>
       <w:r>
         <w:rPr>
@@ -6011,7 +7272,7 @@
           <w:sz w:val="22"/>
           <w:szCs w:val="22"/>
         </w:rPr>
-        <w:t xml:space="preserve">  Shay KP et al. (2009). Alpha-lipoic acid as a dietary supplement: molecular mechanisms and therapeutic potential. Biochimica et Biophysica Acta.</w:t>
+        <w:t xml:space="preserve">  Rochette L et al. (2013). Alpha-lipoic acid: molecular mechanisms and therapeutic potential in diabetes. Canadian Journal of Physiology and Pharmacology.</w:t>
       </w:r>
       <w:r>
         <w:rPr>
@@ -6047,7 +7308,7 @@
           <w:sz w:val="22"/>
           <w:szCs w:val="22"/>
         </w:rPr>
-        <w:t xml:space="preserve">  Ueland PM et al. (2017). Direct and Functional Biomarkers of Vitamin B6 Status. Annual Review of Nutrition.</w:t>
+        <w:t xml:space="preserve">  Paul C and Brady DM (2017). Comparative bioavailability and utilization of particular forms of B12 supplements with potential to mitigate B12-related genetic polymorphisms. Integrative Medicine.</w:t>
       </w:r>
       <w:r>
         <w:rPr>
@@ -6058,7 +7319,7 @@
           <w:sz w:val="18"/>
           <w:szCs w:val="18"/>
         </w:rPr>
-        <w:t xml:space="preserve">  (Vitamin B6 (pyridoxal 5-phosphate))</w:t>
+        <w:t xml:space="preserve">  (Methylcobalamin (B12))</w:t>
       </w:r>
     </w:p>
     <w:p>
@@ -6083,7 +7344,7 @@
           <w:sz w:val="22"/>
           <w:szCs w:val="22"/>
         </w:rPr>
-        <w:t xml:space="preserve">  Paul C &amp; Brady DM (2017). Comparative Bioavailability and Utilization of Particular Forms of B12 Supplements With Potential to Mitigate B12-related Genetic Polymorphisms. Integrative Medicine: A Clinician's Journal.</w:t>
+        <w:t xml:space="preserve">  Scaglione F and Panzavolta G (2014). Folate, folic acid and 5-methyltetrahydrofolate are not the same thing. Xenobiotica.</w:t>
       </w:r>
       <w:r>
         <w:rPr>
@@ -6094,7 +7355,7 @@
           <w:sz w:val="18"/>
           <w:szCs w:val="18"/>
         </w:rPr>
-        <w:t xml:space="preserve">  (Vitamin B12 (methylcobalamin))</w:t>
+        <w:t xml:space="preserve">  (Calcium folinate)</w:t>
       </w:r>
     </w:p>
     <w:p>
@@ -6119,7 +7380,7 @@
           <w:sz w:val="22"/>
           <w:szCs w:val="22"/>
         </w:rPr>
-        <w:t xml:space="preserve">  Powers HJ (2003). Riboflavin (vitamin B-2) and health. American Journal of Clinical Nutrition.</w:t>
+        <w:t xml:space="preserve">  Oxenkrug G (2013). Insulin resistance and dysregulation of tryptophan-kynurenine and kynurenine-nicotinamide adenine dinucleotide metabolic pathways. Molecular Neurobiology.</w:t>
       </w:r>
       <w:r>
         <w:rPr>
@@ -6130,7 +7391,7 @@
           <w:sz w:val="18"/>
           <w:szCs w:val="18"/>
         </w:rPr>
-        <w:t xml:space="preserve">  (Vitamin B2 (riboflavin))</w:t>
+        <w:t xml:space="preserve">  (Pyridoxal-5-phosphate (P5P / active B6))</w:t>
       </w:r>
     </w:p>
     <w:p>
@@ -6155,7 +7416,7 @@
           <w:sz w:val="22"/>
           <w:szCs w:val="22"/>
         </w:rPr>
-        <w:t xml:space="preserve">  Pietrzik K et al. (2010). Folic acid and L-5-methyltetrahydrofolate: comparison of clinical pharmacokinetics and pharmacodynamics. Clinical Pharmacokinetics.</w:t>
+        <w:t xml:space="preserve">  Powers HJ (2003). Riboflavin (vitamin B-2) and health. American Journal of Clinical Nutrition.</w:t>
       </w:r>
       <w:r>
         <w:rPr>
@@ -6166,7 +7427,7 @@
           <w:sz w:val="18"/>
           <w:szCs w:val="18"/>
         </w:rPr>
-        <w:t xml:space="preserve">  (Folate (calcium levomefolate))</w:t>
+        <w:t xml:space="preserve">  (Riboflavin (B2))</w:t>
       </w:r>
     </w:p>
     <w:p>
@@ -6191,7 +7452,7 @@
           <w:sz w:val="22"/>
           <w:szCs w:val="22"/>
         </w:rPr>
-        <w:t xml:space="preserve">  Habtemariam S (2020). Berberine pharmacology and the gut microbiota: A hidden therapeutic link. Pharmacological Research.</w:t>
+        <w:t xml:space="preserve">  Schuette SA et al. (1994). Bioavailability of magnesium diglycinate vs magnesium oxide in patients with ileal resection. JPEN Journal of Parenteral and Enteral Nutrition.</w:t>
       </w:r>
       <w:r>
         <w:rPr>
@@ -6202,7 +7463,7 @@
           <w:sz w:val="18"/>
           <w:szCs w:val="18"/>
         </w:rPr>
-        <w:t xml:space="preserve">  (Berberine HCl)</w:t>
+        <w:t xml:space="preserve">  (Magnesium glycinate)</w:t>
       </w:r>
     </w:p>
     <w:p>
@@ -6227,7 +7488,7 @@
           <w:sz w:val="22"/>
           <w:szCs w:val="22"/>
         </w:rPr>
-        <w:t xml:space="preserve">  Kim MH &amp; Kim H (2017). The Roles of Glutamine in the Intestine and Its Implication in Intestinal Diseases. International Journal of Molecular Sciences.</w:t>
+        <w:t xml:space="preserve">  Tripkovic L et al. (2012). Comparison of vitamin D2 and vitamin D3 supplementation in raising serum 25-hydroxyvitamin D status: a systematic review and meta-analysis. American Journal of Clinical Nutrition.</w:t>
       </w:r>
       <w:r>
         <w:rPr>
@@ -6238,43 +7499,7 @@
           <w:sz w:val="18"/>
           <w:szCs w:val="18"/>
         </w:rPr>
-        <w:t xml:space="preserve">  (L-glutamine)</w:t>
-      </w:r>
-    </w:p>
-    <w:p>
-      <w:pPr>
-        <w:spacing w:after="120"/>
-      </w:pPr>
-      <w:r>
-        <w:rPr>
-          <w:rFonts w:ascii="Roboto" w:cs="Roboto" w:eastAsia="Roboto" w:hAnsi="Roboto"/>
-          <w:b/>
-          <w:bCs/>
-          <w:color w:val="C3AF88"/>
-          <w:sz w:val="22"/>
-          <w:szCs w:val="22"/>
-        </w:rPr>
-        <w:t xml:space="preserve">[17]</w:t>
-      </w:r>
-      <w:r>
-        <w:rPr>
-          <w:rFonts w:ascii="Roboto" w:cs="Roboto" w:eastAsia="Roboto" w:hAnsi="Roboto"/>
-          <w:color w:val="000000"/>
-          <w:sz w:val="22"/>
-          <w:szCs w:val="22"/>
-        </w:rPr>
-        <w:t xml:space="preserve">  Wessells KR &amp; Brown KH (2012). Estimating the global prevalence of zinc deficiency: results based on zinc availability in national food supplies and the prevalence of stunting. PLoS ONE.</w:t>
-      </w:r>
-      <w:r>
-        <w:rPr>
-          <w:rFonts w:ascii="Roboto" w:cs="Roboto" w:eastAsia="Roboto" w:hAnsi="Roboto"/>
-          <w:i/>
-          <w:iCs/>
-          <w:color w:val="000000"/>
-          <w:sz w:val="18"/>
-          <w:szCs w:val="18"/>
-        </w:rPr>
-        <w:t xml:space="preserve">  (Zinc citrate)</w:t>
+        <w:t xml:space="preserve">  (Vitamin D3 (cholecalciferol))</w:t>
       </w:r>
     </w:p>
     <w:p>
@@ -6311,7 +7536,7 @@
           <w:sz w:val="18"/>
           <w:szCs w:val="18"/>
         </w:rPr>
-        <w:t xml:space="preserve">Submission: SUB-2026-003  •  Generated: 30 May 2026, 10:13 am</w:t>
+        <w:t xml:space="preserve">Submission: SUB-2026-003  •  Generated: 30 May 2026, 6:38 pm</w:t>
       </w:r>
     </w:p>
     <w:p>
@@ -6327,7 +7552,7 @@
           <w:sz w:val="18"/>
           <w:szCs w:val="18"/>
         </w:rPr>
-        <w:t xml:space="preserve">Audit Reference: 41B7-C1F6-B7A4</w:t>
+        <w:t xml:space="preserve">Audit Reference: 6D40-90BC-A79D</w:t>
       </w:r>
     </w:p>
     <w:sectPr>

</xml_diff>

<commit_message>
Add HMP panel class support (EndoSCAN): prompt v0.5.3, first green live-fire 682/710 (96.1%)
</commit_message>
<xml_diff>
--- a/generated-docs/Nof1_HealthAnalysis_SUB-2026-003_DRAFT.docx
+++ b/generated-docs/Nof1_HealthAnalysis_SUB-2026-003_DRAFT.docx
@@ -689,7 +689,7 @@
                 <w:sz w:val="20"/>
                 <w:szCs w:val="20"/>
               </w:rPr>
-              <w:t xml:space="preserve">SUB-2026-003</w:t>
+              <w:t xml:space="preserve">SUB-2026-004</w:t>
             </w:r>
           </w:p>
         </w:tc>
@@ -750,7 +750,7 @@
                 <w:sz w:val="20"/>
                 <w:szCs w:val="20"/>
               </w:rPr>
-              <w:t xml:space="preserve">30 May 2026, 6:38 pm</w:t>
+              <w:t xml:space="preserve">31 May 2026, 8:58 am</w:t>
             </w:r>
           </w:p>
         </w:tc>
@@ -793,7 +793,7 @@
           <w:sz w:val="22"/>
           <w:szCs w:val="22"/>
         </w:rPr>
-        <w:t xml:space="preserve">Organic Acids profile shows a multi-pattern picture: xenobiotic exposure (benzene/xylene/paraben markers), oxidative stress with mitochondrial/TCA disturbance, kynurenine pathway shift toward quinolinic acid, methylation/one-carbon stress, and elevated leukotriene E4 — for practitioner consideration.</w:t>
+        <w:t xml:space="preserve">EndoSCAN findings in this 53-year-old male show a pattern consistent with low total urinary cortisol (HPA-hypocortisolism), reduced oestrogen quotient (E3 relative to E1+E2 below the laboratory reference framework), and low Phase I 2-OH and 4-OH oestrogen metabolites with a low 2-OH:16-OH ratio — patterns warranting practitioner consideration of adaptogenic, oestrogen-metabolism-supportive, and antioxidant/methylation cofactor strategies.</w:t>
       </w:r>
     </w:p>
     <w:p>
@@ -836,7 +836,7 @@
           <w:sz w:val="22"/>
           <w:szCs w:val="22"/>
         </w:rPr>
-        <w:t xml:space="preserve">Xenobiotic-burdened</w:t>
+        <w:t xml:space="preserve">HPA-hypocortisolism</w:t>
       </w:r>
     </w:p>
     <w:p>
@@ -851,7 +851,7 @@
           <w:sz w:val="20"/>
           <w:szCs w:val="20"/>
         </w:rPr>
-        <w:t xml:space="preserve">Supporting findings: Benzoic Acid 25.0 (&lt;9.3), t,t-Muconic Acid 0.20 (&lt;0.12), 3-Methylhippuric Acid 0.34 (&lt;0.11), 4-Hydroxybenzoic Acid 0.64 (&lt;0.57), 5-Hydroxymethyl-2-furoic Acid 18.5 (&lt;10.0), Furancarbonylglycine 2.9 (&lt;2.0)</w:t>
+        <w:t xml:space="preserve">Supporting findings: Total 24hr Cortisol 24.91 ug/gCR (reference 50.00–200.00) — low, DHEA 16.27 ug/gCR within reference but in lower portion of range, Symptom cluster including fatigue (morning, mental, evening), difficulty sleeping, burned-out feeling, decreased stamina</w:t>
       </w:r>
     </w:p>
     <w:p>
@@ -878,7 +878,7 @@
           <w:sz w:val="22"/>
           <w:szCs w:val="22"/>
         </w:rPr>
-        <w:t xml:space="preserve">Oxidative stress / redox-stressed</w:t>
+        <w:t xml:space="preserve">16-OH-dominant oestrogen metabolism (low 2:16 ratio)</w:t>
       </w:r>
     </w:p>
     <w:p>
@@ -893,7 +893,7 @@
           <w:sz w:val="20"/>
           <w:szCs w:val="20"/>
         </w:rPr>
-        <w:t xml:space="preserve">Supporting findings: 8-hydroxy-deoxyguanosine 3.80 (&lt;2.70), Leukotriene E4 195 (&lt;100), KMBA 3.20 (&lt;1.50), Pyroglutamic Acid 28.8 (upper portion of 4.5-33.0)</w:t>
+        <w:t xml:space="preserve">Supporting findings: 2-OH(E1+E2)/16-OHE1 ratio 0.60 (reference 1.10–5.60), 2-OH Estrone 0.04 ug/gCR (reference 0.10–1.88), Estrogen Quotient E3/(E1+E2) 0.24 (reference &gt;0.25)</w:t>
       </w:r>
     </w:p>
     <w:p>
@@ -920,7 +920,7 @@
           <w:sz w:val="22"/>
           <w:szCs w:val="22"/>
         </w:rPr>
-        <w:t xml:space="preserve">Mitochondrial / TCA flux strain</w:t>
+        <w:t xml:space="preserve">Low 2-OH substrate with preserved COMT methylation capacity</w:t>
       </w:r>
     </w:p>
     <w:p>
@@ -935,133 +935,7 @@
           <w:sz w:val="20"/>
           <w:szCs w:val="20"/>
         </w:rPr>
-        <w:t xml:space="preserve">Supporting findings: Isocitric Acid 86 (5-65), 2-Oxoglutaric Acid 65 (2-45), 3-Methylglutaconic Acid 6.32 (&lt;5.50), Adipic Acid 4.30 (&lt;3.80), Mevalonolactone 2.80 (&lt;2.00)</w:t>
-      </w:r>
-    </w:p>
-    <w:p>
-      <w:pPr>
-        <w:spacing w:after="60"/>
-      </w:pPr>
-      <w:r>
-        <w:rPr>
-          <w:rFonts w:ascii="Roboto" w:cs="Roboto" w:eastAsia="Roboto" w:hAnsi="Roboto"/>
-          <w:b/>
-          <w:bCs/>
-          <w:color w:val="C3AF88"/>
-          <w:sz w:val="22"/>
-          <w:szCs w:val="22"/>
-        </w:rPr>
-        <w:t xml:space="preserve">• </w:t>
-      </w:r>
-      <w:r>
-        <w:rPr>
-          <w:rFonts w:ascii="Roboto" w:cs="Roboto" w:eastAsia="Roboto" w:hAnsi="Roboto"/>
-          <w:b/>
-          <w:bCs/>
-          <w:color w:val="000000"/>
-          <w:sz w:val="22"/>
-          <w:szCs w:val="22"/>
-        </w:rPr>
-        <w:t xml:space="preserve">Kynurenine pathway shift / functional B6 insufficiency</w:t>
-      </w:r>
-    </w:p>
-    <w:p>
-      <w:pPr>
-        <w:spacing w:after="120"/>
-        <w:ind w:left="360"/>
-      </w:pPr>
-      <w:r>
-        <w:rPr>
-          <w:rFonts w:ascii="Roboto" w:cs="Roboto" w:eastAsia="Roboto" w:hAnsi="Roboto"/>
-          <w:color w:val="666666"/>
-          <w:sz w:val="20"/>
-          <w:szCs w:val="20"/>
-        </w:rPr>
-        <w:t xml:space="preserve">Supporting findings: Quinolinic Acid 11.80 (&lt;9.10), Kynurenic Acid 3.10 (&lt;2.20), Xanthurenic Acid 1.92 (&lt;0.96), Quinolinic/5-HIAA 10.4 (&lt;5.0)</w:t>
-      </w:r>
-    </w:p>
-    <w:p>
-      <w:pPr>
-        <w:spacing w:after="60"/>
-      </w:pPr>
-      <w:r>
-        <w:rPr>
-          <w:rFonts w:ascii="Roboto" w:cs="Roboto" w:eastAsia="Roboto" w:hAnsi="Roboto"/>
-          <w:b/>
-          <w:bCs/>
-          <w:color w:val="C3AF88"/>
-          <w:sz w:val="22"/>
-          <w:szCs w:val="22"/>
-        </w:rPr>
-        <w:t xml:space="preserve">• </w:t>
-      </w:r>
-      <w:r>
-        <w:rPr>
-          <w:rFonts w:ascii="Roboto" w:cs="Roboto" w:eastAsia="Roboto" w:hAnsi="Roboto"/>
-          <w:b/>
-          <w:bCs/>
-          <w:color w:val="000000"/>
-          <w:sz w:val="22"/>
-          <w:szCs w:val="22"/>
-        </w:rPr>
-        <w:t xml:space="preserve">Methylation / one-carbon stress</w:t>
-      </w:r>
-    </w:p>
-    <w:p>
-      <w:pPr>
-        <w:spacing w:after="120"/>
-        <w:ind w:left="360"/>
-      </w:pPr>
-      <w:r>
-        <w:rPr>
-          <w:rFonts w:ascii="Roboto" w:cs="Roboto" w:eastAsia="Roboto" w:hAnsi="Roboto"/>
-          <w:color w:val="666666"/>
-          <w:sz w:val="20"/>
-          <w:szCs w:val="20"/>
-        </w:rPr>
-        <w:t xml:space="preserve">Supporting findings: 5-Methylcytosine 68 (10-50), Guanidinoacetic Acid 4.80 (0.5-3.0), KMBA 3.20 (&lt;1.50)</w:t>
-      </w:r>
-    </w:p>
-    <w:p>
-      <w:pPr>
-        <w:spacing w:after="60"/>
-      </w:pPr>
-      <w:r>
-        <w:rPr>
-          <w:rFonts w:ascii="Roboto" w:cs="Roboto" w:eastAsia="Roboto" w:hAnsi="Roboto"/>
-          <w:b/>
-          <w:bCs/>
-          <w:color w:val="C3AF88"/>
-          <w:sz w:val="22"/>
-          <w:szCs w:val="22"/>
-        </w:rPr>
-        <w:t xml:space="preserve">• </w:t>
-      </w:r>
-      <w:r>
-        <w:rPr>
-          <w:rFonts w:ascii="Roboto" w:cs="Roboto" w:eastAsia="Roboto" w:hAnsi="Roboto"/>
-          <w:b/>
-          <w:bCs/>
-          <w:color w:val="000000"/>
-          <w:sz w:val="22"/>
-          <w:szCs w:val="22"/>
-        </w:rPr>
-        <w:t xml:space="preserve">Modest dysbiosis (yeast/bacterial)</w:t>
-      </w:r>
-    </w:p>
-    <w:p>
-      <w:pPr>
-        <w:spacing w:after="120"/>
-        <w:ind w:left="360"/>
-      </w:pPr>
-      <w:r>
-        <w:rPr>
-          <w:rFonts w:ascii="Roboto" w:cs="Roboto" w:eastAsia="Roboto" w:hAnsi="Roboto"/>
-          <w:color w:val="666666"/>
-          <w:sz w:val="20"/>
-          <w:szCs w:val="20"/>
-        </w:rPr>
-        <w:t xml:space="preserve">Supporting findings: Arabinose 42 (&lt;32), 3,4-DHBA 62 (&lt;45), 3-HPAA 12 (&lt;10)</w:t>
+        <w:t xml:space="preserve">Supporting findings: 2-MeOH Estrone 0.01 ug/gCR (low) but 2-MeOH E1 / 2-OH E1 ratio 0.30 within reference (0.05–0.50), 4-MeOH E2 / 4-OH E2 ratio 4.39 (above reference) suggesting active methylation capacity</w:t>
       </w:r>
     </w:p>
     <w:p>
@@ -1096,7 +970,7 @@
           <w:sz w:val="22"/>
           <w:szCs w:val="22"/>
         </w:rPr>
-        <w:t xml:space="preserve">The following 26 biomarker findings are surfaced for practitioner review. Each finding includes a hedged interpretation, possible contributors per the published literature, and the relevance of the finding to the formulation strategy.</w:t>
+        <w:t xml:space="preserve">The following 13 biomarker findings are surfaced for practitioner review. Each finding includes a hedged interpretation, possible contributors per the published literature, and the relevance of the finding to the formulation strategy.</w:t>
       </w:r>
     </w:p>
     <w:p>
@@ -1112,16 +986,16 @@
           <w:sz w:val="22"/>
           <w:szCs w:val="22"/>
         </w:rPr>
-        <w:t xml:space="preserve">Benzoic Acid (urine)</w:t>
-      </w:r>
-      <w:r>
-        <w:rPr>
-          <w:rFonts w:ascii="Roboto" w:cs="Roboto" w:eastAsia="Roboto" w:hAnsi="Roboto"/>
-          <w:color w:val="000000"/>
-          <w:sz w:val="22"/>
-          <w:szCs w:val="22"/>
-        </w:rPr>
-        <w:t xml:space="preserve">   25.00 mmol/molCR</w:t>
+        <w:t xml:space="preserve">Total 24hr Cortisol</w:t>
+      </w:r>
+      <w:r>
+        <w:rPr>
+          <w:rFonts w:ascii="Roboto" w:cs="Roboto" w:eastAsia="Roboto" w:hAnsi="Roboto"/>
+          <w:color w:val="000000"/>
+          <w:sz w:val="22"/>
+          <w:szCs w:val="22"/>
+        </w:rPr>
+        <w:t xml:space="preserve">   24.91 ug/gCR</w:t>
       </w:r>
       <w:r>
         <w:rPr>
@@ -1132,7 +1006,7 @@
           <w:sz w:val="20"/>
           <w:szCs w:val="20"/>
         </w:rPr>
-        <w:t xml:space="preserve">   (ref: &lt;9.30)</w:t>
+        <w:t xml:space="preserve">   (ref: 50.00–200.00 ug/gCR)</w:t>
       </w:r>
     </w:p>
     <w:p>
@@ -1157,7 +1031,7 @@
           <w:sz w:val="20"/>
           <w:szCs w:val="20"/>
         </w:rPr>
-        <w:t xml:space="preserve">Elevated above the laboratory reference range. Per published OA frameworks, may reflect dietary benzoate intake or microbial production; in combination with elevated 4-HBA may indicate increased glycine conjugation demand.</w:t>
+        <w:t xml:space="preserve">Below the laboratory reference framework — pattern consistent with reduced adrenal glucocorticoid output. The laboratory comment notes this is associated with chronic HPA axis suppression or prolonged physiological stress per published frameworks.</w:t>
       </w:r>
     </w:p>
     <w:p>
@@ -1182,7 +1056,7 @@
           <w:sz w:val="20"/>
           <w:szCs w:val="20"/>
         </w:rPr>
-        <w:t xml:space="preserve">Dietary preservatives (sodium benzoate), aspartame metabolism, paraben exposure, microbial polyphenol metabolism — practitioner to assess relevance.</w:t>
+        <w:t xml:space="preserve">Published literature identifies chronic stress, disrupted circadian rhythm, prolonged HPA activation followed by attenuation, sleep disruption, and undernutrition as factors that may contribute to reduced urinary cortisol output — practitioner to assess relevance to this patient.</w:t>
       </w:r>
     </w:p>
     <w:p>
@@ -1207,7 +1081,7 @@
           <w:sz w:val="20"/>
           <w:szCs w:val="20"/>
         </w:rPr>
-        <w:t xml:space="preserve">Supports inclusion of Phase II conjugation support (glycine pathway candidates surfaced as standalone since glycine not in Library) and glucuronidation support (Cal D-glucarate).</w:t>
+        <w:t xml:space="preserve">Drives the thyroid_adaptogenic axis (adaptogen support — ashwagandha, rhodiola, american ginseng) and the vitamin_d_c_neurotransmitter axis (vitamin C as adrenal cofactor) and the b_vitamins_methylation axis (B5 / pantothenic acid as CoA precursor and specific adrenal cofactor).</w:t>
       </w:r>
     </w:p>
     <w:p>
@@ -1223,16 +1097,16 @@
           <w:sz w:val="22"/>
           <w:szCs w:val="22"/>
         </w:rPr>
-        <w:t xml:space="preserve">t,t-Muconic Acid</w:t>
-      </w:r>
-      <w:r>
-        <w:rPr>
-          <w:rFonts w:ascii="Roboto" w:cs="Roboto" w:eastAsia="Roboto" w:hAnsi="Roboto"/>
-          <w:color w:val="000000"/>
-          <w:sz w:val="22"/>
-          <w:szCs w:val="22"/>
-        </w:rPr>
-        <w:t xml:space="preserve">   0.20 mmol/molCR</w:t>
+        <w:t xml:space="preserve">Estrogen Quotient E3/(E1+E2)</w:t>
+      </w:r>
+      <w:r>
+        <w:rPr>
+          <w:rFonts w:ascii="Roboto" w:cs="Roboto" w:eastAsia="Roboto" w:hAnsi="Roboto"/>
+          <w:color w:val="000000"/>
+          <w:sz w:val="22"/>
+          <w:szCs w:val="22"/>
+        </w:rPr>
+        <w:t xml:space="preserve">   0.24 (ratio)</w:t>
       </w:r>
       <w:r>
         <w:rPr>
@@ -1243,7 +1117,7 @@
           <w:sz w:val="20"/>
           <w:szCs w:val="20"/>
         </w:rPr>
-        <w:t xml:space="preserve">   (ref: &lt;0.12)</w:t>
+        <w:t xml:space="preserve">   (ref: &gt;0.25)</w:t>
       </w:r>
     </w:p>
     <w:p>
@@ -1268,7 +1142,7 @@
           <w:sz w:val="20"/>
           <w:szCs w:val="20"/>
         </w:rPr>
-        <w:t xml:space="preserve">Elevated. Per published frameworks, a marker associated with benzene exposure metabolism.</w:t>
+        <w:t xml:space="preserve">Marginally below the laboratory reference framework — pattern consistent with relative E3 reduction versus more potent E1+E2.</w:t>
       </w:r>
     </w:p>
     <w:p>
@@ -1293,7 +1167,7 @@
           <w:sz w:val="20"/>
           <w:szCs w:val="20"/>
         </w:rPr>
-        <w:t xml:space="preserve">Benzene exposure (vehicle exhaust, tobacco smoke, certain solvents) — practitioner to assess relevance.</w:t>
+        <w:t xml:space="preserve">Published literature identifies impaired Phase I 2-hydroxylation, impaired 16α-hydroxylation balance, and incomplete oestrogen conjugation as factors that may contribute to a low E3 quotient — practitioner to assess relevance.</w:t>
       </w:r>
     </w:p>
     <w:p>
@@ -1318,7 +1192,7 @@
           <w:sz w:val="20"/>
           <w:szCs w:val="20"/>
         </w:rPr>
-        <w:t xml:space="preserve">Supports antioxidant/Phase II detox emphasis: NAC, milk thistle, vitamin C, Cal D-glucarate.</w:t>
+        <w:t xml:space="preserve">Supports inclusion of hormone_metabolism axis ingredients (DIM to support 2-OH pathway, calcium D-glucarate for glucuronidation/beta-glucuronidase inhibition, milk thistle for Phase II hepatic conjugation).</w:t>
       </w:r>
     </w:p>
     <w:p>
@@ -1334,16 +1208,16 @@
           <w:sz w:val="22"/>
           <w:szCs w:val="22"/>
         </w:rPr>
-        <w:t xml:space="preserve">3-Methylhippuric Acid</w:t>
-      </w:r>
-      <w:r>
-        <w:rPr>
-          <w:rFonts w:ascii="Roboto" w:cs="Roboto" w:eastAsia="Roboto" w:hAnsi="Roboto"/>
-          <w:color w:val="000000"/>
-          <w:sz w:val="22"/>
-          <w:szCs w:val="22"/>
-        </w:rPr>
-        <w:t xml:space="preserve">   0.34 mmol/molCR</w:t>
+        <w:t xml:space="preserve">2-OH Estrone</w:t>
+      </w:r>
+      <w:r>
+        <w:rPr>
+          <w:rFonts w:ascii="Roboto" w:cs="Roboto" w:eastAsia="Roboto" w:hAnsi="Roboto"/>
+          <w:color w:val="000000"/>
+          <w:sz w:val="22"/>
+          <w:szCs w:val="22"/>
+        </w:rPr>
+        <w:t xml:space="preserve">   0.04 ug/gCR</w:t>
       </w:r>
       <w:r>
         <w:rPr>
@@ -1354,7 +1228,7 @@
           <w:sz w:val="20"/>
           <w:szCs w:val="20"/>
         </w:rPr>
-        <w:t xml:space="preserve">   (ref: &lt;0.11)</w:t>
+        <w:t xml:space="preserve">   (ref: 0.10–1.88 ug/gCR)</w:t>
       </w:r>
     </w:p>
     <w:p>
@@ -1379,7 +1253,7 @@
           <w:sz w:val="20"/>
           <w:szCs w:val="20"/>
         </w:rPr>
-        <w:t xml:space="preserve">Elevated. Per published frameworks, a marker associated with xylene exposure metabolism.</w:t>
+        <w:t xml:space="preserve">Below the laboratory reference framework — pattern consistent with reduced Phase I 2-hydroxylation of oestrone.</w:t>
       </w:r>
     </w:p>
     <w:p>
@@ -1404,7 +1278,7 @@
           <w:sz w:val="20"/>
           <w:szCs w:val="20"/>
         </w:rPr>
-        <w:t xml:space="preserve">Xylene/toluene exposure (paints, solvents, vehicle exhaust) — practitioner to assess relevance.</w:t>
+        <w:t xml:space="preserve">Published literature identifies reduced CYP1A1 activity, inadequate cruciferous vegetable intake (DIM/I3C precursors), and Nrf2 pathway under-activation as factors that may contribute to low 2-OH metabolite output — practitioner to assess relevance.</w:t>
       </w:r>
     </w:p>
     <w:p>
@@ -1429,7 +1303,7 @@
           <w:sz w:val="20"/>
           <w:szCs w:val="20"/>
         </w:rPr>
-        <w:t xml:space="preserve">Reinforces antioxidant/conjugation support; glycine is the canonical conjugator and is recommended as a standalone.</w:t>
+        <w:t xml:space="preserve">Supports DIM inclusion as the canonical agent for shifting Phase I oestrogen hydroxylation toward the 2-OH pathway.</w:t>
       </w:r>
     </w:p>
     <w:p>
@@ -1445,16 +1319,16 @@
           <w:sz w:val="22"/>
           <w:szCs w:val="22"/>
         </w:rPr>
-        <w:t xml:space="preserve">4-Hydroxybenzoic Acid (4-HBA)</w:t>
-      </w:r>
-      <w:r>
-        <w:rPr>
-          <w:rFonts w:ascii="Roboto" w:cs="Roboto" w:eastAsia="Roboto" w:hAnsi="Roboto"/>
-          <w:color w:val="000000"/>
-          <w:sz w:val="22"/>
-          <w:szCs w:val="22"/>
-        </w:rPr>
-        <w:t xml:space="preserve">   0.64 mmol/molCR</w:t>
+        <w:t xml:space="preserve">2-OH(E1+E2)/16-OHE1 ratio</w:t>
+      </w:r>
+      <w:r>
+        <w:rPr>
+          <w:rFonts w:ascii="Roboto" w:cs="Roboto" w:eastAsia="Roboto" w:hAnsi="Roboto"/>
+          <w:color w:val="000000"/>
+          <w:sz w:val="22"/>
+          <w:szCs w:val="22"/>
+        </w:rPr>
+        <w:t xml:space="preserve">   0.60</w:t>
       </w:r>
       <w:r>
         <w:rPr>
@@ -1465,7 +1339,7 @@
           <w:sz w:val="20"/>
           <w:szCs w:val="20"/>
         </w:rPr>
-        <w:t xml:space="preserve">   (ref: &lt;0.57)</w:t>
+        <w:t xml:space="preserve">   (ref: 1.10–5.60)</w:t>
       </w:r>
     </w:p>
     <w:p>
@@ -1490,7 +1364,7 @@
           <w:sz w:val="20"/>
           <w:szCs w:val="20"/>
         </w:rPr>
-        <w:t xml:space="preserve">Mildly elevated. Per published frameworks, associated with paraben exposure metabolism.</w:t>
+        <w:t xml:space="preserve">Below the laboratory reference framework — pattern consistent with relative 16-OH predominance over the protective 2-OH pathway.</w:t>
       </w:r>
     </w:p>
     <w:p>
@@ -1515,7 +1389,7 @@
           <w:sz w:val="20"/>
           <w:szCs w:val="20"/>
         </w:rPr>
-        <w:t xml:space="preserve">Paraben exposure (cosmetics, personal care, food preservatives) — practitioner to assess relevance.</w:t>
+        <w:t xml:space="preserve">Published literature identifies low cruciferous vegetable intake, inflammation, insulin dysregulation, and adiposity as factors that may contribute to a low 2:16 ratio — practitioner to assess relevance.</w:t>
       </w:r>
     </w:p>
     <w:p>
@@ -1540,7 +1414,7 @@
           <w:sz w:val="20"/>
           <w:szCs w:val="20"/>
         </w:rPr>
-        <w:t xml:space="preserve">Reinforces xenobiotic-conjugation axis emphasis.</w:t>
+        <w:t xml:space="preserve">Reinforces hormone_metabolism axis priority — DIM, calcium D-glucarate, milk thistle, resveratrol for 2-OH pathway support and Phase II hepatic conjugation.</w:t>
       </w:r>
     </w:p>
     <w:p>
@@ -1556,16 +1430,16 @@
           <w:sz w:val="22"/>
           <w:szCs w:val="22"/>
         </w:rPr>
-        <w:t xml:space="preserve">5-Hydroxymethyl-2-furoic Acid</w:t>
-      </w:r>
-      <w:r>
-        <w:rPr>
-          <w:rFonts w:ascii="Roboto" w:cs="Roboto" w:eastAsia="Roboto" w:hAnsi="Roboto"/>
-          <w:color w:val="000000"/>
-          <w:sz w:val="22"/>
-          <w:szCs w:val="22"/>
-        </w:rPr>
-        <w:t xml:space="preserve">   18.50 mmol/molCR</w:t>
+        <w:t xml:space="preserve">2-MeOH Estrone</w:t>
+      </w:r>
+      <w:r>
+        <w:rPr>
+          <w:rFonts w:ascii="Roboto" w:cs="Roboto" w:eastAsia="Roboto" w:hAnsi="Roboto"/>
+          <w:color w:val="000000"/>
+          <w:sz w:val="22"/>
+          <w:szCs w:val="22"/>
+        </w:rPr>
+        <w:t xml:space="preserve">   0.01 ug/gCR</w:t>
       </w:r>
       <w:r>
         <w:rPr>
@@ -1576,7 +1450,7 @@
           <w:sz w:val="20"/>
           <w:szCs w:val="20"/>
         </w:rPr>
-        <w:t xml:space="preserve">   (ref: &lt;10.00)</w:t>
+        <w:t xml:space="preserve">   (ref: 0.02–0.20 ug/gCR)</w:t>
       </w:r>
     </w:p>
     <w:p>
@@ -1601,7 +1475,7 @@
           <w:sz w:val="20"/>
           <w:szCs w:val="20"/>
         </w:rPr>
-        <w:t xml:space="preserve">Elevated. Per published frameworks, associated with HMF intake from heated/processed foods.</w:t>
+        <w:t xml:space="preserve">Below the laboratory reference framework — interpretation in this case is dominated by the low 2-OH substrate (the COMT ratio 2-MeO-E1/2-OH-E1 of 0.30 is within reference 0.05–0.50), suggesting substrate availability rather than COMT capacity is the rate-limiting step.</w:t>
       </w:r>
     </w:p>
     <w:p>
@@ -1626,7 +1500,7 @@
           <w:sz w:val="20"/>
           <w:szCs w:val="20"/>
         </w:rPr>
-        <w:t xml:space="preserve">Dietary HMF (caramelised, baked, roasted foods, dried fruit) — practitioner to assess.</w:t>
+        <w:t xml:space="preserve">Published literature notes that 2-MeO output is dependent on adequate 2-OH substrate and COMT cofactors (magnesium, SAMe/methyl donors) — practitioner to assess relevance.</w:t>
       </w:r>
     </w:p>
     <w:p>
@@ -1651,7 +1525,7 @@
           <w:sz w:val="20"/>
           <w:szCs w:val="20"/>
         </w:rPr>
-        <w:t xml:space="preserve">Supports Phase II conjugation and antioxidant inclusion.</w:t>
+        <w:t xml:space="preserve">Supports inclusion of methylation cofactors (methylcobalamin, calcium folinate, P5P, riboflavin, magnesium glycinate) at meaningful doses, alongside DIM to provide 2-OH substrate.</w:t>
       </w:r>
     </w:p>
     <w:p>
@@ -1667,16 +1541,16 @@
           <w:sz w:val="22"/>
           <w:szCs w:val="22"/>
         </w:rPr>
-        <w:t xml:space="preserve">8-hydroxy-deoxyguanosine (8-OHdG)</w:t>
-      </w:r>
-      <w:r>
-        <w:rPr>
-          <w:rFonts w:ascii="Roboto" w:cs="Roboto" w:eastAsia="Roboto" w:hAnsi="Roboto"/>
-          <w:color w:val="000000"/>
-          <w:sz w:val="22"/>
-          <w:szCs w:val="22"/>
-        </w:rPr>
-        <w:t xml:space="preserve">   3.80 umol/molCR</w:t>
+        <w:t xml:space="preserve">2-MeOH Estradiol</w:t>
+      </w:r>
+      <w:r>
+        <w:rPr>
+          <w:rFonts w:ascii="Roboto" w:cs="Roboto" w:eastAsia="Roboto" w:hAnsi="Roboto"/>
+          <w:color w:val="000000"/>
+          <w:sz w:val="22"/>
+          <w:szCs w:val="22"/>
+        </w:rPr>
+        <w:t xml:space="preserve">   0.01 ug/gCR</w:t>
       </w:r>
       <w:r>
         <w:rPr>
@@ -1687,7 +1561,7 @@
           <w:sz w:val="20"/>
           <w:szCs w:val="20"/>
         </w:rPr>
-        <w:t xml:space="preserve">   (ref: &lt;2.70)</w:t>
+        <w:t xml:space="preserve">   (ref: 0.01–0.08 ug/gCR)</w:t>
       </w:r>
     </w:p>
     <w:p>
@@ -1712,7 +1586,7 @@
           <w:sz w:val="20"/>
           <w:szCs w:val="20"/>
         </w:rPr>
-        <w:t xml:space="preserve">Elevated. Per published frameworks, a marker of oxidative DNA damage.</w:t>
+        <w:t xml:space="preserve">At the lower limit of the laboratory reference framework — pattern consistent with low downstream methylated metabolite, again reflecting low 2-OH substrate.</w:t>
       </w:r>
     </w:p>
     <w:p>
@@ -1737,7 +1611,7 @@
           <w:sz w:val="20"/>
           <w:szCs w:val="20"/>
         </w:rPr>
-        <w:t xml:space="preserve">Chronic oxidative stress, xenobiotic burden, inflammatory load — practitioner to assess.</w:t>
+        <w:t xml:space="preserve">Published literature: same as 2-MeOH Estrone above.</w:t>
       </w:r>
     </w:p>
     <w:p>
@@ -1762,7 +1636,7 @@
           <w:sz w:val="20"/>
           <w:szCs w:val="20"/>
         </w:rPr>
-        <w:t xml:space="preserve">Anchors the antioxidant/redox axis: NAC, vitamin C, vitamin E, resveratrol, milk thistle.</w:t>
+        <w:t xml:space="preserve">Same as 2-MeOH Estrone — methylation cofactor and DIM support.</w:t>
       </w:r>
     </w:p>
     <w:p>
@@ -1778,16 +1652,16 @@
           <w:sz w:val="22"/>
           <w:szCs w:val="22"/>
         </w:rPr>
-        <w:t xml:space="preserve">Leukotriene E4</w:t>
-      </w:r>
-      <w:r>
-        <w:rPr>
-          <w:rFonts w:ascii="Roboto" w:cs="Roboto" w:eastAsia="Roboto" w:hAnsi="Roboto"/>
-          <w:color w:val="000000"/>
-          <w:sz w:val="22"/>
-          <w:szCs w:val="22"/>
-        </w:rPr>
-        <w:t xml:space="preserve">   195.00 pg/mgCR</w:t>
+        <w:t xml:space="preserve">4-OH Estradiol</w:t>
+      </w:r>
+      <w:r>
+        <w:rPr>
+          <w:rFonts w:ascii="Roboto" w:cs="Roboto" w:eastAsia="Roboto" w:hAnsi="Roboto"/>
+          <w:color w:val="000000"/>
+          <w:sz w:val="22"/>
+          <w:szCs w:val="22"/>
+        </w:rPr>
+        <w:t xml:space="preserve">   &lt;DL ug/gCR</w:t>
       </w:r>
       <w:r>
         <w:rPr>
@@ -1798,7 +1672,7 @@
           <w:sz w:val="20"/>
           <w:szCs w:val="20"/>
         </w:rPr>
-        <w:t xml:space="preserve">   (ref: &lt;100.00)</w:t>
+        <w:t xml:space="preserve">   (ref: 0.02–0.25 ug/gCR)</w:t>
       </w:r>
     </w:p>
     <w:p>
@@ -1823,7 +1697,7 @@
           <w:sz w:val="20"/>
           <w:szCs w:val="20"/>
         </w:rPr>
-        <w:t xml:space="preserve">Elevated. Per published frameworks, suggests increased 5-LOX inflammatory pathway activity.</w:t>
+        <w:t xml:space="preserve">Below detection — consistent with low genotoxic 4-OH metabolite output, generally a favourable pattern per the laboratory framework.</w:t>
       </w:r>
     </w:p>
     <w:p>
@@ -1848,7 +1722,7 @@
           <w:sz w:val="20"/>
           <w:szCs w:val="20"/>
         </w:rPr>
-        <w:t xml:space="preserve">Mast-cell activation, allergic inflammation, atopy — practitioner to assess.</w:t>
+        <w:t xml:space="preserve">Published literature notes that 4-OH metabolites reflect CYP1B1 activity; low values are generally considered protective relative to high values.</w:t>
       </w:r>
     </w:p>
     <w:p>
@@ -1873,7 +1747,7 @@
           <w:sz w:val="20"/>
           <w:szCs w:val="20"/>
         </w:rPr>
-        <w:t xml:space="preserve">Supports inclusion of anti-inflammatory ingredients with 5-LOX coverage (Boswellia, quercetin) and curcumin for NF-κB.</w:t>
+        <w:t xml:space="preserve">Does not drive specific stack additions; NAC and quercetin (included for other reasons) provide quinone-quenching capacity if 4-OH output rises.</w:t>
       </w:r>
     </w:p>
     <w:p>
@@ -1889,16 +1763,16 @@
           <w:sz w:val="22"/>
           <w:szCs w:val="22"/>
         </w:rPr>
-        <w:t xml:space="preserve">Isocitric Acid</w:t>
-      </w:r>
-      <w:r>
-        <w:rPr>
-          <w:rFonts w:ascii="Roboto" w:cs="Roboto" w:eastAsia="Roboto" w:hAnsi="Roboto"/>
-          <w:color w:val="000000"/>
-          <w:sz w:val="22"/>
-          <w:szCs w:val="22"/>
-        </w:rPr>
-        <w:t xml:space="preserve">   86.00 mmol/molCR</w:t>
+        <w:t xml:space="preserve">4-OH Estrone</w:t>
+      </w:r>
+      <w:r>
+        <w:rPr>
+          <w:rFonts w:ascii="Roboto" w:cs="Roboto" w:eastAsia="Roboto" w:hAnsi="Roboto"/>
+          <w:color w:val="000000"/>
+          <w:sz w:val="22"/>
+          <w:szCs w:val="22"/>
+        </w:rPr>
+        <w:t xml:space="preserve">   0.03 ug/gCR</w:t>
       </w:r>
       <w:r>
         <w:rPr>
@@ -1909,7 +1783,7 @@
           <w:sz w:val="20"/>
           <w:szCs w:val="20"/>
         </w:rPr>
-        <w:t xml:space="preserve">   (ref: 5.00-65.00)</w:t>
+        <w:t xml:space="preserve">   (ref: 0.03–0.30 ug/gCR)</w:t>
       </w:r>
     </w:p>
     <w:p>
@@ -1934,7 +1808,7 @@
           <w:sz w:val="20"/>
           <w:szCs w:val="20"/>
         </w:rPr>
-        <w:t xml:space="preserve">Elevated. Per published frameworks, suggests reduced isocitrate dehydrogenase flux — manganese/Mg/NAD+ dependent.</w:t>
+        <w:t xml:space="preserve">At the lower limit of the laboratory reference framework — favourable pattern per laboratory comment.</w:t>
       </w:r>
     </w:p>
     <w:p>
@@ -1959,7 +1833,7 @@
           <w:sz w:val="20"/>
           <w:szCs w:val="20"/>
         </w:rPr>
-        <w:t xml:space="preserve">Mitochondrial strain, manganese functional insufficiency, NAD+ availability — practitioner to assess.</w:t>
+        <w:t xml:space="preserve">Same as 4-OH Estradiol above.</w:t>
       </w:r>
     </w:p>
     <w:p>
@@ -1984,7 +1858,7 @@
           <w:sz w:val="20"/>
           <w:szCs w:val="20"/>
         </w:rPr>
-        <w:t xml:space="preserve">Supports mitochondrial/cardiovascular axis: CoQ10, alpha-lipoic acid, B-vitamin cofactors.</w:t>
+        <w:t xml:space="preserve">Not a primary driver of formulation.</w:t>
       </w:r>
     </w:p>
     <w:p>
@@ -2000,16 +1874,16 @@
           <w:sz w:val="22"/>
           <w:szCs w:val="22"/>
         </w:rPr>
-        <w:t xml:space="preserve">2-Oxoglutaric Acid (alpha-ketoglutarate)</w:t>
-      </w:r>
-      <w:r>
-        <w:rPr>
-          <w:rFonts w:ascii="Roboto" w:cs="Roboto" w:eastAsia="Roboto" w:hAnsi="Roboto"/>
-          <w:color w:val="000000"/>
-          <w:sz w:val="22"/>
-          <w:szCs w:val="22"/>
-        </w:rPr>
-        <w:t xml:space="preserve">   65.00 mmol/molCR</w:t>
+        <w:t xml:space="preserve">4-MeOH E2/4-OH E2 ratio</w:t>
+      </w:r>
+      <w:r>
+        <w:rPr>
+          <w:rFonts w:ascii="Roboto" w:cs="Roboto" w:eastAsia="Roboto" w:hAnsi="Roboto"/>
+          <w:color w:val="000000"/>
+          <w:sz w:val="22"/>
+          <w:szCs w:val="22"/>
+        </w:rPr>
+        <w:t xml:space="preserve">   4.39</w:t>
       </w:r>
       <w:r>
         <w:rPr>
@@ -2020,7 +1894,7 @@
           <w:sz w:val="20"/>
           <w:szCs w:val="20"/>
         </w:rPr>
-        <w:t xml:space="preserve">   (ref: 2.00-45.00)</w:t>
+        <w:t xml:space="preserve">   (ref: 0.06–1.03)</w:t>
       </w:r>
     </w:p>
     <w:p>
@@ -2045,7 +1919,7 @@
           <w:sz w:val="20"/>
           <w:szCs w:val="20"/>
         </w:rPr>
-        <w:t xml:space="preserve">Elevated. Per published frameworks, may reflect 2-OG dehydrogenase flux limitation (B1, B2, B3, B5, lipoic acid dependent).</w:t>
+        <w:t xml:space="preserve">Above the laboratory reference framework — the laboratory comment characterises this as reflecting efficient methylation of 4-OH metabolites, a generally favourable pattern.</w:t>
       </w:r>
     </w:p>
     <w:p>
@@ -2070,7 +1944,7 @@
           <w:sz w:val="20"/>
           <w:szCs w:val="20"/>
         </w:rPr>
-        <w:t xml:space="preserve">B-vitamin cofactor insufficiency, mitochondrial strain — practitioner to assess.</w:t>
+        <w:t xml:space="preserve">Published literature notes that elevated methylated/hydroxylated ratios suggest active COMT-mediated detoxification of catechol oestrogens.</w:t>
       </w:r>
     </w:p>
     <w:p>
@@ -2095,7 +1969,7 @@
           <w:sz w:val="20"/>
           <w:szCs w:val="20"/>
         </w:rPr>
-        <w:t xml:space="preserve">Supports inclusion of B1, B2, B3, B5 and alpha-lipoic acid.</w:t>
+        <w:t xml:space="preserve">Suggests COMT methylation capacity for the 4-OH branch is preserved; does not contraindicate methylation cofactor support given 2-OH branch substrate is the limiting factor.</w:t>
       </w:r>
     </w:p>
     <w:p>
@@ -2111,16 +1985,16 @@
           <w:sz w:val="22"/>
           <w:szCs w:val="22"/>
         </w:rPr>
-        <w:t xml:space="preserve">3-Methylglutaconic Acid</w:t>
-      </w:r>
-      <w:r>
-        <w:rPr>
-          <w:rFonts w:ascii="Roboto" w:cs="Roboto" w:eastAsia="Roboto" w:hAnsi="Roboto"/>
-          <w:color w:val="000000"/>
-          <w:sz w:val="22"/>
-          <w:szCs w:val="22"/>
-        </w:rPr>
-        <w:t xml:space="preserve">   6.32 mmol/molCR</w:t>
+        <w:t xml:space="preserve">Testosterone</w:t>
+      </w:r>
+      <w:r>
+        <w:rPr>
+          <w:rFonts w:ascii="Roboto" w:cs="Roboto" w:eastAsia="Roboto" w:hAnsi="Roboto"/>
+          <w:color w:val="000000"/>
+          <w:sz w:val="22"/>
+          <w:szCs w:val="22"/>
+        </w:rPr>
+        <w:t xml:space="preserve">   15.38 ug/gCR</w:t>
       </w:r>
       <w:r>
         <w:rPr>
@@ -2131,7 +2005,7 @@
           <w:sz w:val="20"/>
           <w:szCs w:val="20"/>
         </w:rPr>
-        <w:t xml:space="preserve">   (ref: &lt;5.50)</w:t>
+        <w:t xml:space="preserve">   (ref: 2.50–25.00 ug/gCR)</w:t>
       </w:r>
     </w:p>
     <w:p>
@@ -2156,7 +2030,7 @@
           <w:sz w:val="20"/>
           <w:szCs w:val="20"/>
         </w:rPr>
-        <w:t xml:space="preserve">Mildly elevated. Per published frameworks, may reflect mitochondrial leucine metabolism strain.</w:t>
+        <w:t xml:space="preserve">Within laboratory reference framework, upper-middle of range.</w:t>
       </w:r>
     </w:p>
     <w:p>
@@ -2181,7 +2055,7 @@
           <w:sz w:val="20"/>
           <w:szCs w:val="20"/>
         </w:rPr>
-        <w:t xml:space="preserve">Mitochondrial inner-membrane stress, CoQ10 status — practitioner to assess.</w:t>
+        <w:t xml:space="preserve">Not flagged.</w:t>
       </w:r>
     </w:p>
     <w:p>
@@ -2206,7 +2080,7 @@
           <w:sz w:val="20"/>
           <w:szCs w:val="20"/>
         </w:rPr>
-        <w:t xml:space="preserve">Reinforces CoQ10 and mitochondrial support.</w:t>
+        <w:t xml:space="preserve">Does not drive androgen-specific inclusions; supports moderate (not high) zinc dosing rather than maximal 5-alpha-reductase suppression.</w:t>
       </w:r>
     </w:p>
     <w:p>
@@ -2222,16 +2096,16 @@
           <w:sz w:val="22"/>
           <w:szCs w:val="22"/>
         </w:rPr>
-        <w:t xml:space="preserve">Mevalonolactone</w:t>
-      </w:r>
-      <w:r>
-        <w:rPr>
-          <w:rFonts w:ascii="Roboto" w:cs="Roboto" w:eastAsia="Roboto" w:hAnsi="Roboto"/>
-          <w:color w:val="000000"/>
-          <w:sz w:val="22"/>
-          <w:szCs w:val="22"/>
-        </w:rPr>
-        <w:t xml:space="preserve">   2.80 mmol/molCR</w:t>
+        <w:t xml:space="preserve">DHEA</w:t>
+      </w:r>
+      <w:r>
+        <w:rPr>
+          <w:rFonts w:ascii="Roboto" w:cs="Roboto" w:eastAsia="Roboto" w:hAnsi="Roboto"/>
+          <w:color w:val="000000"/>
+          <w:sz w:val="22"/>
+          <w:szCs w:val="22"/>
+        </w:rPr>
+        <w:t xml:space="preserve">   16.27 ug/gCR</w:t>
       </w:r>
       <w:r>
         <w:rPr>
@@ -2242,7 +2116,7 @@
           <w:sz w:val="20"/>
           <w:szCs w:val="20"/>
         </w:rPr>
-        <w:t xml:space="preserve">   (ref: &lt;2.00)</w:t>
+        <w:t xml:space="preserve">   (ref: 9.00–105.00 ug/gCR)</w:t>
       </w:r>
     </w:p>
     <w:p>
@@ -2267,7 +2141,7 @@
           <w:sz w:val="20"/>
           <w:szCs w:val="20"/>
         </w:rPr>
-        <w:t xml:space="preserve">Elevated. Per published frameworks, mevalonate pathway flux marker — relevant to CoQ10 synthesis.</w:t>
+        <w:t xml:space="preserve">Within reference, lower portion of range — alongside low cortisol, pattern consistent with reduced overall adrenal steroidogenic output.</w:t>
       </w:r>
     </w:p>
     <w:p>
@@ -2292,7 +2166,7 @@
           <w:sz w:val="20"/>
           <w:szCs w:val="20"/>
         </w:rPr>
-        <w:t xml:space="preserve">HMG-CoA reductase activity, statin use — practitioner to assess.</w:t>
+        <w:t xml:space="preserve">Published literature identifies HPA suppression as a contributor to reduced DHEA in conjunction with reduced cortisol.</w:t>
       </w:r>
     </w:p>
     <w:p>
@@ -2317,7 +2191,7 @@
           <w:sz w:val="20"/>
           <w:szCs w:val="20"/>
         </w:rPr>
-        <w:t xml:space="preserve">Supports CoQ10 inclusion.</w:t>
+        <w:t xml:space="preserve">Reinforces adaptogenic axis priority.</w:t>
       </w:r>
     </w:p>
     <w:p>
@@ -2333,16 +2207,16 @@
           <w:sz w:val="22"/>
           <w:szCs w:val="22"/>
         </w:rPr>
-        <w:t xml:space="preserve">Adipic Acid</w:t>
-      </w:r>
-      <w:r>
-        <w:rPr>
-          <w:rFonts w:ascii="Roboto" w:cs="Roboto" w:eastAsia="Roboto" w:hAnsi="Roboto"/>
-          <w:color w:val="000000"/>
-          <w:sz w:val="22"/>
-          <w:szCs w:val="22"/>
-        </w:rPr>
-        <w:t xml:space="preserve">   4.30 mmol/molCR</w:t>
+        <w:t xml:space="preserve">Pregnanediol</w:t>
+      </w:r>
+      <w:r>
+        <w:rPr>
+          <w:rFonts w:ascii="Roboto" w:cs="Roboto" w:eastAsia="Roboto" w:hAnsi="Roboto"/>
+          <w:color w:val="000000"/>
+          <w:sz w:val="22"/>
+          <w:szCs w:val="22"/>
+        </w:rPr>
+        <w:t xml:space="preserve">   36 ug/gCR</w:t>
       </w:r>
       <w:r>
         <w:rPr>
@@ -2353,7 +2227,7 @@
           <w:sz w:val="20"/>
           <w:szCs w:val="20"/>
         </w:rPr>
-        <w:t xml:space="preserve">   (ref: &lt;3.80)</w:t>
+        <w:t xml:space="preserve">   (ref: 25–150 ug/gCR)</w:t>
       </w:r>
     </w:p>
     <w:p>
@@ -2378,7 +2252,7 @@
           <w:sz w:val="20"/>
           <w:szCs w:val="20"/>
         </w:rPr>
-        <w:t xml:space="preserve">Mildly elevated. Per published frameworks, suggests increased fatty-acid omega-oxidation when beta-oxidation is constrained.</w:t>
+        <w:t xml:space="preserve">Within reference, lower portion of range — not flagged.</w:t>
       </w:r>
     </w:p>
     <w:p>
@@ -2403,7 +2277,7 @@
           <w:sz w:val="20"/>
           <w:szCs w:val="20"/>
         </w:rPr>
-        <w:t xml:space="preserve">Carnitine status, mitochondrial fatty acid oxidation strain — practitioner to assess.</w:t>
+        <w:t xml:space="preserve">Not relevant to formulation here.</w:t>
       </w:r>
     </w:p>
     <w:p>
@@ -2428,7 +2302,7 @@
           <w:sz w:val="20"/>
           <w:szCs w:val="20"/>
         </w:rPr>
-        <w:t xml:space="preserve">Supports mitochondrial axis (CoQ10, ALA). L-carnitine not in supplied Library — surfaced as standalone.</w:t>
+        <w:t xml:space="preserve">No specific addition; not a driver in male physiology of this pattern.</w:t>
       </w:r>
     </w:p>
     <w:p>
@@ -2444,16 +2318,16 @@
           <w:sz w:val="22"/>
           <w:szCs w:val="22"/>
         </w:rPr>
-        <w:t xml:space="preserve">Quinolinic Acid</w:t>
-      </w:r>
-      <w:r>
-        <w:rPr>
-          <w:rFonts w:ascii="Roboto" w:cs="Roboto" w:eastAsia="Roboto" w:hAnsi="Roboto"/>
-          <w:color w:val="000000"/>
-          <w:sz w:val="22"/>
-          <w:szCs w:val="22"/>
-        </w:rPr>
-        <w:t xml:space="preserve">   11.80 mmol/molCR</w:t>
+        <w:t xml:space="preserve">Endocrine disruptor panel (BPA, PFAS, PFOA, PFOS, Al, As, Cd, Cr, Pb, Hg, Ni)</w:t>
+      </w:r>
+      <w:r>
+        <w:rPr>
+          <w:rFonts w:ascii="Roboto" w:cs="Roboto" w:eastAsia="Roboto" w:hAnsi="Roboto"/>
+          <w:color w:val="000000"/>
+          <w:sz w:val="22"/>
+          <w:szCs w:val="22"/>
+        </w:rPr>
+        <w:t xml:space="preserve">   All below or near detection limits within reference</w:t>
       </w:r>
       <w:r>
         <w:rPr>
@@ -2464,7 +2338,7 @@
           <w:sz w:val="20"/>
           <w:szCs w:val="20"/>
         </w:rPr>
-        <w:t xml:space="preserve">   (ref: &lt;9.10)</w:t>
+        <w:t xml:space="preserve">   (ref: Per laboratory framework)</w:t>
       </w:r>
     </w:p>
     <w:p>
@@ -2489,7 +2363,7 @@
           <w:sz w:val="20"/>
           <w:szCs w:val="20"/>
         </w:rPr>
-        <w:t xml:space="preserve">Elevated. Per published frameworks, kynurenine pathway shifted toward the neurotoxic arm.</w:t>
+        <w:t xml:space="preserve">No evidence of significant environmental exposure burden on this panel — favourable.</w:t>
       </w:r>
     </w:p>
     <w:p>
@@ -2514,7 +2388,7 @@
           <w:sz w:val="20"/>
           <w:szCs w:val="20"/>
         </w:rPr>
-        <w:t xml:space="preserve">Inflammatory IDO induction, B6 insufficiency at kynureninase step — practitioner to assess.</w:t>
+        <w:t xml:space="preserve">Not applicable.</w:t>
       </w:r>
     </w:p>
     <w:p>
@@ -2539,1450 +2413,7 @@
           <w:sz w:val="20"/>
           <w:szCs w:val="20"/>
         </w:rPr>
-        <w:t xml:space="preserve">Supports P5P (active B6) and anti-inflammatory inclusion.</w:t>
-      </w:r>
-    </w:p>
-    <w:p>
-      <w:pPr>
-        <w:spacing w:after="60" w:before="120"/>
-      </w:pPr>
-      <w:r>
-        <w:rPr>
-          <w:rFonts w:ascii="Roboto" w:cs="Roboto" w:eastAsia="Roboto" w:hAnsi="Roboto"/>
-          <w:b/>
-          <w:bCs/>
-          <w:color w:val="535B50"/>
-          <w:sz w:val="22"/>
-          <w:szCs w:val="22"/>
-        </w:rPr>
-        <w:t xml:space="preserve">Kynurenic Acid</w:t>
-      </w:r>
-      <w:r>
-        <w:rPr>
-          <w:rFonts w:ascii="Roboto" w:cs="Roboto" w:eastAsia="Roboto" w:hAnsi="Roboto"/>
-          <w:color w:val="000000"/>
-          <w:sz w:val="22"/>
-          <w:szCs w:val="22"/>
-        </w:rPr>
-        <w:t xml:space="preserve">   3.10 mmol/molCR</w:t>
-      </w:r>
-      <w:r>
-        <w:rPr>
-          <w:rFonts w:ascii="Roboto" w:cs="Roboto" w:eastAsia="Roboto" w:hAnsi="Roboto"/>
-          <w:i/>
-          <w:iCs/>
-          <w:color w:val="666666"/>
-          <w:sz w:val="20"/>
-          <w:szCs w:val="20"/>
-        </w:rPr>
-        <w:t xml:space="preserve">   (ref: &lt;2.20)</w:t>
-      </w:r>
-    </w:p>
-    <w:p>
-      <w:pPr>
-        <w:spacing w:after="60"/>
-      </w:pPr>
-      <w:r>
-        <w:rPr>
-          <w:rFonts w:ascii="Roboto" w:cs="Roboto" w:eastAsia="Roboto" w:hAnsi="Roboto"/>
-          <w:b/>
-          <w:bCs/>
-          <w:color w:val="535B50"/>
-          <w:sz w:val="20"/>
-          <w:szCs w:val="20"/>
-        </w:rPr>
-        <w:t xml:space="preserve">Interpretation: </w:t>
-      </w:r>
-      <w:r>
-        <w:rPr>
-          <w:rFonts w:ascii="Roboto" w:cs="Roboto" w:eastAsia="Roboto" w:hAnsi="Roboto"/>
-          <w:color w:val="000000"/>
-          <w:sz w:val="20"/>
-          <w:szCs w:val="20"/>
-        </w:rPr>
-        <w:t xml:space="preserve">Elevated. Pattern of kynurenine pathway upregulation.</w:t>
-      </w:r>
-    </w:p>
-    <w:p>
-      <w:pPr>
-        <w:spacing w:after="60"/>
-      </w:pPr>
-      <w:r>
-        <w:rPr>
-          <w:rFonts w:ascii="Roboto" w:cs="Roboto" w:eastAsia="Roboto" w:hAnsi="Roboto"/>
-          <w:b/>
-          <w:bCs/>
-          <w:color w:val="535B50"/>
-          <w:sz w:val="20"/>
-          <w:szCs w:val="20"/>
-        </w:rPr>
-        <w:t xml:space="preserve">Possible contributors: </w:t>
-      </w:r>
-      <w:r>
-        <w:rPr>
-          <w:rFonts w:ascii="Roboto" w:cs="Roboto" w:eastAsia="Roboto" w:hAnsi="Roboto"/>
-          <w:color w:val="000000"/>
-          <w:sz w:val="20"/>
-          <w:szCs w:val="20"/>
-        </w:rPr>
-        <w:t xml:space="preserve">Pro-inflammatory state — practitioner to assess.</w:t>
-      </w:r>
-    </w:p>
-    <w:p>
-      <w:pPr>
-        <w:spacing w:after="60"/>
-      </w:pPr>
-      <w:r>
-        <w:rPr>
-          <w:rFonts w:ascii="Roboto" w:cs="Roboto" w:eastAsia="Roboto" w:hAnsi="Roboto"/>
-          <w:b/>
-          <w:bCs/>
-          <w:color w:val="535B50"/>
-          <w:sz w:val="20"/>
-          <w:szCs w:val="20"/>
-        </w:rPr>
-        <w:t xml:space="preserve">Relevance to formulation: </w:t>
-      </w:r>
-      <w:r>
-        <w:rPr>
-          <w:rFonts w:ascii="Roboto" w:cs="Roboto" w:eastAsia="Roboto" w:hAnsi="Roboto"/>
-          <w:color w:val="000000"/>
-          <w:sz w:val="20"/>
-          <w:szCs w:val="20"/>
-        </w:rPr>
-        <w:t xml:space="preserve">Supports anti-inflammatory and B6 inclusion.</w:t>
-      </w:r>
-    </w:p>
-    <w:p>
-      <w:pPr>
-        <w:spacing w:after="60" w:before="120"/>
-      </w:pPr>
-      <w:r>
-        <w:rPr>
-          <w:rFonts w:ascii="Roboto" w:cs="Roboto" w:eastAsia="Roboto" w:hAnsi="Roboto"/>
-          <w:b/>
-          <w:bCs/>
-          <w:color w:val="535B50"/>
-          <w:sz w:val="22"/>
-          <w:szCs w:val="22"/>
-        </w:rPr>
-        <w:t xml:space="preserve">Xanthurenic Acid</w:t>
-      </w:r>
-      <w:r>
-        <w:rPr>
-          <w:rFonts w:ascii="Roboto" w:cs="Roboto" w:eastAsia="Roboto" w:hAnsi="Roboto"/>
-          <w:color w:val="000000"/>
-          <w:sz w:val="22"/>
-          <w:szCs w:val="22"/>
-        </w:rPr>
-        <w:t xml:space="preserve">   1.92 mmol/molCR</w:t>
-      </w:r>
-      <w:r>
-        <w:rPr>
-          <w:rFonts w:ascii="Roboto" w:cs="Roboto" w:eastAsia="Roboto" w:hAnsi="Roboto"/>
-          <w:i/>
-          <w:iCs/>
-          <w:color w:val="666666"/>
-          <w:sz w:val="20"/>
-          <w:szCs w:val="20"/>
-        </w:rPr>
-        <w:t xml:space="preserve">   (ref: &lt;0.96)</w:t>
-      </w:r>
-    </w:p>
-    <w:p>
-      <w:pPr>
-        <w:spacing w:after="60"/>
-      </w:pPr>
-      <w:r>
-        <w:rPr>
-          <w:rFonts w:ascii="Roboto" w:cs="Roboto" w:eastAsia="Roboto" w:hAnsi="Roboto"/>
-          <w:b/>
-          <w:bCs/>
-          <w:color w:val="535B50"/>
-          <w:sz w:val="20"/>
-          <w:szCs w:val="20"/>
-        </w:rPr>
-        <w:t xml:space="preserve">Interpretation: </w:t>
-      </w:r>
-      <w:r>
-        <w:rPr>
-          <w:rFonts w:ascii="Roboto" w:cs="Roboto" w:eastAsia="Roboto" w:hAnsi="Roboto"/>
-          <w:color w:val="000000"/>
-          <w:sz w:val="20"/>
-          <w:szCs w:val="20"/>
-        </w:rPr>
-        <w:t xml:space="preserve">Elevated. Per published frameworks, classical functional marker of B6 insufficiency at the kynureninase step.</w:t>
-      </w:r>
-    </w:p>
-    <w:p>
-      <w:pPr>
-        <w:spacing w:after="60"/>
-      </w:pPr>
-      <w:r>
-        <w:rPr>
-          <w:rFonts w:ascii="Roboto" w:cs="Roboto" w:eastAsia="Roboto" w:hAnsi="Roboto"/>
-          <w:b/>
-          <w:bCs/>
-          <w:color w:val="535B50"/>
-          <w:sz w:val="20"/>
-          <w:szCs w:val="20"/>
-        </w:rPr>
-        <w:t xml:space="preserve">Possible contributors: </w:t>
-      </w:r>
-      <w:r>
-        <w:rPr>
-          <w:rFonts w:ascii="Roboto" w:cs="Roboto" w:eastAsia="Roboto" w:hAnsi="Roboto"/>
-          <w:color w:val="000000"/>
-          <w:sz w:val="20"/>
-          <w:szCs w:val="20"/>
-        </w:rPr>
-        <w:t xml:space="preserve">Functional B6 insufficiency — practitioner to assess.</w:t>
-      </w:r>
-    </w:p>
-    <w:p>
-      <w:pPr>
-        <w:spacing w:after="60"/>
-      </w:pPr>
-      <w:r>
-        <w:rPr>
-          <w:rFonts w:ascii="Roboto" w:cs="Roboto" w:eastAsia="Roboto" w:hAnsi="Roboto"/>
-          <w:b/>
-          <w:bCs/>
-          <w:color w:val="535B50"/>
-          <w:sz w:val="20"/>
-          <w:szCs w:val="20"/>
-        </w:rPr>
-        <w:t xml:space="preserve">Relevance to formulation: </w:t>
-      </w:r>
-      <w:r>
-        <w:rPr>
-          <w:rFonts w:ascii="Roboto" w:cs="Roboto" w:eastAsia="Roboto" w:hAnsi="Roboto"/>
-          <w:color w:val="000000"/>
-          <w:sz w:val="20"/>
-          <w:szCs w:val="20"/>
-        </w:rPr>
-        <w:t xml:space="preserve">Anchors inclusion of pyridoxal-5-phosphate (P5P).</w:t>
-      </w:r>
-    </w:p>
-    <w:p>
-      <w:pPr>
-        <w:spacing w:after="60" w:before="120"/>
-      </w:pPr>
-      <w:r>
-        <w:rPr>
-          <w:rFonts w:ascii="Roboto" w:cs="Roboto" w:eastAsia="Roboto" w:hAnsi="Roboto"/>
-          <w:b/>
-          <w:bCs/>
-          <w:color w:val="535B50"/>
-          <w:sz w:val="22"/>
-          <w:szCs w:val="22"/>
-        </w:rPr>
-        <w:t xml:space="preserve">Quinolinic/5-HIAA Ratio</w:t>
-      </w:r>
-      <w:r>
-        <w:rPr>
-          <w:rFonts w:ascii="Roboto" w:cs="Roboto" w:eastAsia="Roboto" w:hAnsi="Roboto"/>
-          <w:color w:val="000000"/>
-          <w:sz w:val="22"/>
-          <w:szCs w:val="22"/>
-        </w:rPr>
-        <w:t xml:space="preserve">   10.4 ratio</w:t>
-      </w:r>
-      <w:r>
-        <w:rPr>
-          <w:rFonts w:ascii="Roboto" w:cs="Roboto" w:eastAsia="Roboto" w:hAnsi="Roboto"/>
-          <w:i/>
-          <w:iCs/>
-          <w:color w:val="666666"/>
-          <w:sz w:val="20"/>
-          <w:szCs w:val="20"/>
-        </w:rPr>
-        <w:t xml:space="preserve">   (ref: &lt;5.0)</w:t>
-      </w:r>
-    </w:p>
-    <w:p>
-      <w:pPr>
-        <w:spacing w:after="60"/>
-      </w:pPr>
-      <w:r>
-        <w:rPr>
-          <w:rFonts w:ascii="Roboto" w:cs="Roboto" w:eastAsia="Roboto" w:hAnsi="Roboto"/>
-          <w:b/>
-          <w:bCs/>
-          <w:color w:val="535B50"/>
-          <w:sz w:val="20"/>
-          <w:szCs w:val="20"/>
-        </w:rPr>
-        <w:t xml:space="preserve">Interpretation: </w:t>
-      </w:r>
-      <w:r>
-        <w:rPr>
-          <w:rFonts w:ascii="Roboto" w:cs="Roboto" w:eastAsia="Roboto" w:hAnsi="Roboto"/>
-          <w:color w:val="000000"/>
-          <w:sz w:val="20"/>
-          <w:szCs w:val="20"/>
-        </w:rPr>
-        <w:t xml:space="preserve">Elevated. Pattern suggestive of tryptophan diversion away from serotonin toward kynurenine arm.</w:t>
-      </w:r>
-    </w:p>
-    <w:p>
-      <w:pPr>
-        <w:spacing w:after="60"/>
-      </w:pPr>
-      <w:r>
-        <w:rPr>
-          <w:rFonts w:ascii="Roboto" w:cs="Roboto" w:eastAsia="Roboto" w:hAnsi="Roboto"/>
-          <w:b/>
-          <w:bCs/>
-          <w:color w:val="535B50"/>
-          <w:sz w:val="20"/>
-          <w:szCs w:val="20"/>
-        </w:rPr>
-        <w:t xml:space="preserve">Possible contributors: </w:t>
-      </w:r>
-      <w:r>
-        <w:rPr>
-          <w:rFonts w:ascii="Roboto" w:cs="Roboto" w:eastAsia="Roboto" w:hAnsi="Roboto"/>
-          <w:color w:val="000000"/>
-          <w:sz w:val="20"/>
-          <w:szCs w:val="20"/>
-        </w:rPr>
-        <w:t xml:space="preserve">Inflammation-driven IDO upregulation — practitioner to assess.</w:t>
-      </w:r>
-    </w:p>
-    <w:p>
-      <w:pPr>
-        <w:spacing w:after="60"/>
-      </w:pPr>
-      <w:r>
-        <w:rPr>
-          <w:rFonts w:ascii="Roboto" w:cs="Roboto" w:eastAsia="Roboto" w:hAnsi="Roboto"/>
-          <w:b/>
-          <w:bCs/>
-          <w:color w:val="535B50"/>
-          <w:sz w:val="20"/>
-          <w:szCs w:val="20"/>
-        </w:rPr>
-        <w:t xml:space="preserve">Relevance to formulation: </w:t>
-      </w:r>
-      <w:r>
-        <w:rPr>
-          <w:rFonts w:ascii="Roboto" w:cs="Roboto" w:eastAsia="Roboto" w:hAnsi="Roboto"/>
-          <w:color w:val="000000"/>
-          <w:sz w:val="20"/>
-          <w:szCs w:val="20"/>
-        </w:rPr>
-        <w:t xml:space="preserve">Supports anti-inflammatory axis and B6 cofactor.</w:t>
-      </w:r>
-    </w:p>
-    <w:p>
-      <w:pPr>
-        <w:spacing w:after="60" w:before="120"/>
-      </w:pPr>
-      <w:r>
-        <w:rPr>
-          <w:rFonts w:ascii="Roboto" w:cs="Roboto" w:eastAsia="Roboto" w:hAnsi="Roboto"/>
-          <w:b/>
-          <w:bCs/>
-          <w:color w:val="535B50"/>
-          <w:sz w:val="22"/>
-          <w:szCs w:val="22"/>
-        </w:rPr>
-        <w:t xml:space="preserve">5-Methylcytosine</w:t>
-      </w:r>
-      <w:r>
-        <w:rPr>
-          <w:rFonts w:ascii="Roboto" w:cs="Roboto" w:eastAsia="Roboto" w:hAnsi="Roboto"/>
-          <w:color w:val="000000"/>
-          <w:sz w:val="22"/>
-          <w:szCs w:val="22"/>
-        </w:rPr>
-        <w:t xml:space="preserve">   68.00 mmol/molCR</w:t>
-      </w:r>
-      <w:r>
-        <w:rPr>
-          <w:rFonts w:ascii="Roboto" w:cs="Roboto" w:eastAsia="Roboto" w:hAnsi="Roboto"/>
-          <w:i/>
-          <w:iCs/>
-          <w:color w:val="666666"/>
-          <w:sz w:val="20"/>
-          <w:szCs w:val="20"/>
-        </w:rPr>
-        <w:t xml:space="preserve">   (ref: 10.00-50.00)</w:t>
-      </w:r>
-    </w:p>
-    <w:p>
-      <w:pPr>
-        <w:spacing w:after="60"/>
-      </w:pPr>
-      <w:r>
-        <w:rPr>
-          <w:rFonts w:ascii="Roboto" w:cs="Roboto" w:eastAsia="Roboto" w:hAnsi="Roboto"/>
-          <w:b/>
-          <w:bCs/>
-          <w:color w:val="535B50"/>
-          <w:sz w:val="20"/>
-          <w:szCs w:val="20"/>
-        </w:rPr>
-        <w:t xml:space="preserve">Interpretation: </w:t>
-      </w:r>
-      <w:r>
-        <w:rPr>
-          <w:rFonts w:ascii="Roboto" w:cs="Roboto" w:eastAsia="Roboto" w:hAnsi="Roboto"/>
-          <w:color w:val="000000"/>
-          <w:sz w:val="20"/>
-          <w:szCs w:val="20"/>
-        </w:rPr>
-        <w:t xml:space="preserve">Elevated. Per published frameworks, may reflect altered methylation/DNA turnover.</w:t>
-      </w:r>
-    </w:p>
-    <w:p>
-      <w:pPr>
-        <w:spacing w:after="60"/>
-      </w:pPr>
-      <w:r>
-        <w:rPr>
-          <w:rFonts w:ascii="Roboto" w:cs="Roboto" w:eastAsia="Roboto" w:hAnsi="Roboto"/>
-          <w:b/>
-          <w:bCs/>
-          <w:color w:val="535B50"/>
-          <w:sz w:val="20"/>
-          <w:szCs w:val="20"/>
-        </w:rPr>
-        <w:t xml:space="preserve">Possible contributors: </w:t>
-      </w:r>
-      <w:r>
-        <w:rPr>
-          <w:rFonts w:ascii="Roboto" w:cs="Roboto" w:eastAsia="Roboto" w:hAnsi="Roboto"/>
-          <w:color w:val="000000"/>
-          <w:sz w:val="20"/>
-          <w:szCs w:val="20"/>
-        </w:rPr>
-        <w:t xml:space="preserve">Methylation cycle stress, oxidative DNA turnover — practitioner to assess.</w:t>
-      </w:r>
-    </w:p>
-    <w:p>
-      <w:pPr>
-        <w:spacing w:after="60"/>
-      </w:pPr>
-      <w:r>
-        <w:rPr>
-          <w:rFonts w:ascii="Roboto" w:cs="Roboto" w:eastAsia="Roboto" w:hAnsi="Roboto"/>
-          <w:b/>
-          <w:bCs/>
-          <w:color w:val="535B50"/>
-          <w:sz w:val="20"/>
-          <w:szCs w:val="20"/>
-        </w:rPr>
-        <w:t xml:space="preserve">Relevance to formulation: </w:t>
-      </w:r>
-      <w:r>
-        <w:rPr>
-          <w:rFonts w:ascii="Roboto" w:cs="Roboto" w:eastAsia="Roboto" w:hAnsi="Roboto"/>
-          <w:color w:val="000000"/>
-          <w:sz w:val="20"/>
-          <w:szCs w:val="20"/>
-        </w:rPr>
-        <w:t xml:space="preserve">Supports B12/folate/B6/B2 inclusion.</w:t>
-      </w:r>
-    </w:p>
-    <w:p>
-      <w:pPr>
-        <w:spacing w:after="60" w:before="120"/>
-      </w:pPr>
-      <w:r>
-        <w:rPr>
-          <w:rFonts w:ascii="Roboto" w:cs="Roboto" w:eastAsia="Roboto" w:hAnsi="Roboto"/>
-          <w:b/>
-          <w:bCs/>
-          <w:color w:val="535B50"/>
-          <w:sz w:val="22"/>
-          <w:szCs w:val="22"/>
-        </w:rPr>
-        <w:t xml:space="preserve">Guanidinoacetic Acid</w:t>
-      </w:r>
-      <w:r>
-        <w:rPr>
-          <w:rFonts w:ascii="Roboto" w:cs="Roboto" w:eastAsia="Roboto" w:hAnsi="Roboto"/>
-          <w:color w:val="000000"/>
-          <w:sz w:val="22"/>
-          <w:szCs w:val="22"/>
-        </w:rPr>
-        <w:t xml:space="preserve">   4.80 mmol/molCR</w:t>
-      </w:r>
-      <w:r>
-        <w:rPr>
-          <w:rFonts w:ascii="Roboto" w:cs="Roboto" w:eastAsia="Roboto" w:hAnsi="Roboto"/>
-          <w:i/>
-          <w:iCs/>
-          <w:color w:val="666666"/>
-          <w:sz w:val="20"/>
-          <w:szCs w:val="20"/>
-        </w:rPr>
-        <w:t xml:space="preserve">   (ref: 0.50-3.00)</w:t>
-      </w:r>
-    </w:p>
-    <w:p>
-      <w:pPr>
-        <w:spacing w:after="60"/>
-      </w:pPr>
-      <w:r>
-        <w:rPr>
-          <w:rFonts w:ascii="Roboto" w:cs="Roboto" w:eastAsia="Roboto" w:hAnsi="Roboto"/>
-          <w:b/>
-          <w:bCs/>
-          <w:color w:val="535B50"/>
-          <w:sz w:val="20"/>
-          <w:szCs w:val="20"/>
-        </w:rPr>
-        <w:t xml:space="preserve">Interpretation: </w:t>
-      </w:r>
-      <w:r>
-        <w:rPr>
-          <w:rFonts w:ascii="Roboto" w:cs="Roboto" w:eastAsia="Roboto" w:hAnsi="Roboto"/>
-          <w:color w:val="000000"/>
-          <w:sz w:val="20"/>
-          <w:szCs w:val="20"/>
-        </w:rPr>
-        <w:t xml:space="preserve">Elevated. Per published frameworks, methylation precursor accumulation suggests SAMe demand for creatine synthesis.</w:t>
-      </w:r>
-    </w:p>
-    <w:p>
-      <w:pPr>
-        <w:spacing w:after="60"/>
-      </w:pPr>
-      <w:r>
-        <w:rPr>
-          <w:rFonts w:ascii="Roboto" w:cs="Roboto" w:eastAsia="Roboto" w:hAnsi="Roboto"/>
-          <w:b/>
-          <w:bCs/>
-          <w:color w:val="535B50"/>
-          <w:sz w:val="20"/>
-          <w:szCs w:val="20"/>
-        </w:rPr>
-        <w:t xml:space="preserve">Possible contributors: </w:t>
-      </w:r>
-      <w:r>
-        <w:rPr>
-          <w:rFonts w:ascii="Roboto" w:cs="Roboto" w:eastAsia="Roboto" w:hAnsi="Roboto"/>
-          <w:color w:val="000000"/>
-          <w:sz w:val="20"/>
-          <w:szCs w:val="20"/>
-        </w:rPr>
-        <w:t xml:space="preserve">Methylation pathway demand exceeding supply — practitioner to assess.</w:t>
-      </w:r>
-    </w:p>
-    <w:p>
-      <w:pPr>
-        <w:spacing w:after="60"/>
-      </w:pPr>
-      <w:r>
-        <w:rPr>
-          <w:rFonts w:ascii="Roboto" w:cs="Roboto" w:eastAsia="Roboto" w:hAnsi="Roboto"/>
-          <w:b/>
-          <w:bCs/>
-          <w:color w:val="535B50"/>
-          <w:sz w:val="20"/>
-          <w:szCs w:val="20"/>
-        </w:rPr>
-        <w:t xml:space="preserve">Relevance to formulation: </w:t>
-      </w:r>
-      <w:r>
-        <w:rPr>
-          <w:rFonts w:ascii="Roboto" w:cs="Roboto" w:eastAsia="Roboto" w:hAnsi="Roboto"/>
-          <w:color w:val="000000"/>
-          <w:sz w:val="20"/>
-          <w:szCs w:val="20"/>
-        </w:rPr>
-        <w:t xml:space="preserve">Supports methylation B-vitamin stack.</w:t>
-      </w:r>
-    </w:p>
-    <w:p>
-      <w:pPr>
-        <w:spacing w:after="60" w:before="120"/>
-      </w:pPr>
-      <w:r>
-        <w:rPr>
-          <w:rFonts w:ascii="Roboto" w:cs="Roboto" w:eastAsia="Roboto" w:hAnsi="Roboto"/>
-          <w:b/>
-          <w:bCs/>
-          <w:color w:val="535B50"/>
-          <w:sz w:val="22"/>
-          <w:szCs w:val="22"/>
-        </w:rPr>
-        <w:t xml:space="preserve">2-Oxo-4-methiolbutyric Acid (KMBA)</w:t>
-      </w:r>
-      <w:r>
-        <w:rPr>
-          <w:rFonts w:ascii="Roboto" w:cs="Roboto" w:eastAsia="Roboto" w:hAnsi="Roboto"/>
-          <w:color w:val="000000"/>
-          <w:sz w:val="22"/>
-          <w:szCs w:val="22"/>
-        </w:rPr>
-        <w:t xml:space="preserve">   3.20 mmol/molCR</w:t>
-      </w:r>
-      <w:r>
-        <w:rPr>
-          <w:rFonts w:ascii="Roboto" w:cs="Roboto" w:eastAsia="Roboto" w:hAnsi="Roboto"/>
-          <w:i/>
-          <w:iCs/>
-          <w:color w:val="666666"/>
-          <w:sz w:val="20"/>
-          <w:szCs w:val="20"/>
-        </w:rPr>
-        <w:t xml:space="preserve">   (ref: &lt;1.50)</w:t>
-      </w:r>
-    </w:p>
-    <w:p>
-      <w:pPr>
-        <w:spacing w:after="60"/>
-      </w:pPr>
-      <w:r>
-        <w:rPr>
-          <w:rFonts w:ascii="Roboto" w:cs="Roboto" w:eastAsia="Roboto" w:hAnsi="Roboto"/>
-          <w:b/>
-          <w:bCs/>
-          <w:color w:val="535B50"/>
-          <w:sz w:val="20"/>
-          <w:szCs w:val="20"/>
-        </w:rPr>
-        <w:t xml:space="preserve">Interpretation: </w:t>
-      </w:r>
-      <w:r>
-        <w:rPr>
-          <w:rFonts w:ascii="Roboto" w:cs="Roboto" w:eastAsia="Roboto" w:hAnsi="Roboto"/>
-          <w:color w:val="000000"/>
-          <w:sz w:val="20"/>
-          <w:szCs w:val="20"/>
-        </w:rPr>
-        <w:t xml:space="preserve">Elevated. Per published frameworks, methionine recycling intermediate accumulation.</w:t>
-      </w:r>
-    </w:p>
-    <w:p>
-      <w:pPr>
-        <w:spacing w:after="60"/>
-      </w:pPr>
-      <w:r>
-        <w:rPr>
-          <w:rFonts w:ascii="Roboto" w:cs="Roboto" w:eastAsia="Roboto" w:hAnsi="Roboto"/>
-          <w:b/>
-          <w:bCs/>
-          <w:color w:val="535B50"/>
-          <w:sz w:val="20"/>
-          <w:szCs w:val="20"/>
-        </w:rPr>
-        <w:t xml:space="preserve">Possible contributors: </w:t>
-      </w:r>
-      <w:r>
-        <w:rPr>
-          <w:rFonts w:ascii="Roboto" w:cs="Roboto" w:eastAsia="Roboto" w:hAnsi="Roboto"/>
-          <w:color w:val="000000"/>
-          <w:sz w:val="20"/>
-          <w:szCs w:val="20"/>
-        </w:rPr>
-        <w:t xml:space="preserve">Methylation cycle strain, oxidative stress on methionine — practitioner to assess.</w:t>
-      </w:r>
-    </w:p>
-    <w:p>
-      <w:pPr>
-        <w:spacing w:after="60"/>
-      </w:pPr>
-      <w:r>
-        <w:rPr>
-          <w:rFonts w:ascii="Roboto" w:cs="Roboto" w:eastAsia="Roboto" w:hAnsi="Roboto"/>
-          <w:b/>
-          <w:bCs/>
-          <w:color w:val="535B50"/>
-          <w:sz w:val="20"/>
-          <w:szCs w:val="20"/>
-        </w:rPr>
-        <w:t xml:space="preserve">Relevance to formulation: </w:t>
-      </w:r>
-      <w:r>
-        <w:rPr>
-          <w:rFonts w:ascii="Roboto" w:cs="Roboto" w:eastAsia="Roboto" w:hAnsi="Roboto"/>
-          <w:color w:val="000000"/>
-          <w:sz w:val="20"/>
-          <w:szCs w:val="20"/>
-        </w:rPr>
-        <w:t xml:space="preserve">Supports B12 and methylation cofactors.</w:t>
-      </w:r>
-    </w:p>
-    <w:p>
-      <w:pPr>
-        <w:spacing w:after="60" w:before="120"/>
-      </w:pPr>
-      <w:r>
-        <w:rPr>
-          <w:rFonts w:ascii="Roboto" w:cs="Roboto" w:eastAsia="Roboto" w:hAnsi="Roboto"/>
-          <w:b/>
-          <w:bCs/>
-          <w:color w:val="535B50"/>
-          <w:sz w:val="22"/>
-          <w:szCs w:val="22"/>
-        </w:rPr>
-        <w:t xml:space="preserve">Arabinose</w:t>
-      </w:r>
-      <w:r>
-        <w:rPr>
-          <w:rFonts w:ascii="Roboto" w:cs="Roboto" w:eastAsia="Roboto" w:hAnsi="Roboto"/>
-          <w:color w:val="000000"/>
-          <w:sz w:val="22"/>
-          <w:szCs w:val="22"/>
-        </w:rPr>
-        <w:t xml:space="preserve">   42.00 mmol/molCR</w:t>
-      </w:r>
-      <w:r>
-        <w:rPr>
-          <w:rFonts w:ascii="Roboto" w:cs="Roboto" w:eastAsia="Roboto" w:hAnsi="Roboto"/>
-          <w:i/>
-          <w:iCs/>
-          <w:color w:val="666666"/>
-          <w:sz w:val="20"/>
-          <w:szCs w:val="20"/>
-        </w:rPr>
-        <w:t xml:space="preserve">   (ref: &lt;32.00)</w:t>
-      </w:r>
-    </w:p>
-    <w:p>
-      <w:pPr>
-        <w:spacing w:after="60"/>
-      </w:pPr>
-      <w:r>
-        <w:rPr>
-          <w:rFonts w:ascii="Roboto" w:cs="Roboto" w:eastAsia="Roboto" w:hAnsi="Roboto"/>
-          <w:b/>
-          <w:bCs/>
-          <w:color w:val="535B50"/>
-          <w:sz w:val="20"/>
-          <w:szCs w:val="20"/>
-        </w:rPr>
-        <w:t xml:space="preserve">Interpretation: </w:t>
-      </w:r>
-      <w:r>
-        <w:rPr>
-          <w:rFonts w:ascii="Roboto" w:cs="Roboto" w:eastAsia="Roboto" w:hAnsi="Roboto"/>
-          <w:color w:val="000000"/>
-          <w:sz w:val="20"/>
-          <w:szCs w:val="20"/>
-        </w:rPr>
-        <w:t xml:space="preserve">Mildly elevated. Per published frameworks, associated with intestinal yeast/Candida activity.</w:t>
-      </w:r>
-    </w:p>
-    <w:p>
-      <w:pPr>
-        <w:spacing w:after="60"/>
-      </w:pPr>
-      <w:r>
-        <w:rPr>
-          <w:rFonts w:ascii="Roboto" w:cs="Roboto" w:eastAsia="Roboto" w:hAnsi="Roboto"/>
-          <w:b/>
-          <w:bCs/>
-          <w:color w:val="535B50"/>
-          <w:sz w:val="20"/>
-          <w:szCs w:val="20"/>
-        </w:rPr>
-        <w:t xml:space="preserve">Possible contributors: </w:t>
-      </w:r>
-      <w:r>
-        <w:rPr>
-          <w:rFonts w:ascii="Roboto" w:cs="Roboto" w:eastAsia="Roboto" w:hAnsi="Roboto"/>
-          <w:color w:val="000000"/>
-          <w:sz w:val="20"/>
-          <w:szCs w:val="20"/>
-        </w:rPr>
-        <w:t xml:space="preserve">Yeast/fungal dysbiosis — practitioner to assess.</w:t>
-      </w:r>
-    </w:p>
-    <w:p>
-      <w:pPr>
-        <w:spacing w:after="60"/>
-      </w:pPr>
-      <w:r>
-        <w:rPr>
-          <w:rFonts w:ascii="Roboto" w:cs="Roboto" w:eastAsia="Roboto" w:hAnsi="Roboto"/>
-          <w:b/>
-          <w:bCs/>
-          <w:color w:val="535B50"/>
-          <w:sz w:val="20"/>
-          <w:szCs w:val="20"/>
-        </w:rPr>
-        <w:t xml:space="preserve">Relevance to formulation: </w:t>
-      </w:r>
-      <w:r>
-        <w:rPr>
-          <w:rFonts w:ascii="Roboto" w:cs="Roboto" w:eastAsia="Roboto" w:hAnsi="Roboto"/>
-          <w:color w:val="000000"/>
-          <w:sz w:val="20"/>
-          <w:szCs w:val="20"/>
-        </w:rPr>
-        <w:t xml:space="preserve">GI axis emphasis modest; standalone probiotic recommended (not in Library).</w:t>
-      </w:r>
-    </w:p>
-    <w:p>
-      <w:pPr>
-        <w:spacing w:after="60" w:before="120"/>
-      </w:pPr>
-      <w:r>
-        <w:rPr>
-          <w:rFonts w:ascii="Roboto" w:cs="Roboto" w:eastAsia="Roboto" w:hAnsi="Roboto"/>
-          <w:b/>
-          <w:bCs/>
-          <w:color w:val="535B50"/>
-          <w:sz w:val="22"/>
-          <w:szCs w:val="22"/>
-        </w:rPr>
-        <w:t xml:space="preserve">3,4-Dihydroxybenzoic Acid (3,4-DHBA)</w:t>
-      </w:r>
-      <w:r>
-        <w:rPr>
-          <w:rFonts w:ascii="Roboto" w:cs="Roboto" w:eastAsia="Roboto" w:hAnsi="Roboto"/>
-          <w:color w:val="000000"/>
-          <w:sz w:val="22"/>
-          <w:szCs w:val="22"/>
-        </w:rPr>
-        <w:t xml:space="preserve">   62.00 mmol/molCR</w:t>
-      </w:r>
-      <w:r>
-        <w:rPr>
-          <w:rFonts w:ascii="Roboto" w:cs="Roboto" w:eastAsia="Roboto" w:hAnsi="Roboto"/>
-          <w:i/>
-          <w:iCs/>
-          <w:color w:val="666666"/>
-          <w:sz w:val="20"/>
-          <w:szCs w:val="20"/>
-        </w:rPr>
-        <w:t xml:space="preserve">   (ref: &lt;45.00)</w:t>
-      </w:r>
-    </w:p>
-    <w:p>
-      <w:pPr>
-        <w:spacing w:after="60"/>
-      </w:pPr>
-      <w:r>
-        <w:rPr>
-          <w:rFonts w:ascii="Roboto" w:cs="Roboto" w:eastAsia="Roboto" w:hAnsi="Roboto"/>
-          <w:b/>
-          <w:bCs/>
-          <w:color w:val="535B50"/>
-          <w:sz w:val="20"/>
-          <w:szCs w:val="20"/>
-        </w:rPr>
-        <w:t xml:space="preserve">Interpretation: </w:t>
-      </w:r>
-      <w:r>
-        <w:rPr>
-          <w:rFonts w:ascii="Roboto" w:cs="Roboto" w:eastAsia="Roboto" w:hAnsi="Roboto"/>
-          <w:color w:val="000000"/>
-          <w:sz w:val="20"/>
-          <w:szCs w:val="20"/>
-        </w:rPr>
-        <w:t xml:space="preserve">Mildly elevated. Per published frameworks, microbial polyphenol metabolite.</w:t>
-      </w:r>
-    </w:p>
-    <w:p>
-      <w:pPr>
-        <w:spacing w:after="60"/>
-      </w:pPr>
-      <w:r>
-        <w:rPr>
-          <w:rFonts w:ascii="Roboto" w:cs="Roboto" w:eastAsia="Roboto" w:hAnsi="Roboto"/>
-          <w:b/>
-          <w:bCs/>
-          <w:color w:val="535B50"/>
-          <w:sz w:val="20"/>
-          <w:szCs w:val="20"/>
-        </w:rPr>
-        <w:t xml:space="preserve">Possible contributors: </w:t>
-      </w:r>
-      <w:r>
-        <w:rPr>
-          <w:rFonts w:ascii="Roboto" w:cs="Roboto" w:eastAsia="Roboto" w:hAnsi="Roboto"/>
-          <w:color w:val="000000"/>
-          <w:sz w:val="20"/>
-          <w:szCs w:val="20"/>
-        </w:rPr>
-        <w:t xml:space="preserve">Dysbiotic microbial activity — practitioner to assess.</w:t>
-      </w:r>
-    </w:p>
-    <w:p>
-      <w:pPr>
-        <w:spacing w:after="60"/>
-      </w:pPr>
-      <w:r>
-        <w:rPr>
-          <w:rFonts w:ascii="Roboto" w:cs="Roboto" w:eastAsia="Roboto" w:hAnsi="Roboto"/>
-          <w:b/>
-          <w:bCs/>
-          <w:color w:val="535B50"/>
-          <w:sz w:val="20"/>
-          <w:szCs w:val="20"/>
-        </w:rPr>
-        <w:t xml:space="preserve">Relevance to formulation: </w:t>
-      </w:r>
-      <w:r>
-        <w:rPr>
-          <w:rFonts w:ascii="Roboto" w:cs="Roboto" w:eastAsia="Roboto" w:hAnsi="Roboto"/>
-          <w:color w:val="000000"/>
-          <w:sz w:val="20"/>
-          <w:szCs w:val="20"/>
-        </w:rPr>
-        <w:t xml:space="preserve">Modest GI emphasis.</w:t>
-      </w:r>
-    </w:p>
-    <w:p>
-      <w:pPr>
-        <w:spacing w:after="60" w:before="120"/>
-      </w:pPr>
-      <w:r>
-        <w:rPr>
-          <w:rFonts w:ascii="Roboto" w:cs="Roboto" w:eastAsia="Roboto" w:hAnsi="Roboto"/>
-          <w:b/>
-          <w:bCs/>
-          <w:color w:val="535B50"/>
-          <w:sz w:val="22"/>
-          <w:szCs w:val="22"/>
-        </w:rPr>
-        <w:t xml:space="preserve">Furancarbonylglycine</w:t>
-      </w:r>
-      <w:r>
-        <w:rPr>
-          <w:rFonts w:ascii="Roboto" w:cs="Roboto" w:eastAsia="Roboto" w:hAnsi="Roboto"/>
-          <w:color w:val="000000"/>
-          <w:sz w:val="22"/>
-          <w:szCs w:val="22"/>
-        </w:rPr>
-        <w:t xml:space="preserve">   2.90 mmol/molCR</w:t>
-      </w:r>
-      <w:r>
-        <w:rPr>
-          <w:rFonts w:ascii="Roboto" w:cs="Roboto" w:eastAsia="Roboto" w:hAnsi="Roboto"/>
-          <w:i/>
-          <w:iCs/>
-          <w:color w:val="666666"/>
-          <w:sz w:val="20"/>
-          <w:szCs w:val="20"/>
-        </w:rPr>
-        <w:t xml:space="preserve">   (ref: &lt;2.00)</w:t>
-      </w:r>
-    </w:p>
-    <w:p>
-      <w:pPr>
-        <w:spacing w:after="60"/>
-      </w:pPr>
-      <w:r>
-        <w:rPr>
-          <w:rFonts w:ascii="Roboto" w:cs="Roboto" w:eastAsia="Roboto" w:hAnsi="Roboto"/>
-          <w:b/>
-          <w:bCs/>
-          <w:color w:val="535B50"/>
-          <w:sz w:val="20"/>
-          <w:szCs w:val="20"/>
-        </w:rPr>
-        <w:t xml:space="preserve">Interpretation: </w:t>
-      </w:r>
-      <w:r>
-        <w:rPr>
-          <w:rFonts w:ascii="Roboto" w:cs="Roboto" w:eastAsia="Roboto" w:hAnsi="Roboto"/>
-          <w:color w:val="000000"/>
-          <w:sz w:val="20"/>
-          <w:szCs w:val="20"/>
-        </w:rPr>
-        <w:t xml:space="preserve">Mildly elevated. Pattern consistent with furan exposure or dysbiotic origin.</w:t>
-      </w:r>
-    </w:p>
-    <w:p>
-      <w:pPr>
-        <w:spacing w:after="60"/>
-      </w:pPr>
-      <w:r>
-        <w:rPr>
-          <w:rFonts w:ascii="Roboto" w:cs="Roboto" w:eastAsia="Roboto" w:hAnsi="Roboto"/>
-          <w:b/>
-          <w:bCs/>
-          <w:color w:val="535B50"/>
-          <w:sz w:val="20"/>
-          <w:szCs w:val="20"/>
-        </w:rPr>
-        <w:t xml:space="preserve">Possible contributors: </w:t>
-      </w:r>
-      <w:r>
-        <w:rPr>
-          <w:rFonts w:ascii="Roboto" w:cs="Roboto" w:eastAsia="Roboto" w:hAnsi="Roboto"/>
-          <w:color w:val="000000"/>
-          <w:sz w:val="20"/>
-          <w:szCs w:val="20"/>
-        </w:rPr>
-        <w:t xml:space="preserve">Dietary HMF/furan exposure, dysbiosis — practitioner to assess.</w:t>
-      </w:r>
-    </w:p>
-    <w:p>
-      <w:pPr>
-        <w:spacing w:after="60"/>
-      </w:pPr>
-      <w:r>
-        <w:rPr>
-          <w:rFonts w:ascii="Roboto" w:cs="Roboto" w:eastAsia="Roboto" w:hAnsi="Roboto"/>
-          <w:b/>
-          <w:bCs/>
-          <w:color w:val="535B50"/>
-          <w:sz w:val="20"/>
-          <w:szCs w:val="20"/>
-        </w:rPr>
-        <w:t xml:space="preserve">Relevance to formulation: </w:t>
-      </w:r>
-      <w:r>
-        <w:rPr>
-          <w:rFonts w:ascii="Roboto" w:cs="Roboto" w:eastAsia="Roboto" w:hAnsi="Roboto"/>
-          <w:color w:val="000000"/>
-          <w:sz w:val="20"/>
-          <w:szCs w:val="20"/>
-        </w:rPr>
-        <w:t xml:space="preserve">Supports glycine conjugation (standalone) and Phase II support.</w:t>
-      </w:r>
-    </w:p>
-    <w:p>
-      <w:pPr>
-        <w:spacing w:after="60" w:before="120"/>
-      </w:pPr>
-      <w:r>
-        <w:rPr>
-          <w:rFonts w:ascii="Roboto" w:cs="Roboto" w:eastAsia="Roboto" w:hAnsi="Roboto"/>
-          <w:b/>
-          <w:bCs/>
-          <w:color w:val="535B50"/>
-          <w:sz w:val="22"/>
-          <w:szCs w:val="22"/>
-        </w:rPr>
-        <w:t xml:space="preserve">Phenylpyruvic Acid</w:t>
-      </w:r>
-      <w:r>
-        <w:rPr>
-          <w:rFonts w:ascii="Roboto" w:cs="Roboto" w:eastAsia="Roboto" w:hAnsi="Roboto"/>
-          <w:color w:val="000000"/>
-          <w:sz w:val="22"/>
-          <w:szCs w:val="22"/>
-        </w:rPr>
-        <w:t xml:space="preserve">   4.50 mmol/molCR</w:t>
-      </w:r>
-      <w:r>
-        <w:rPr>
-          <w:rFonts w:ascii="Roboto" w:cs="Roboto" w:eastAsia="Roboto" w:hAnsi="Roboto"/>
-          <w:i/>
-          <w:iCs/>
-          <w:color w:val="666666"/>
-          <w:sz w:val="20"/>
-          <w:szCs w:val="20"/>
-        </w:rPr>
-        <w:t xml:space="preserve">   (ref: &lt;2.00)</w:t>
-      </w:r>
-    </w:p>
-    <w:p>
-      <w:pPr>
-        <w:spacing w:after="60"/>
-      </w:pPr>
-      <w:r>
-        <w:rPr>
-          <w:rFonts w:ascii="Roboto" w:cs="Roboto" w:eastAsia="Roboto" w:hAnsi="Roboto"/>
-          <w:b/>
-          <w:bCs/>
-          <w:color w:val="535B50"/>
-          <w:sz w:val="20"/>
-          <w:szCs w:val="20"/>
-        </w:rPr>
-        <w:t xml:space="preserve">Interpretation: </w:t>
-      </w:r>
-      <w:r>
-        <w:rPr>
-          <w:rFonts w:ascii="Roboto" w:cs="Roboto" w:eastAsia="Roboto" w:hAnsi="Roboto"/>
-          <w:color w:val="000000"/>
-          <w:sz w:val="20"/>
-          <w:szCs w:val="20"/>
-        </w:rPr>
-        <w:t xml:space="preserve">Elevated. Per published frameworks, phenylalanine catabolism intermediate.</w:t>
-      </w:r>
-    </w:p>
-    <w:p>
-      <w:pPr>
-        <w:spacing w:after="60"/>
-      </w:pPr>
-      <w:r>
-        <w:rPr>
-          <w:rFonts w:ascii="Roboto" w:cs="Roboto" w:eastAsia="Roboto" w:hAnsi="Roboto"/>
-          <w:b/>
-          <w:bCs/>
-          <w:color w:val="535B50"/>
-          <w:sz w:val="20"/>
-          <w:szCs w:val="20"/>
-        </w:rPr>
-        <w:t xml:space="preserve">Possible contributors: </w:t>
-      </w:r>
-      <w:r>
-        <w:rPr>
-          <w:rFonts w:ascii="Roboto" w:cs="Roboto" w:eastAsia="Roboto" w:hAnsi="Roboto"/>
-          <w:color w:val="000000"/>
-          <w:sz w:val="20"/>
-          <w:szCs w:val="20"/>
-        </w:rPr>
-        <w:t xml:space="preserve">Functional cofactor insufficiency in phenylalanine hydroxylation — practitioner to assess.</w:t>
-      </w:r>
-    </w:p>
-    <w:p>
-      <w:pPr>
-        <w:spacing w:after="60"/>
-      </w:pPr>
-      <w:r>
-        <w:rPr>
-          <w:rFonts w:ascii="Roboto" w:cs="Roboto" w:eastAsia="Roboto" w:hAnsi="Roboto"/>
-          <w:b/>
-          <w:bCs/>
-          <w:color w:val="535B50"/>
-          <w:sz w:val="20"/>
-          <w:szCs w:val="20"/>
-        </w:rPr>
-        <w:t xml:space="preserve">Relevance to formulation: </w:t>
-      </w:r>
-      <w:r>
-        <w:rPr>
-          <w:rFonts w:ascii="Roboto" w:cs="Roboto" w:eastAsia="Roboto" w:hAnsi="Roboto"/>
-          <w:color w:val="000000"/>
-          <w:sz w:val="20"/>
-          <w:szCs w:val="20"/>
-        </w:rPr>
-        <w:t xml:space="preserve">Noted; not driving direct formulation change.</w:t>
-      </w:r>
-    </w:p>
-    <w:p>
-      <w:pPr>
-        <w:spacing w:after="60" w:before="120"/>
-      </w:pPr>
-      <w:r>
-        <w:rPr>
-          <w:rFonts w:ascii="Roboto" w:cs="Roboto" w:eastAsia="Roboto" w:hAnsi="Roboto"/>
-          <w:b/>
-          <w:bCs/>
-          <w:color w:val="535B50"/>
-          <w:sz w:val="22"/>
-          <w:szCs w:val="22"/>
-        </w:rPr>
-        <w:t xml:space="preserve">Cortisol (OA)</w:t>
-      </w:r>
-      <w:r>
-        <w:rPr>
-          <w:rFonts w:ascii="Roboto" w:cs="Roboto" w:eastAsia="Roboto" w:hAnsi="Roboto"/>
-          <w:color w:val="000000"/>
-          <w:sz w:val="22"/>
-          <w:szCs w:val="22"/>
-        </w:rPr>
-        <w:t xml:space="preserve">   25.3 ug/gCR</w:t>
-      </w:r>
-      <w:r>
-        <w:rPr>
-          <w:rFonts w:ascii="Roboto" w:cs="Roboto" w:eastAsia="Roboto" w:hAnsi="Roboto"/>
-          <w:i/>
-          <w:iCs/>
-          <w:color w:val="666666"/>
-          <w:sz w:val="20"/>
-          <w:szCs w:val="20"/>
-        </w:rPr>
-        <w:t xml:space="preserve">   (ref: 1.0-63.8)</w:t>
-      </w:r>
-    </w:p>
-    <w:p>
-      <w:pPr>
-        <w:spacing w:after="60"/>
-      </w:pPr>
-      <w:r>
-        <w:rPr>
-          <w:rFonts w:ascii="Roboto" w:cs="Roboto" w:eastAsia="Roboto" w:hAnsi="Roboto"/>
-          <w:b/>
-          <w:bCs/>
-          <w:color w:val="535B50"/>
-          <w:sz w:val="20"/>
-          <w:szCs w:val="20"/>
-        </w:rPr>
-        <w:t xml:space="preserve">Interpretation: </w:t>
-      </w:r>
-      <w:r>
-        <w:rPr>
-          <w:rFonts w:ascii="Roboto" w:cs="Roboto" w:eastAsia="Roboto" w:hAnsi="Roboto"/>
-          <w:color w:val="000000"/>
-          <w:sz w:val="20"/>
-          <w:szCs w:val="20"/>
-        </w:rPr>
-        <w:t xml:space="preserve">Within laboratory reference range.</w:t>
-      </w:r>
-    </w:p>
-    <w:p>
-      <w:pPr>
-        <w:spacing w:after="60"/>
-      </w:pPr>
-      <w:r>
-        <w:rPr>
-          <w:rFonts w:ascii="Roboto" w:cs="Roboto" w:eastAsia="Roboto" w:hAnsi="Roboto"/>
-          <w:b/>
-          <w:bCs/>
-          <w:color w:val="535B50"/>
-          <w:sz w:val="20"/>
-          <w:szCs w:val="20"/>
-        </w:rPr>
-        <w:t xml:space="preserve">Possible contributors: </w:t>
-      </w:r>
-      <w:r>
-        <w:rPr>
-          <w:rFonts w:ascii="Roboto" w:cs="Roboto" w:eastAsia="Roboto" w:hAnsi="Roboto"/>
-          <w:color w:val="000000"/>
-          <w:sz w:val="20"/>
-          <w:szCs w:val="20"/>
-        </w:rPr>
-        <w:t xml:space="preserve">n/a</w:t>
-      </w:r>
-    </w:p>
-    <w:p>
-      <w:pPr>
-        <w:spacing w:after="60"/>
-      </w:pPr>
-      <w:r>
-        <w:rPr>
-          <w:rFonts w:ascii="Roboto" w:cs="Roboto" w:eastAsia="Roboto" w:hAnsi="Roboto"/>
-          <w:b/>
-          <w:bCs/>
-          <w:color w:val="535B50"/>
-          <w:sz w:val="20"/>
-          <w:szCs w:val="20"/>
-        </w:rPr>
-        <w:t xml:space="preserve">Relevance to formulation: </w:t>
-      </w:r>
-      <w:r>
-        <w:rPr>
-          <w:rFonts w:ascii="Roboto" w:cs="Roboto" w:eastAsia="Roboto" w:hAnsi="Roboto"/>
-          <w:color w:val="000000"/>
-          <w:sz w:val="20"/>
-          <w:szCs w:val="20"/>
-        </w:rPr>
-        <w:t xml:space="preserve">HPA axis not flagged for primary intervention.</w:t>
-      </w:r>
-    </w:p>
-    <w:p>
-      <w:pPr>
-        <w:spacing w:after="60" w:before="120"/>
-      </w:pPr>
-      <w:r>
-        <w:rPr>
-          <w:rFonts w:ascii="Roboto" w:cs="Roboto" w:eastAsia="Roboto" w:hAnsi="Roboto"/>
-          <w:b/>
-          <w:bCs/>
-          <w:color w:val="535B50"/>
-          <w:sz w:val="22"/>
-          <w:szCs w:val="22"/>
-        </w:rPr>
-        <w:t xml:space="preserve">Pyroglutamic Acid</w:t>
-      </w:r>
-      <w:r>
-        <w:rPr>
-          <w:rFonts w:ascii="Roboto" w:cs="Roboto" w:eastAsia="Roboto" w:hAnsi="Roboto"/>
-          <w:color w:val="000000"/>
-          <w:sz w:val="22"/>
-          <w:szCs w:val="22"/>
-        </w:rPr>
-        <w:t xml:space="preserve">   28.80 mmol/molCR</w:t>
-      </w:r>
-      <w:r>
-        <w:rPr>
-          <w:rFonts w:ascii="Roboto" w:cs="Roboto" w:eastAsia="Roboto" w:hAnsi="Roboto"/>
-          <w:i/>
-          <w:iCs/>
-          <w:color w:val="666666"/>
-          <w:sz w:val="20"/>
-          <w:szCs w:val="20"/>
-        </w:rPr>
-        <w:t xml:space="preserve">   (ref: 4.50-33.00)</w:t>
-      </w:r>
-    </w:p>
-    <w:p>
-      <w:pPr>
-        <w:spacing w:after="60"/>
-      </w:pPr>
-      <w:r>
-        <w:rPr>
-          <w:rFonts w:ascii="Roboto" w:cs="Roboto" w:eastAsia="Roboto" w:hAnsi="Roboto"/>
-          <w:b/>
-          <w:bCs/>
-          <w:color w:val="535B50"/>
-          <w:sz w:val="20"/>
-          <w:szCs w:val="20"/>
-        </w:rPr>
-        <w:t xml:space="preserve">Interpretation: </w:t>
-      </w:r>
-      <w:r>
-        <w:rPr>
-          <w:rFonts w:ascii="Roboto" w:cs="Roboto" w:eastAsia="Roboto" w:hAnsi="Roboto"/>
-          <w:color w:val="000000"/>
-          <w:sz w:val="20"/>
-          <w:szCs w:val="20"/>
-        </w:rPr>
-        <w:t xml:space="preserve">Upper portion of reference range. Per published frameworks, may reflect glutathione cycling demand.</w:t>
-      </w:r>
-    </w:p>
-    <w:p>
-      <w:pPr>
-        <w:spacing w:after="60"/>
-      </w:pPr>
-      <w:r>
-        <w:rPr>
-          <w:rFonts w:ascii="Roboto" w:cs="Roboto" w:eastAsia="Roboto" w:hAnsi="Roboto"/>
-          <w:b/>
-          <w:bCs/>
-          <w:color w:val="535B50"/>
-          <w:sz w:val="20"/>
-          <w:szCs w:val="20"/>
-        </w:rPr>
-        <w:t xml:space="preserve">Possible contributors: </w:t>
-      </w:r>
-      <w:r>
-        <w:rPr>
-          <w:rFonts w:ascii="Roboto" w:cs="Roboto" w:eastAsia="Roboto" w:hAnsi="Roboto"/>
-          <w:color w:val="000000"/>
-          <w:sz w:val="20"/>
-          <w:szCs w:val="20"/>
-        </w:rPr>
-        <w:t xml:space="preserve">Glutathione turnover demand — practitioner to assess.</w:t>
-      </w:r>
-    </w:p>
-    <w:p>
-      <w:pPr>
-        <w:spacing w:after="60"/>
-      </w:pPr>
-      <w:r>
-        <w:rPr>
-          <w:rFonts w:ascii="Roboto" w:cs="Roboto" w:eastAsia="Roboto" w:hAnsi="Roboto"/>
-          <w:b/>
-          <w:bCs/>
-          <w:color w:val="535B50"/>
-          <w:sz w:val="20"/>
-          <w:szCs w:val="20"/>
-        </w:rPr>
-        <w:t xml:space="preserve">Relevance to formulation: </w:t>
-      </w:r>
-      <w:r>
-        <w:rPr>
-          <w:rFonts w:ascii="Roboto" w:cs="Roboto" w:eastAsia="Roboto" w:hAnsi="Roboto"/>
-          <w:color w:val="000000"/>
-          <w:sz w:val="20"/>
-          <w:szCs w:val="20"/>
-        </w:rPr>
-        <w:t xml:space="preserve">Reinforces NAC and glutathione precursor inclusion.</w:t>
-      </w:r>
-    </w:p>
-    <w:p>
-      <w:pPr>
-        <w:spacing w:after="60" w:before="120"/>
-      </w:pPr>
-      <w:r>
-        <w:rPr>
-          <w:rFonts w:ascii="Roboto" w:cs="Roboto" w:eastAsia="Roboto" w:hAnsi="Roboto"/>
-          <w:b/>
-          <w:bCs/>
-          <w:color w:val="535B50"/>
-          <w:sz w:val="22"/>
-          <w:szCs w:val="22"/>
-        </w:rPr>
-        <w:t xml:space="preserve">Methylmalonic Acid (MMA)</w:t>
-      </w:r>
-      <w:r>
-        <w:rPr>
-          <w:rFonts w:ascii="Roboto" w:cs="Roboto" w:eastAsia="Roboto" w:hAnsi="Roboto"/>
-          <w:color w:val="000000"/>
-          <w:sz w:val="22"/>
-          <w:szCs w:val="22"/>
-        </w:rPr>
-        <w:t xml:space="preserve">   1.65 mmol/molCR</w:t>
-      </w:r>
-      <w:r>
-        <w:rPr>
-          <w:rFonts w:ascii="Roboto" w:cs="Roboto" w:eastAsia="Roboto" w:hAnsi="Roboto"/>
-          <w:i/>
-          <w:iCs/>
-          <w:color w:val="666666"/>
-          <w:sz w:val="20"/>
-          <w:szCs w:val="20"/>
-        </w:rPr>
-        <w:t xml:space="preserve">   (ref: &lt;1.90)</w:t>
-      </w:r>
-    </w:p>
-    <w:p>
-      <w:pPr>
-        <w:spacing w:after="60"/>
-      </w:pPr>
-      <w:r>
-        <w:rPr>
-          <w:rFonts w:ascii="Roboto" w:cs="Roboto" w:eastAsia="Roboto" w:hAnsi="Roboto"/>
-          <w:b/>
-          <w:bCs/>
-          <w:color w:val="535B50"/>
-          <w:sz w:val="20"/>
-          <w:szCs w:val="20"/>
-        </w:rPr>
-        <w:t xml:space="preserve">Interpretation: </w:t>
-      </w:r>
-      <w:r>
-        <w:rPr>
-          <w:rFonts w:ascii="Roboto" w:cs="Roboto" w:eastAsia="Roboto" w:hAnsi="Roboto"/>
-          <w:color w:val="000000"/>
-          <w:sz w:val="20"/>
-          <w:szCs w:val="20"/>
-        </w:rPr>
-        <w:t xml:space="preserve">Within reference range — overt B12 functional insufficiency not evident.</w:t>
-      </w:r>
-    </w:p>
-    <w:p>
-      <w:pPr>
-        <w:spacing w:after="60"/>
-      </w:pPr>
-      <w:r>
-        <w:rPr>
-          <w:rFonts w:ascii="Roboto" w:cs="Roboto" w:eastAsia="Roboto" w:hAnsi="Roboto"/>
-          <w:b/>
-          <w:bCs/>
-          <w:color w:val="535B50"/>
-          <w:sz w:val="20"/>
-          <w:szCs w:val="20"/>
-        </w:rPr>
-        <w:t xml:space="preserve">Possible contributors: </w:t>
-      </w:r>
-      <w:r>
-        <w:rPr>
-          <w:rFonts w:ascii="Roboto" w:cs="Roboto" w:eastAsia="Roboto" w:hAnsi="Roboto"/>
-          <w:color w:val="000000"/>
-          <w:sz w:val="20"/>
-          <w:szCs w:val="20"/>
-        </w:rPr>
-        <w:t xml:space="preserve">n/a</w:t>
-      </w:r>
-    </w:p>
-    <w:p>
-      <w:pPr>
-        <w:spacing w:after="60"/>
-      </w:pPr>
-      <w:r>
-        <w:rPr>
-          <w:rFonts w:ascii="Roboto" w:cs="Roboto" w:eastAsia="Roboto" w:hAnsi="Roboto"/>
-          <w:b/>
-          <w:bCs/>
-          <w:color w:val="535B50"/>
-          <w:sz w:val="20"/>
-          <w:szCs w:val="20"/>
-        </w:rPr>
-        <w:t xml:space="preserve">Relevance to formulation: </w:t>
-      </w:r>
-      <w:r>
-        <w:rPr>
-          <w:rFonts w:ascii="Roboto" w:cs="Roboto" w:eastAsia="Roboto" w:hAnsi="Roboto"/>
-          <w:color w:val="000000"/>
-          <w:sz w:val="20"/>
-          <w:szCs w:val="20"/>
-        </w:rPr>
-        <w:t xml:space="preserve">Conservative B12 dose used.</w:t>
+        <w:t xml:space="preserve">No heavy_metal_detox axis prioritisation required; antioxidant_redox axis remains relevant for general oestrogen-metabolism support.</w:t>
       </w:r>
     </w:p>
     <w:p>
@@ -4033,7 +2464,7 @@
           <w:sz w:val="22"/>
           <w:szCs w:val="22"/>
         </w:rPr>
-        <w:t xml:space="preserve">xenobiotic_exposure_review</w:t>
+        <w:t xml:space="preserve">Cruciferous vegetables</w:t>
       </w:r>
     </w:p>
     <w:p>
@@ -4058,7 +2489,7 @@
           <w:sz w:val="20"/>
           <w:szCs w:val="20"/>
         </w:rPr>
-        <w:t xml:space="preserve">The practitioner may wish to review with the patient potential sources of benzene (vehicle exhaust, smoking, certain solvents), xylene/toluene (paints, solvents), and paraben/phthalate exposure (cosmetics, personal care) given the OA pattern.</w:t>
+        <w:t xml:space="preserve">The practitioner may wish to discuss with the patient regular intake of cruciferous vegetables (broccoli, broccoli sprouts, brussels sprouts, cabbage, cauliflower) as dietary sources of indole-3-carbinol and DIM precursors — published literature supports cruciferous intake for 2-OH pathway support.</w:t>
       </w:r>
     </w:p>
     <w:p>
@@ -4083,7 +2514,7 @@
           <w:sz w:val="20"/>
           <w:szCs w:val="20"/>
         </w:rPr>
-        <w:t xml:space="preserve">Elevated t,t-muconic, 3-methylhippuric, 4-HBA per published frameworks.</w:t>
+        <w:t xml:space="preserve">Low 2-OH Estrone and low 2:16 ratio suggest practitioner consideration of dietary support for the 2-hydroxylation pathway.</w:t>
       </w:r>
     </w:p>
     <w:p>
@@ -4099,7 +2530,7 @@
           <w:sz w:val="22"/>
           <w:szCs w:val="22"/>
         </w:rPr>
-        <w:t xml:space="preserve">dietary_review_processed_heated_foods</w:t>
+        <w:t xml:space="preserve">Stress / HPA-axis support</w:t>
       </w:r>
     </w:p>
     <w:p>
@@ -4124,7 +2555,7 @@
           <w:sz w:val="20"/>
           <w:szCs w:val="20"/>
         </w:rPr>
-        <w:t xml:space="preserve">Practitioner may wish to discuss reducing exposure to highly browned, caramelised or processed foods given elevated 5-hydroxymethyl-2-furoic acid.</w:t>
+        <w:t xml:space="preserve">The practitioner may wish to explore with the patient sleep hygiene, circadian alignment (morning light exposure, consistent bedtime), workload/recovery balance, and stress-reduction practices.</w:t>
       </w:r>
     </w:p>
     <w:p>
@@ -4149,7 +2580,7 @@
           <w:sz w:val="20"/>
           <w:szCs w:val="20"/>
         </w:rPr>
-        <w:t xml:space="preserve">Per published OA interpretation frameworks.</w:t>
+        <w:t xml:space="preserve">Low total urinary cortisol pattern alongside the patient's reported symptoms (fatigue cluster, sleep difficulty, burned-out feeling per symptom report) — for practitioner consideration.</w:t>
       </w:r>
     </w:p>
     <w:p>
@@ -4165,7 +2596,7 @@
           <w:sz w:val="22"/>
           <w:szCs w:val="22"/>
         </w:rPr>
-        <w:t xml:space="preserve">antioxidant_dense_diet</w:t>
+        <w:t xml:space="preserve">Fibre and bowel transit</w:t>
       </w:r>
     </w:p>
     <w:p>
@@ -4190,7 +2621,7 @@
           <w:sz w:val="20"/>
           <w:szCs w:val="20"/>
         </w:rPr>
-        <w:t xml:space="preserve">Practitioner may wish to discuss a diet rich in cruciferous vegetables, berries, green tea, and sulphur-rich foods (Allium spp.) to support endogenous antioxidant and Phase II detoxification capacity.</w:t>
+        <w:t xml:space="preserve">The practitioner may wish to discuss adequate soluble and insoluble fibre intake and regular bowel transit to support enterohepatic clearance of conjugated oestrogen metabolites.</w:t>
       </w:r>
     </w:p>
     <w:p>
@@ -4215,7 +2646,7 @@
           <w:sz w:val="20"/>
           <w:szCs w:val="20"/>
         </w:rPr>
-        <w:t xml:space="preserve">Elevated 8-OHdG and xenobiotic markers.</w:t>
+        <w:t xml:space="preserve">Pattern consistent with reduced oestrogen quotient and 2:16 ratio supports consideration of enterohepatic clearance optimisation.</w:t>
       </w:r>
     </w:p>
     <w:p>
@@ -4231,7 +2662,7 @@
           <w:sz w:val="22"/>
           <w:szCs w:val="22"/>
         </w:rPr>
-        <w:t xml:space="preserve">hydration_and_kidney_clearance</w:t>
+        <w:t xml:space="preserve">Alcohol moderation</w:t>
       </w:r>
     </w:p>
     <w:p>
@@ -4256,7 +2687,7 @@
           <w:sz w:val="20"/>
           <w:szCs w:val="20"/>
         </w:rPr>
-        <w:t xml:space="preserve">Adequate hydration supports renal clearance of conjugated xenobiotics — practitioner discretion.</w:t>
+        <w:t xml:space="preserve">The practitioner may wish to discuss alcohol intake as published literature identifies alcohol as a factor that may influence oestrogen metabolism and hepatic Phase II conjugation.</w:t>
       </w:r>
     </w:p>
     <w:p>
@@ -4281,7 +2712,73 @@
           <w:sz w:val="20"/>
           <w:szCs w:val="20"/>
         </w:rPr>
-        <w:t xml:space="preserve">Supports Phase II conjugate elimination.</w:t>
+        <w:t xml:space="preserve">For practitioner consideration in the context of oestrogen-metabolism pattern findings.</w:t>
+      </w:r>
+    </w:p>
+    <w:p>
+      <w:pPr>
+        <w:spacing w:after="60" w:before="120"/>
+      </w:pPr>
+      <w:r>
+        <w:rPr>
+          <w:rFonts w:ascii="Roboto" w:cs="Roboto" w:eastAsia="Roboto" w:hAnsi="Roboto"/>
+          <w:b/>
+          <w:bCs/>
+          <w:color w:val="535B50"/>
+          <w:sz w:val="22"/>
+          <w:szCs w:val="22"/>
+        </w:rPr>
+        <w:t xml:space="preserve">Protein adequacy</w:t>
+      </w:r>
+    </w:p>
+    <w:p>
+      <w:pPr>
+        <w:spacing w:after="60"/>
+      </w:pPr>
+      <w:r>
+        <w:rPr>
+          <w:rFonts w:ascii="Roboto" w:cs="Roboto" w:eastAsia="Roboto" w:hAnsi="Roboto"/>
+          <w:b/>
+          <w:bCs/>
+          <w:color w:val="535B50"/>
+          <w:sz w:val="20"/>
+          <w:szCs w:val="20"/>
+        </w:rPr>
+        <w:t xml:space="preserve">Consideration: </w:t>
+      </w:r>
+      <w:r>
+        <w:rPr>
+          <w:rFonts w:ascii="Roboto" w:cs="Roboto" w:eastAsia="Roboto" w:hAnsi="Roboto"/>
+          <w:color w:val="000000"/>
+          <w:sz w:val="20"/>
+          <w:szCs w:val="20"/>
+        </w:rPr>
+        <w:t xml:space="preserve">The practitioner may wish to assess protein adequacy as amino acids (glycine, taurine, methionine) are substrates for Phase II conjugation pathways.</w:t>
+      </w:r>
+    </w:p>
+    <w:p>
+      <w:pPr>
+        <w:spacing w:after="60"/>
+      </w:pPr>
+      <w:r>
+        <w:rPr>
+          <w:rFonts w:ascii="Roboto" w:cs="Roboto" w:eastAsia="Roboto" w:hAnsi="Roboto"/>
+          <w:b/>
+          <w:bCs/>
+          <w:color w:val="535B50"/>
+          <w:sz w:val="20"/>
+          <w:szCs w:val="20"/>
+        </w:rPr>
+        <w:t xml:space="preserve">Rationale: </w:t>
+      </w:r>
+      <w:r>
+        <w:rPr>
+          <w:rFonts w:ascii="Roboto" w:cs="Roboto" w:eastAsia="Roboto" w:hAnsi="Roboto"/>
+          <w:color w:val="000000"/>
+          <w:sz w:val="20"/>
+          <w:szCs w:val="20"/>
+        </w:rPr>
+        <w:t xml:space="preserve">Supports overall oestrogen and xenobiotic conjugation capacity.</w:t>
       </w:r>
     </w:p>
     <w:p>
@@ -4332,7 +2829,7 @@
           <w:sz w:val="22"/>
           <w:szCs w:val="22"/>
         </w:rPr>
-        <w:t xml:space="preserve">Six therapeutic axes are activated. Axis allocation (planned, ~700 granule target): antioxidant/redox + heavy/xenobiotic-detox combined ~210g (anchored on NAC + milk thistle + Cal D-glucarate + vitamin C + resveratrol); mitochondrial/cardiovascular ~120g (CoQ10 + alpha-lipoic acid); anti-inflammatory core ~150g (turmeric + boswellia + quercetin); B-vitamins/methylation ~80g (methyl-B12 + calcium folinate + P5P + B2); vitamin D/C bridge ~30g; minerals (magnesium glycinate) ~60g; with the granule budget concentrated on conjugation + redox given the xenobiotic-burdened pattern is the dominant signal. Step-3 foundational pass: NAC, milk thistle, CoQ10, turmeric, methylcobalamin, P5P, magnesium glycinate, Cal D-glucarate. Step 4 layered: vitamin C, ascorbic-supportive resveratrol, alpha-lipoic acid, quercetin, boswellia, B2, calcium folinate, vitamin D3. Step 5: last ingredient back-out applied to keep total ≤700.</w:t>
+        <w:t xml:space="preserve">The formulation addresses three recognised patterns: (1) HPA-hypocortisolism, (2) 16-OH-dominant oestrogen metabolism with low 2-OH substrate, and (3) preserved-but-substrate-limited COMT methylation. The hormone_metabolism axis receives primary allocation given the panel is principally an oestrogen-metabolism panel; the thyroid_adaptogenic axis receives strong secondary allocation for HPA support; methylation cofactors, magnesium, mitochondrial/adrenal support (CoQ10), antioxidant redox, and vitamin C/D round out the formulation. Foundational ingredients are placed across all activated axes first, then the pod is filled with complementary layer ingredients via cycling in priority order. The Step 3 foundational-pass running total was approximately 470 granules, well below the 1000-granule threshold for catalyst-layer strategy, so the standard layer-pass strategy applies. Per-ingredient doses sit within Library maxima and overall pod loading is targeted at the 630–710 granule fill range.</w:t>
       </w:r>
     </w:p>
     <w:p>
@@ -4373,7 +2870,7 @@
           <w:sz w:val="20"/>
           <w:szCs w:val="20"/>
         </w:rPr>
-        <w:t xml:space="preserve">NAC — anchors antioxidant axis + glutathione precursor for xenobiotic conjugation (8-OHdG, t,t-muconic, pyroglutamic).</w:t>
+        <w:t xml:space="preserve">DIM (W140019000) at 100 mg as the foundational hormone_metabolism agent for shifting Phase I oestrogen hydroxylation toward 2-OH pathway — directly addresses low 2-OH Estrone and low 2:16 ratio.</w:t>
       </w:r>
     </w:p>
     <w:p>
@@ -4398,7 +2895,7 @@
           <w:sz w:val="20"/>
           <w:szCs w:val="20"/>
         </w:rPr>
-        <w:t xml:space="preserve">Milk thistle (silymarin) — Phase II Nrf2 upregulation + hepatoprotection for xenobiotic burden.</w:t>
+        <w:t xml:space="preserve">Calcium D-glucarate (W040012000) at 500 mg for glucuronidation support and beta-glucuronidase inhibition — supports Phase II clearance of conjugated oestrogens, addressing low oestrogen quotient.</w:t>
       </w:r>
     </w:p>
     <w:p>
@@ -4423,7 +2920,7 @@
           <w:sz w:val="20"/>
           <w:szCs w:val="20"/>
         </w:rPr>
-        <w:t xml:space="preserve">Calcium D-glucarate — glucuronidation support for paraben/phthalate/xenobiotic conjugation.</w:t>
+        <w:t xml:space="preserve">Milk thistle / silymarin (W010013000) at 150 mg for Nrf2-mediated Phase II hepatic conjugation support.</w:t>
       </w:r>
     </w:p>
     <w:p>
@@ -4448,7 +2945,7 @@
           <w:sz w:val="20"/>
           <w:szCs w:val="20"/>
         </w:rPr>
-        <w:t xml:space="preserve">Vitamin C (ascorbic acid) — antioxidant load aligned with 8-OHdG elevation.</w:t>
+        <w:t xml:space="preserve">Resveratrol (W010019000) at 150 mg for mild aromatase modulation and 2-OH pathway support; chosen because the patient is male with mid-range testosterone and patterns suggest oestrogen metabolism balance is the focus rather than androgen modulation.</w:t>
       </w:r>
     </w:p>
     <w:p>
@@ -4473,7 +2970,7 @@
           <w:sz w:val="20"/>
           <w:szCs w:val="20"/>
         </w:rPr>
-        <w:t xml:space="preserve">Resveratrol — Nrf2/sirtuin antioxidant adjunct.</w:t>
+        <w:t xml:space="preserve">Ashwagandha (W010003000) at 300 mg as the foundational adaptogen for HPA-hypocortisolism pattern — supports HPA resilience.</w:t>
       </w:r>
     </w:p>
     <w:p>
@@ -4498,7 +2995,7 @@
           <w:sz w:val="20"/>
           <w:szCs w:val="20"/>
         </w:rPr>
-        <w:t xml:space="preserve">Turmeric (curcumin) — NF-κB anchor for inflammatory/leukotriene activity.</w:t>
+        <w:t xml:space="preserve">Rhodiola (W010020000) at 200 mg as a complementary HPA adaptogen.</w:t>
       </w:r>
     </w:p>
     <w:p>
@@ -4523,7 +3020,7 @@
           <w:sz w:val="20"/>
           <w:szCs w:val="20"/>
         </w:rPr>
-        <w:t xml:space="preserve">Boswellia — 5-LOX coverage given LTE4 elevation.</w:t>
+        <w:t xml:space="preserve">American ginseng (W010001000) at 200 mg as additional HPA support given the low cortisol pattern.</w:t>
       </w:r>
     </w:p>
     <w:p>
@@ -4548,7 +3045,7 @@
           <w:sz w:val="20"/>
           <w:szCs w:val="20"/>
         </w:rPr>
-        <w:t xml:space="preserve">Quercetin — mast-cell stabilising/anti-inflammatory complement to LTE4 elevation.</w:t>
+        <w:t xml:space="preserve">Coenzyme Q10 (W030021000) at 100 mg for mitochondrial/adrenal energetics in the context of HPA-hypocortisolism.</w:t>
       </w:r>
     </w:p>
     <w:p>
@@ -4573,7 +3070,7 @@
           <w:sz w:val="20"/>
           <w:szCs w:val="20"/>
         </w:rPr>
-        <w:t xml:space="preserve">CoQ10 — mitochondrial electron transport + mevalonate pathway support.</w:t>
+        <w:t xml:space="preserve">Methylcobalamin B12 (W030008000) at 500 mcg, Calcium folinate (W030027000) at 547 mcg (capped at TGA maximum of 500 mcg folinic acid), P5P/B6 (W030012000) at 15.68 mg, Riboflavin B2 (W030011000) at 20 mg — methylation cofactor stack supporting COMT and overall methylation cycle.</w:t>
       </w:r>
     </w:p>
     <w:p>
@@ -4598,7 +3095,7 @@
           <w:sz w:val="20"/>
           <w:szCs w:val="20"/>
         </w:rPr>
-        <w:t xml:space="preserve">Alpha-lipoic acid — TCA dehydrogenase cofactor and antioxidant/heavy-metal buffering.</w:t>
+        <w:t xml:space="preserve">Pantothenic acid B5 (W030004000) at 218.4 mg as specific adrenal cofactor (CoA precursor) for HPA support.</w:t>
       </w:r>
     </w:p>
     <w:p>
@@ -4623,7 +3120,7 @@
           <w:sz w:val="20"/>
           <w:szCs w:val="20"/>
         </w:rPr>
-        <w:t xml:space="preserve">Methylcobalamin — methylation cycle support given guanidinoacetic, KMBA, 5-methylcytosine elevation.</w:t>
+        <w:t xml:space="preserve">Nicotinamide B3 (W030003000) at 50 mg for general energy/redox support.</w:t>
       </w:r>
     </w:p>
     <w:p>
@@ -4648,7 +3145,7 @@
           <w:sz w:val="20"/>
           <w:szCs w:val="20"/>
         </w:rPr>
-        <w:t xml:space="preserve">Calcium folinate — folate cycle cofactor for one-carbon support.</w:t>
+        <w:t xml:space="preserve">Magnesium glycinate (W040002000) at 119.7 mg elemental (1023.5 mg salt) — COMT cofactor and HPA support; dose-reduced from 300 mg elemental clinical target to fit the pod budget.</w:t>
       </w:r>
     </w:p>
     <w:p>
@@ -4673,7 +3170,7 @@
           <w:sz w:val="20"/>
           <w:szCs w:val="20"/>
         </w:rPr>
-        <w:t xml:space="preserve">Pyridoxal-5-phosphate (P5P) — anchors kynurenine pathway support given xanthurenic elevation.</w:t>
+        <w:t xml:space="preserve">Zinc citrate (W040008000) at 24.92 mg elemental — moderate dose for aromatase modulation, immune and steroidogenic support; deliberately moderate rather than maximum given testosterone is mid-range.</w:t>
       </w:r>
     </w:p>
     <w:p>
@@ -4698,7 +3195,7 @@
           <w:sz w:val="20"/>
           <w:szCs w:val="20"/>
         </w:rPr>
-        <w:t xml:space="preserve">Riboflavin (B2) — FAD cofactor for kynurenine monooxygenase and mitochondrial flavoproteins.</w:t>
+        <w:t xml:space="preserve">NAC (W140010000) at 500 mg as antioxidant/quinone-quenching agent and glutathione precursor.</w:t>
       </w:r>
     </w:p>
     <w:p>
@@ -4723,7 +3220,7 @@
           <w:sz w:val="20"/>
           <w:szCs w:val="20"/>
         </w:rPr>
-        <w:t xml:space="preserve">Magnesium glycinate — broad mitochondrial/methylation cofactor; glycine moiety contributes incidentally to conjugation pathway support.</w:t>
+        <w:t xml:space="preserve">Quercetin (W010031000) at 227.2 mg (250 mg salt) for antioxidant and oestrogen-metabolism support.</w:t>
       </w:r>
     </w:p>
     <w:p>
@@ -4748,7 +3245,32 @@
           <w:sz w:val="20"/>
           <w:szCs w:val="20"/>
         </w:rPr>
-        <w:t xml:space="preserve">Vitamin D3 — included at conservative dose for general repletion alongside other foundational nutrients.</w:t>
+        <w:t xml:space="preserve">Vitamin C (W030001000) at 500 mg as adrenal cofactor and antioxidant.</w:t>
+      </w:r>
+    </w:p>
+    <w:p>
+      <w:pPr>
+        <w:spacing w:after="60"/>
+      </w:pPr>
+      <w:r>
+        <w:rPr>
+          <w:rFonts w:ascii="Roboto" w:cs="Roboto" w:eastAsia="Roboto" w:hAnsi="Roboto"/>
+          <w:b/>
+          <w:bCs/>
+          <w:color w:val="C3AF88"/>
+          <w:sz w:val="22"/>
+          <w:szCs w:val="22"/>
+        </w:rPr>
+        <w:t xml:space="preserve">• </w:t>
+      </w:r>
+      <w:r>
+        <w:rPr>
+          <w:rFonts w:ascii="Roboto" w:cs="Roboto" w:eastAsia="Roboto" w:hAnsi="Roboto"/>
+          <w:color w:val="000000"/>
+          <w:sz w:val="20"/>
+          <w:szCs w:val="20"/>
+        </w:rPr>
+        <w:t xml:space="preserve">Vitamin D3 (W030005000) at 25 mcg (1000 IU) for general endocrine support at Library maximum daily dose.</w:t>
       </w:r>
     </w:p>
     <w:p>
@@ -4789,7 +3311,7 @@
           <w:sz w:val="20"/>
           <w:szCs w:val="20"/>
         </w:rPr>
-        <w:t xml:space="preserve">Iron (W040001000) — No indication of iron deficiency on the OA panel; standard contraindication consideration in adult female without ferritin data — not added.</w:t>
+        <w:t xml:space="preserve">Saw palmetto (W010043000) — Testosterone is mid-range and androgen-excess pattern is not activated on this panel; 5-alpha-reductase suppression is not indicated.</w:t>
       </w:r>
     </w:p>
     <w:p>
@@ -4814,7 +3336,7 @@
           <w:sz w:val="20"/>
           <w:szCs w:val="20"/>
         </w:rPr>
-        <w:t xml:space="preserve">Iodine (W030014000) — Panel does not indicate thyroid axis driver; not prioritised within the granule budget.</w:t>
+        <w:t xml:space="preserve">High-dose iodine (&gt;150 mcg) — Conservative binding-exclusion principle in the absence of thyroid antibody data on this panel; not indicated by HMP findings.</w:t>
       </w:r>
     </w:p>
     <w:p>
@@ -4839,7 +3361,7 @@
           <w:sz w:val="20"/>
           <w:szCs w:val="20"/>
         </w:rPr>
-        <w:t xml:space="preserve">5-HTP (W130002000) — Serotonin metabolite (5-HIAA) within range; without medication context to rule out serotonergic interactions, deprioritised — surfaced for practitioner review only.</w:t>
+        <w:t xml:space="preserve">Selenium — Not indicated by panel findings; no thyroid driver activated. Excluded by deprioritisation rather than binding exclusion.</w:t>
       </w:r>
     </w:p>
     <w:p>
@@ -4864,7 +3386,7 @@
           <w:sz w:val="20"/>
           <w:szCs w:val="20"/>
         </w:rPr>
-        <w:t xml:space="preserve">Selenium — Red-cell selenium not measured; conservative omission within budget constraints.</w:t>
+        <w:t xml:space="preserve">Iron — Not indicated by panel findings; no iron-deficiency or iron-overload pattern activated.</w:t>
       </w:r>
     </w:p>
     <w:p>
@@ -4889,7 +3411,7 @@
           <w:sz w:val="20"/>
           <w:szCs w:val="20"/>
         </w:rPr>
-        <w:t xml:space="preserve">Copper — Cu:Zn data not provided; binding-exclusion safety floor applied (omit copper when status unknown alongside redox stress).</w:t>
+        <w:t xml:space="preserve">Copper — Not indicated by panel findings; no Cu/Zn imbalance pattern available from this panel.</w:t>
       </w:r>
     </w:p>
     <w:p>
@@ -4914,7 +3436,7 @@
           <w:sz w:val="20"/>
           <w:szCs w:val="20"/>
         </w:rPr>
-        <w:t xml:space="preserve">L-Carnitine — Not present in supplied Library; surfaced as standalone given adipic acid elevation.</w:t>
+        <w:t xml:space="preserve">5-HTP — No serotonergic driver on this panel; serotonin-syndrome risk principle applies as a general caution given medications were not provided.</w:t>
       </w:r>
     </w:p>
     <w:p>
@@ -4939,7 +3461,7 @@
           <w:sz w:val="20"/>
           <w:szCs w:val="20"/>
         </w:rPr>
-        <w:t xml:space="preserve">Glycine — Not present in supplied Library; surfaced as standalone given prominent benzoate/xylene conjugation findings.</w:t>
+        <w:t xml:space="preserve">Berberine — Glucose / cardiometabolic axis is not activated by this panel.</w:t>
       </w:r>
     </w:p>
     <w:p>
@@ -4964,32 +3486,7 @@
           <w:sz w:val="20"/>
           <w:szCs w:val="20"/>
         </w:rPr>
-        <w:t xml:space="preserve">EPA/DHA omega-3 — Not present in supplied granule Library; surfaced as standalone given LTE4 elevation.</w:t>
-      </w:r>
-    </w:p>
-    <w:p>
-      <w:pPr>
-        <w:spacing w:after="60"/>
-      </w:pPr>
-      <w:r>
-        <w:rPr>
-          <w:rFonts w:ascii="Roboto" w:cs="Roboto" w:eastAsia="Roboto" w:hAnsi="Roboto"/>
-          <w:b/>
-          <w:bCs/>
-          <w:color w:val="C3AF88"/>
-          <w:sz w:val="22"/>
-          <w:szCs w:val="22"/>
-        </w:rPr>
-        <w:t xml:space="preserve">• </w:t>
-      </w:r>
-      <w:r>
-        <w:rPr>
-          <w:rFonts w:ascii="Roboto" w:cs="Roboto" w:eastAsia="Roboto" w:hAnsi="Roboto"/>
-          <w:color w:val="000000"/>
-          <w:sz w:val="20"/>
-          <w:szCs w:val="20"/>
-        </w:rPr>
-        <w:t xml:space="preserve">Specific probiotic strains — Not in supplied Library as granule products; surfaced as standalone given modest dysbiosis markers.</w:t>
+        <w:t xml:space="preserve">Vitex / Chaste tree — Patient is male; not indicated.</w:t>
       </w:r>
     </w:p>
     <w:p>
@@ -5263,7 +3760,7 @@
                 <w:sz w:val="20"/>
                 <w:szCs w:val="20"/>
               </w:rPr>
-              <w:t xml:space="preserve">no_medication_list_provided</w:t>
+              <w:t xml:space="preserve">No medication context provided</w:t>
             </w:r>
           </w:p>
         </w:tc>
@@ -5293,7 +3790,7 @@
                 <w:sz w:val="20"/>
                 <w:szCs w:val="20"/>
               </w:rPr>
-              <w:t xml:space="preserve">Clinical notes did not list current medications. Standard contraindication screens (5-HTP with serotonergics; berberine with glucose-lowering agents; curcumin/resveratrol with anticoagulants; magnesium with antibiotics/bisphosphonates; St John's Wort with multiple meds) were therefore applied to the formulation in the abstract. 5-HTP and berberine were not included in this formulation. Curcumin, resveratrol and magnesium have been included — practitioner to verify against the patient's full medication list.</w:t>
+              <w:t xml:space="preserve">Practitioner's clinical notes did not list current medications. Standard contraindication checks are therefore based on the formulation alone. The practitioner may wish to confirm absence of: anticoagulants (relevant to resveratrol and CoQ10 per TGA warnings), thyroid medications (relevant to ashwagandha caution), immunosuppressants (relevant to adaptogens), glucose-lowering agents (relevant to American ginseng), antihypertensives (relevant to American ginseng), and CYP3A4/2D6 substrates.</w:t>
             </w:r>
           </w:p>
         </w:tc>
@@ -5351,11 +3848,11 @@
                 <w:rFonts w:ascii="Roboto" w:cs="Roboto" w:eastAsia="Roboto" w:hAnsi="Roboto"/>
                 <w:b/>
                 <w:bCs/>
-                <w:color w:val="666666"/>
+                <w:color w:val="C3AF88"/>
                 <w:sz w:val="20"/>
                 <w:szCs w:val="20"/>
               </w:rPr>
-              <w:t xml:space="preserve">not_applicable</w:t>
+              <w:t xml:space="preserve">moderate</w:t>
             </w:r>
           </w:p>
         </w:tc>
@@ -5385,7 +3882,7 @@
                 <w:sz w:val="20"/>
                 <w:szCs w:val="20"/>
               </w:rPr>
-              <w:t xml:space="preserve">iodine_thyroid_antibody_status_not_provided</w:t>
+              <w:t xml:space="preserve">Resveratrol — warfarin interaction risk</w:t>
             </w:r>
           </w:p>
         </w:tc>
@@ -5415,7 +3912,7 @@
                 <w:sz w:val="20"/>
                 <w:szCs w:val="20"/>
               </w:rPr>
-              <w:t xml:space="preserve">Iodine was not included in this formulation; antibody status not relevant for this submission.</w:t>
+              <w:t xml:space="preserve">TGA-required label warning notes resveratrol may affect anticoagulants including warfarin. Confirm patient is not on anticoagulants before recommending.</w:t>
             </w:r>
           </w:p>
         </w:tc>
@@ -5445,7 +3942,373 @@
                 <w:sz w:val="20"/>
                 <w:szCs w:val="20"/>
               </w:rPr>
-              <w:t xml:space="preserve">—</w:t>
+              <w:t xml:space="preserve">Resveratrol</w:t>
+            </w:r>
+          </w:p>
+        </w:tc>
+      </w:tr>
+      <w:tr>
+        <w:tc>
+          <w:tcPr>
+            <w:tcW w:type="dxa" w:w="1263"/>
+            <w:tcBorders>
+              <w:top w:val="single" w:color="CCCCCC" w:sz="4"/>
+              <w:left w:val="single" w:color="CCCCCC" w:sz="4"/>
+              <w:bottom w:val="single" w:color="CCCCCC" w:sz="4"/>
+              <w:right w:val="single" w:color="CCCCCC" w:sz="4"/>
+            </w:tcBorders>
+            <w:tcMar>
+              <w:top w:type="dxa" w:w="100"/>
+              <w:left w:type="dxa" w:w="140"/>
+              <w:bottom w:type="dxa" w:w="100"/>
+              <w:right w:type="dxa" w:w="140"/>
+            </w:tcMar>
+          </w:tcPr>
+          <w:p>
+            <w:r>
+              <w:rPr>
+                <w:rFonts w:ascii="Roboto" w:cs="Roboto" w:eastAsia="Roboto" w:hAnsi="Roboto"/>
+                <w:b/>
+                <w:bCs/>
+                <w:color w:val="C3AF88"/>
+                <w:sz w:val="20"/>
+                <w:szCs w:val="20"/>
+              </w:rPr>
+              <w:t xml:space="preserve">moderate</w:t>
+            </w:r>
+          </w:p>
+        </w:tc>
+        <w:tc>
+          <w:tcPr>
+            <w:tcW w:type="dxa" w:w="1985"/>
+            <w:tcBorders>
+              <w:top w:val="single" w:color="CCCCCC" w:sz="4"/>
+              <w:left w:val="single" w:color="CCCCCC" w:sz="4"/>
+              <w:bottom w:val="single" w:color="CCCCCC" w:sz="4"/>
+              <w:right w:val="single" w:color="CCCCCC" w:sz="4"/>
+            </w:tcBorders>
+            <w:tcMar>
+              <w:top w:type="dxa" w:w="100"/>
+              <w:left w:type="dxa" w:w="140"/>
+              <w:bottom w:type="dxa" w:w="100"/>
+              <w:right w:type="dxa" w:w="140"/>
+            </w:tcMar>
+          </w:tcPr>
+          <w:p>
+            <w:r>
+              <w:rPr>
+                <w:rFonts w:ascii="Roboto" w:cs="Roboto" w:eastAsia="Roboto" w:hAnsi="Roboto"/>
+                <w:b w:val="false"/>
+                <w:bCs w:val="false"/>
+                <w:color w:val="000000"/>
+                <w:sz w:val="20"/>
+                <w:szCs w:val="20"/>
+              </w:rPr>
+              <w:t xml:space="preserve">CoQ10 — warfarin interaction risk</w:t>
+            </w:r>
+          </w:p>
+        </w:tc>
+        <w:tc>
+          <w:tcPr>
+            <w:tcW w:type="dxa" w:w="4151"/>
+            <w:tcBorders>
+              <w:top w:val="single" w:color="CCCCCC" w:sz="4"/>
+              <w:left w:val="single" w:color="CCCCCC" w:sz="4"/>
+              <w:bottom w:val="single" w:color="CCCCCC" w:sz="4"/>
+              <w:right w:val="single" w:color="CCCCCC" w:sz="4"/>
+            </w:tcBorders>
+            <w:tcMar>
+              <w:top w:type="dxa" w:w="100"/>
+              <w:left w:type="dxa" w:w="140"/>
+              <w:bottom w:type="dxa" w:w="100"/>
+              <w:right w:type="dxa" w:w="140"/>
+            </w:tcMar>
+          </w:tcPr>
+          <w:p>
+            <w:r>
+              <w:rPr>
+                <w:rFonts w:ascii="Roboto" w:cs="Roboto" w:eastAsia="Roboto" w:hAnsi="Roboto"/>
+                <w:b w:val="false"/>
+                <w:bCs w:val="false"/>
+                <w:color w:val="000000"/>
+                <w:sz w:val="20"/>
+                <w:szCs w:val="20"/>
+              </w:rPr>
+              <w:t xml:space="preserve">TGA-required label warning notes caution with warfarin therapy. Confirm patient is not on anticoagulants before recommending.</w:t>
+            </w:r>
+          </w:p>
+        </w:tc>
+        <w:tc>
+          <w:tcPr>
+            <w:tcW w:type="dxa" w:w="1624"/>
+            <w:tcBorders>
+              <w:top w:val="single" w:color="CCCCCC" w:sz="4"/>
+              <w:left w:val="single" w:color="CCCCCC" w:sz="4"/>
+              <w:bottom w:val="single" w:color="CCCCCC" w:sz="4"/>
+              <w:right w:val="single" w:color="CCCCCC" w:sz="4"/>
+            </w:tcBorders>
+            <w:tcMar>
+              <w:top w:type="dxa" w:w="100"/>
+              <w:left w:type="dxa" w:w="140"/>
+              <w:bottom w:type="dxa" w:w="100"/>
+              <w:right w:type="dxa" w:w="140"/>
+            </w:tcMar>
+          </w:tcPr>
+          <w:p>
+            <w:r>
+              <w:rPr>
+                <w:rFonts w:ascii="Roboto" w:cs="Roboto" w:eastAsia="Roboto" w:hAnsi="Roboto"/>
+                <w:b w:val="false"/>
+                <w:bCs w:val="false"/>
+                <w:color w:val="000000"/>
+                <w:sz w:val="20"/>
+                <w:szCs w:val="20"/>
+              </w:rPr>
+              <w:t xml:space="preserve">Coenzyme Q10</w:t>
+            </w:r>
+          </w:p>
+        </w:tc>
+      </w:tr>
+      <w:tr>
+        <w:tc>
+          <w:tcPr>
+            <w:tcW w:type="dxa" w:w="1263"/>
+            <w:tcBorders>
+              <w:top w:val="single" w:color="CCCCCC" w:sz="4"/>
+              <w:left w:val="single" w:color="CCCCCC" w:sz="4"/>
+              <w:bottom w:val="single" w:color="CCCCCC" w:sz="4"/>
+              <w:right w:val="single" w:color="CCCCCC" w:sz="4"/>
+            </w:tcBorders>
+            <w:tcMar>
+              <w:top w:type="dxa" w:w="100"/>
+              <w:left w:type="dxa" w:w="140"/>
+              <w:bottom w:type="dxa" w:w="100"/>
+              <w:right w:type="dxa" w:w="140"/>
+            </w:tcMar>
+          </w:tcPr>
+          <w:p>
+            <w:r>
+              <w:rPr>
+                <w:rFonts w:ascii="Roboto" w:cs="Roboto" w:eastAsia="Roboto" w:hAnsi="Roboto"/>
+                <w:b/>
+                <w:bCs/>
+                <w:color w:val="666666"/>
+                <w:sz w:val="20"/>
+                <w:szCs w:val="20"/>
+              </w:rPr>
+              <w:t xml:space="preserve">monitor</w:t>
+            </w:r>
+          </w:p>
+        </w:tc>
+        <w:tc>
+          <w:tcPr>
+            <w:tcW w:type="dxa" w:w="1985"/>
+            <w:tcBorders>
+              <w:top w:val="single" w:color="CCCCCC" w:sz="4"/>
+              <w:left w:val="single" w:color="CCCCCC" w:sz="4"/>
+              <w:bottom w:val="single" w:color="CCCCCC" w:sz="4"/>
+              <w:right w:val="single" w:color="CCCCCC" w:sz="4"/>
+            </w:tcBorders>
+            <w:tcMar>
+              <w:top w:type="dxa" w:w="100"/>
+              <w:left w:type="dxa" w:w="140"/>
+              <w:bottom w:type="dxa" w:w="100"/>
+              <w:right w:type="dxa" w:w="140"/>
+            </w:tcMar>
+          </w:tcPr>
+          <w:p>
+            <w:r>
+              <w:rPr>
+                <w:rFonts w:ascii="Roboto" w:cs="Roboto" w:eastAsia="Roboto" w:hAnsi="Roboto"/>
+                <w:b w:val="false"/>
+                <w:bCs w:val="false"/>
+                <w:color w:val="000000"/>
+                <w:sz w:val="20"/>
+                <w:szCs w:val="20"/>
+              </w:rPr>
+              <w:t xml:space="preserve">Vitamin B6 peripheral neuropathy</w:t>
+            </w:r>
+          </w:p>
+        </w:tc>
+        <w:tc>
+          <w:tcPr>
+            <w:tcW w:type="dxa" w:w="4151"/>
+            <w:tcBorders>
+              <w:top w:val="single" w:color="CCCCCC" w:sz="4"/>
+              <w:left w:val="single" w:color="CCCCCC" w:sz="4"/>
+              <w:bottom w:val="single" w:color="CCCCCC" w:sz="4"/>
+              <w:right w:val="single" w:color="CCCCCC" w:sz="4"/>
+            </w:tcBorders>
+            <w:tcMar>
+              <w:top w:type="dxa" w:w="100"/>
+              <w:left w:type="dxa" w:w="140"/>
+              <w:bottom w:type="dxa" w:w="100"/>
+              <w:right w:type="dxa" w:w="140"/>
+            </w:tcMar>
+          </w:tcPr>
+          <w:p>
+            <w:r>
+              <w:rPr>
+                <w:rFonts w:ascii="Roboto" w:cs="Roboto" w:eastAsia="Roboto" w:hAnsi="Roboto"/>
+                <w:b w:val="false"/>
+                <w:bCs w:val="false"/>
+                <w:color w:val="000000"/>
+                <w:sz w:val="20"/>
+                <w:szCs w:val="20"/>
+              </w:rPr>
+              <w:t xml:space="preserve">TGA-required label warning advises monitoring for tingling, burning, or numbness with vitamin B6 use. Dose in this formulation is conservative (10 mg pyridoxine equivalent) and well below regulatory thresholds, but the practitioner may wish to monitor on follow-up.</w:t>
+            </w:r>
+          </w:p>
+        </w:tc>
+        <w:tc>
+          <w:tcPr>
+            <w:tcW w:type="dxa" w:w="1624"/>
+            <w:tcBorders>
+              <w:top w:val="single" w:color="CCCCCC" w:sz="4"/>
+              <w:left w:val="single" w:color="CCCCCC" w:sz="4"/>
+              <w:bottom w:val="single" w:color="CCCCCC" w:sz="4"/>
+              <w:right w:val="single" w:color="CCCCCC" w:sz="4"/>
+            </w:tcBorders>
+            <w:tcMar>
+              <w:top w:type="dxa" w:w="100"/>
+              <w:left w:type="dxa" w:w="140"/>
+              <w:bottom w:type="dxa" w:w="100"/>
+              <w:right w:type="dxa" w:w="140"/>
+            </w:tcMar>
+          </w:tcPr>
+          <w:p>
+            <w:r>
+              <w:rPr>
+                <w:rFonts w:ascii="Roboto" w:cs="Roboto" w:eastAsia="Roboto" w:hAnsi="Roboto"/>
+                <w:b w:val="false"/>
+                <w:bCs w:val="false"/>
+                <w:color w:val="000000"/>
+                <w:sz w:val="20"/>
+                <w:szCs w:val="20"/>
+              </w:rPr>
+              <w:t xml:space="preserve">Vitamin B6 (P5P)</w:t>
+            </w:r>
+          </w:p>
+        </w:tc>
+      </w:tr>
+      <w:tr>
+        <w:tc>
+          <w:tcPr>
+            <w:tcW w:type="dxa" w:w="1263"/>
+            <w:tcBorders>
+              <w:top w:val="single" w:color="CCCCCC" w:sz="4"/>
+              <w:left w:val="single" w:color="CCCCCC" w:sz="4"/>
+              <w:bottom w:val="single" w:color="CCCCCC" w:sz="4"/>
+              <w:right w:val="single" w:color="CCCCCC" w:sz="4"/>
+            </w:tcBorders>
+            <w:tcMar>
+              <w:top w:type="dxa" w:w="100"/>
+              <w:left w:type="dxa" w:w="140"/>
+              <w:bottom w:type="dxa" w:w="100"/>
+              <w:right w:type="dxa" w:w="140"/>
+            </w:tcMar>
+          </w:tcPr>
+          <w:p>
+            <w:r>
+              <w:rPr>
+                <w:rFonts w:ascii="Roboto" w:cs="Roboto" w:eastAsia="Roboto" w:hAnsi="Roboto"/>
+                <w:b/>
+                <w:bCs/>
+                <w:color w:val="666666"/>
+                <w:sz w:val="20"/>
+                <w:szCs w:val="20"/>
+              </w:rPr>
+              <w:t xml:space="preserve">monitor</w:t>
+            </w:r>
+          </w:p>
+        </w:tc>
+        <w:tc>
+          <w:tcPr>
+            <w:tcW w:type="dxa" w:w="1985"/>
+            <w:tcBorders>
+              <w:top w:val="single" w:color="CCCCCC" w:sz="4"/>
+              <w:left w:val="single" w:color="CCCCCC" w:sz="4"/>
+              <w:bottom w:val="single" w:color="CCCCCC" w:sz="4"/>
+              <w:right w:val="single" w:color="CCCCCC" w:sz="4"/>
+            </w:tcBorders>
+            <w:tcMar>
+              <w:top w:type="dxa" w:w="100"/>
+              <w:left w:type="dxa" w:w="140"/>
+              <w:bottom w:type="dxa" w:w="100"/>
+              <w:right w:type="dxa" w:w="140"/>
+            </w:tcMar>
+          </w:tcPr>
+          <w:p>
+            <w:r>
+              <w:rPr>
+                <w:rFonts w:ascii="Roboto" w:cs="Roboto" w:eastAsia="Roboto" w:hAnsi="Roboto"/>
+                <w:b w:val="false"/>
+                <w:bCs w:val="false"/>
+                <w:color w:val="000000"/>
+                <w:sz w:val="20"/>
+                <w:szCs w:val="20"/>
+              </w:rPr>
+              <w:t xml:space="preserve">Long-term zinc and copper status</w:t>
+            </w:r>
+          </w:p>
+        </w:tc>
+        <w:tc>
+          <w:tcPr>
+            <w:tcW w:type="dxa" w:w="4151"/>
+            <w:tcBorders>
+              <w:top w:val="single" w:color="CCCCCC" w:sz="4"/>
+              <w:left w:val="single" w:color="CCCCCC" w:sz="4"/>
+              <w:bottom w:val="single" w:color="CCCCCC" w:sz="4"/>
+              <w:right w:val="single" w:color="CCCCCC" w:sz="4"/>
+            </w:tcBorders>
+            <w:tcMar>
+              <w:top w:type="dxa" w:w="100"/>
+              <w:left w:type="dxa" w:w="140"/>
+              <w:bottom w:type="dxa" w:w="100"/>
+              <w:right w:type="dxa" w:w="140"/>
+            </w:tcMar>
+          </w:tcPr>
+          <w:p>
+            <w:r>
+              <w:rPr>
+                <w:rFonts w:ascii="Roboto" w:cs="Roboto" w:eastAsia="Roboto" w:hAnsi="Roboto"/>
+                <w:b w:val="false"/>
+                <w:bCs w:val="false"/>
+                <w:color w:val="000000"/>
+                <w:sz w:val="20"/>
+                <w:szCs w:val="20"/>
+              </w:rPr>
+              <w:t xml:space="preserve">Zinc at 25 mg elemental long-term (&gt;3 months) warrants practitioner consideration of copper status per standard frameworks. Re-test or clinical review at appropriate intervals.</w:t>
+            </w:r>
+          </w:p>
+        </w:tc>
+        <w:tc>
+          <w:tcPr>
+            <w:tcW w:type="dxa" w:w="1624"/>
+            <w:tcBorders>
+              <w:top w:val="single" w:color="CCCCCC" w:sz="4"/>
+              <w:left w:val="single" w:color="CCCCCC" w:sz="4"/>
+              <w:bottom w:val="single" w:color="CCCCCC" w:sz="4"/>
+              <w:right w:val="single" w:color="CCCCCC" w:sz="4"/>
+            </w:tcBorders>
+            <w:tcMar>
+              <w:top w:type="dxa" w:w="100"/>
+              <w:left w:type="dxa" w:w="140"/>
+              <w:bottom w:type="dxa" w:w="100"/>
+              <w:right w:type="dxa" w:w="140"/>
+            </w:tcMar>
+          </w:tcPr>
+          <w:p>
+            <w:r>
+              <w:rPr>
+                <w:rFonts w:ascii="Roboto" w:cs="Roboto" w:eastAsia="Roboto" w:hAnsi="Roboto"/>
+                <w:b w:val="false"/>
+                <w:bCs w:val="false"/>
+                <w:color w:val="000000"/>
+                <w:sz w:val="20"/>
+                <w:szCs w:val="20"/>
+              </w:rPr>
+              <w:t xml:space="preserve">Zinc citrate</w:t>
             </w:r>
           </w:p>
         </w:tc>
@@ -5507,7 +4370,7 @@
                 <w:sz w:val="20"/>
                 <w:szCs w:val="20"/>
               </w:rPr>
-              <w:t xml:space="preserve">selenium_red_cell_status_not_provided</w:t>
+              <w:t xml:space="preserve">Iodine — binding exclusion applied</w:t>
             </w:r>
           </w:p>
         </w:tc>
@@ -5537,374 +4400,7 @@
                 <w:sz w:val="20"/>
                 <w:szCs w:val="20"/>
               </w:rPr>
-              <w:t xml:space="preserve">Selenium omitted in the absence of red-cell selenium data — system safety floor.</w:t>
-            </w:r>
-          </w:p>
-        </w:tc>
-        <w:tc>
-          <w:tcPr>
-            <w:tcW w:type="dxa" w:w="1624"/>
-            <w:tcBorders>
-              <w:top w:val="single" w:color="CCCCCC" w:sz="4"/>
-              <w:left w:val="single" w:color="CCCCCC" w:sz="4"/>
-              <w:bottom w:val="single" w:color="CCCCCC" w:sz="4"/>
-              <w:right w:val="single" w:color="CCCCCC" w:sz="4"/>
-            </w:tcBorders>
-            <w:tcMar>
-              <w:top w:type="dxa" w:w="100"/>
-              <w:left w:type="dxa" w:w="140"/>
-              <w:bottom w:type="dxa" w:w="100"/>
-              <w:right w:type="dxa" w:w="140"/>
-            </w:tcMar>
-          </w:tcPr>
-          <w:p>
-            <w:r>
-              <w:rPr>
-                <w:rFonts w:ascii="Roboto" w:cs="Roboto" w:eastAsia="Roboto" w:hAnsi="Roboto"/>
-                <w:b w:val="false"/>
-                <w:bCs w:val="false"/>
-                <w:color w:val="000000"/>
-                <w:sz w:val="20"/>
-                <w:szCs w:val="20"/>
-              </w:rPr>
-              <w:t xml:space="preserve">Selenium
-(Selenomethionine)</w:t>
-            </w:r>
-          </w:p>
-        </w:tc>
-      </w:tr>
-      <w:tr>
-        <w:tc>
-          <w:tcPr>
-            <w:tcW w:type="dxa" w:w="1263"/>
-            <w:tcBorders>
-              <w:top w:val="single" w:color="CCCCCC" w:sz="4"/>
-              <w:left w:val="single" w:color="CCCCCC" w:sz="4"/>
-              <w:bottom w:val="single" w:color="CCCCCC" w:sz="4"/>
-              <w:right w:val="single" w:color="CCCCCC" w:sz="4"/>
-            </w:tcBorders>
-            <w:tcMar>
-              <w:top w:type="dxa" w:w="100"/>
-              <w:left w:type="dxa" w:w="140"/>
-              <w:bottom w:type="dxa" w:w="100"/>
-              <w:right w:type="dxa" w:w="140"/>
-            </w:tcMar>
-          </w:tcPr>
-          <w:p>
-            <w:r>
-              <w:rPr>
-                <w:rFonts w:ascii="Roboto" w:cs="Roboto" w:eastAsia="Roboto" w:hAnsi="Roboto"/>
-                <w:b/>
-                <w:bCs/>
-                <w:color w:val="666666"/>
-                <w:sz w:val="20"/>
-                <w:szCs w:val="20"/>
-              </w:rPr>
-              <w:t xml:space="preserve">applied</w:t>
-            </w:r>
-          </w:p>
-        </w:tc>
-        <w:tc>
-          <w:tcPr>
-            <w:tcW w:type="dxa" w:w="1985"/>
-            <w:tcBorders>
-              <w:top w:val="single" w:color="CCCCCC" w:sz="4"/>
-              <w:left w:val="single" w:color="CCCCCC" w:sz="4"/>
-              <w:bottom w:val="single" w:color="CCCCCC" w:sz="4"/>
-              <w:right w:val="single" w:color="CCCCCC" w:sz="4"/>
-            </w:tcBorders>
-            <w:tcMar>
-              <w:top w:type="dxa" w:w="100"/>
-              <w:left w:type="dxa" w:w="140"/>
-              <w:bottom w:type="dxa" w:w="100"/>
-              <w:right w:type="dxa" w:w="140"/>
-            </w:tcMar>
-          </w:tcPr>
-          <w:p>
-            <w:r>
-              <w:rPr>
-                <w:rFonts w:ascii="Roboto" w:cs="Roboto" w:eastAsia="Roboto" w:hAnsi="Roboto"/>
-                <w:b w:val="false"/>
-                <w:bCs w:val="false"/>
-                <w:color w:val="000000"/>
-                <w:sz w:val="20"/>
-                <w:szCs w:val="20"/>
-              </w:rPr>
-              <w:t xml:space="preserve">copper_status_not_provided</w:t>
-            </w:r>
-          </w:p>
-        </w:tc>
-        <w:tc>
-          <w:tcPr>
-            <w:tcW w:type="dxa" w:w="4151"/>
-            <w:tcBorders>
-              <w:top w:val="single" w:color="CCCCCC" w:sz="4"/>
-              <w:left w:val="single" w:color="CCCCCC" w:sz="4"/>
-              <w:bottom w:val="single" w:color="CCCCCC" w:sz="4"/>
-              <w:right w:val="single" w:color="CCCCCC" w:sz="4"/>
-            </w:tcBorders>
-            <w:tcMar>
-              <w:top w:type="dxa" w:w="100"/>
-              <w:left w:type="dxa" w:w="140"/>
-              <w:bottom w:type="dxa" w:w="100"/>
-              <w:right w:type="dxa" w:w="140"/>
-            </w:tcMar>
-          </w:tcPr>
-          <w:p>
-            <w:r>
-              <w:rPr>
-                <w:rFonts w:ascii="Roboto" w:cs="Roboto" w:eastAsia="Roboto" w:hAnsi="Roboto"/>
-                <w:b w:val="false"/>
-                <w:bCs w:val="false"/>
-                <w:color w:val="000000"/>
-                <w:sz w:val="20"/>
-                <w:szCs w:val="20"/>
-              </w:rPr>
-              <w:t xml:space="preserve">Copper omitted in the absence of Cu:Zn status data — system safety floor.</w:t>
-            </w:r>
-          </w:p>
-        </w:tc>
-        <w:tc>
-          <w:tcPr>
-            <w:tcW w:type="dxa" w:w="1624"/>
-            <w:tcBorders>
-              <w:top w:val="single" w:color="CCCCCC" w:sz="4"/>
-              <w:left w:val="single" w:color="CCCCCC" w:sz="4"/>
-              <w:bottom w:val="single" w:color="CCCCCC" w:sz="4"/>
-              <w:right w:val="single" w:color="CCCCCC" w:sz="4"/>
-            </w:tcBorders>
-            <w:tcMar>
-              <w:top w:type="dxa" w:w="100"/>
-              <w:left w:type="dxa" w:w="140"/>
-              <w:bottom w:type="dxa" w:w="100"/>
-              <w:right w:type="dxa" w:w="140"/>
-            </w:tcMar>
-          </w:tcPr>
-          <w:p>
-            <w:r>
-              <w:rPr>
-                <w:rFonts w:ascii="Roboto" w:cs="Roboto" w:eastAsia="Roboto" w:hAnsi="Roboto"/>
-                <w:b w:val="false"/>
-                <w:bCs w:val="false"/>
-                <w:color w:val="000000"/>
-                <w:sz w:val="20"/>
-                <w:szCs w:val="20"/>
-              </w:rPr>
-              <w:t xml:space="preserve">Copper gluconate</w:t>
-            </w:r>
-          </w:p>
-        </w:tc>
-      </w:tr>
-      <w:tr>
-        <w:tc>
-          <w:tcPr>
-            <w:tcW w:type="dxa" w:w="1263"/>
-            <w:tcBorders>
-              <w:top w:val="single" w:color="CCCCCC" w:sz="4"/>
-              <w:left w:val="single" w:color="CCCCCC" w:sz="4"/>
-              <w:bottom w:val="single" w:color="CCCCCC" w:sz="4"/>
-              <w:right w:val="single" w:color="CCCCCC" w:sz="4"/>
-            </w:tcBorders>
-            <w:tcMar>
-              <w:top w:type="dxa" w:w="100"/>
-              <w:left w:type="dxa" w:w="140"/>
-              <w:bottom w:type="dxa" w:w="100"/>
-              <w:right w:type="dxa" w:w="140"/>
-            </w:tcMar>
-          </w:tcPr>
-          <w:p>
-            <w:r>
-              <w:rPr>
-                <w:rFonts w:ascii="Roboto" w:cs="Roboto" w:eastAsia="Roboto" w:hAnsi="Roboto"/>
-                <w:b/>
-                <w:bCs/>
-                <w:color w:val="666666"/>
-                <w:sz w:val="20"/>
-                <w:szCs w:val="20"/>
-              </w:rPr>
-              <w:t xml:space="preserve">applied</w:t>
-            </w:r>
-          </w:p>
-        </w:tc>
-        <w:tc>
-          <w:tcPr>
-            <w:tcW w:type="dxa" w:w="1985"/>
-            <w:tcBorders>
-              <w:top w:val="single" w:color="CCCCCC" w:sz="4"/>
-              <w:left w:val="single" w:color="CCCCCC" w:sz="4"/>
-              <w:bottom w:val="single" w:color="CCCCCC" w:sz="4"/>
-              <w:right w:val="single" w:color="CCCCCC" w:sz="4"/>
-            </w:tcBorders>
-            <w:tcMar>
-              <w:top w:type="dxa" w:w="100"/>
-              <w:left w:type="dxa" w:w="140"/>
-              <w:bottom w:type="dxa" w:w="100"/>
-              <w:right w:type="dxa" w:w="140"/>
-            </w:tcMar>
-          </w:tcPr>
-          <w:p>
-            <w:r>
-              <w:rPr>
-                <w:rFonts w:ascii="Roboto" w:cs="Roboto" w:eastAsia="Roboto" w:hAnsi="Roboto"/>
-                <w:b w:val="false"/>
-                <w:bCs w:val="false"/>
-                <w:color w:val="000000"/>
-                <w:sz w:val="20"/>
-                <w:szCs w:val="20"/>
-              </w:rPr>
-              <w:t xml:space="preserve">iron_studies_not_provided</w:t>
-            </w:r>
-          </w:p>
-        </w:tc>
-        <w:tc>
-          <w:tcPr>
-            <w:tcW w:type="dxa" w:w="4151"/>
-            <w:tcBorders>
-              <w:top w:val="single" w:color="CCCCCC" w:sz="4"/>
-              <w:left w:val="single" w:color="CCCCCC" w:sz="4"/>
-              <w:bottom w:val="single" w:color="CCCCCC" w:sz="4"/>
-              <w:right w:val="single" w:color="CCCCCC" w:sz="4"/>
-            </w:tcBorders>
-            <w:tcMar>
-              <w:top w:type="dxa" w:w="100"/>
-              <w:left w:type="dxa" w:w="140"/>
-              <w:bottom w:type="dxa" w:w="100"/>
-              <w:right w:type="dxa" w:w="140"/>
-            </w:tcMar>
-          </w:tcPr>
-          <w:p>
-            <w:r>
-              <w:rPr>
-                <w:rFonts w:ascii="Roboto" w:cs="Roboto" w:eastAsia="Roboto" w:hAnsi="Roboto"/>
-                <w:b w:val="false"/>
-                <w:bCs w:val="false"/>
-                <w:color w:val="000000"/>
-                <w:sz w:val="20"/>
-                <w:szCs w:val="20"/>
-              </w:rPr>
-              <w:t xml:space="preserve">Iron omitted — no panel signal of deficiency and no iron studies supplied.</w:t>
-            </w:r>
-          </w:p>
-        </w:tc>
-        <w:tc>
-          <w:tcPr>
-            <w:tcW w:type="dxa" w:w="1624"/>
-            <w:tcBorders>
-              <w:top w:val="single" w:color="CCCCCC" w:sz="4"/>
-              <w:left w:val="single" w:color="CCCCCC" w:sz="4"/>
-              <w:bottom w:val="single" w:color="CCCCCC" w:sz="4"/>
-              <w:right w:val="single" w:color="CCCCCC" w:sz="4"/>
-            </w:tcBorders>
-            <w:tcMar>
-              <w:top w:type="dxa" w:w="100"/>
-              <w:left w:type="dxa" w:w="140"/>
-              <w:bottom w:type="dxa" w:w="100"/>
-              <w:right w:type="dxa" w:w="140"/>
-            </w:tcMar>
-          </w:tcPr>
-          <w:p>
-            <w:r>
-              <w:rPr>
-                <w:rFonts w:ascii="Roboto" w:cs="Roboto" w:eastAsia="Roboto" w:hAnsi="Roboto"/>
-                <w:b w:val="false"/>
-                <w:bCs w:val="false"/>
-                <w:color w:val="000000"/>
-                <w:sz w:val="20"/>
-                <w:szCs w:val="20"/>
-              </w:rPr>
-              <w:t xml:space="preserve">Iron bisglycinate</w:t>
-            </w:r>
-          </w:p>
-        </w:tc>
-      </w:tr>
-      <w:tr>
-        <w:tc>
-          <w:tcPr>
-            <w:tcW w:type="dxa" w:w="1263"/>
-            <w:tcBorders>
-              <w:top w:val="single" w:color="CCCCCC" w:sz="4"/>
-              <w:left w:val="single" w:color="CCCCCC" w:sz="4"/>
-              <w:bottom w:val="single" w:color="CCCCCC" w:sz="4"/>
-              <w:right w:val="single" w:color="CCCCCC" w:sz="4"/>
-            </w:tcBorders>
-            <w:tcMar>
-              <w:top w:type="dxa" w:w="100"/>
-              <w:left w:type="dxa" w:w="140"/>
-              <w:bottom w:type="dxa" w:w="100"/>
-              <w:right w:type="dxa" w:w="140"/>
-            </w:tcMar>
-          </w:tcPr>
-          <w:p>
-            <w:r>
-              <w:rPr>
-                <w:rFonts w:ascii="Roboto" w:cs="Roboto" w:eastAsia="Roboto" w:hAnsi="Roboto"/>
-                <w:b/>
-                <w:bCs/>
-                <w:color w:val="666666"/>
-                <w:sz w:val="20"/>
-                <w:szCs w:val="20"/>
-              </w:rPr>
-              <w:t xml:space="preserve">informational</w:t>
-            </w:r>
-          </w:p>
-        </w:tc>
-        <w:tc>
-          <w:tcPr>
-            <w:tcW w:type="dxa" w:w="1985"/>
-            <w:tcBorders>
-              <w:top w:val="single" w:color="CCCCCC" w:sz="4"/>
-              <w:left w:val="single" w:color="CCCCCC" w:sz="4"/>
-              <w:bottom w:val="single" w:color="CCCCCC" w:sz="4"/>
-              <w:right w:val="single" w:color="CCCCCC" w:sz="4"/>
-            </w:tcBorders>
-            <w:tcMar>
-              <w:top w:type="dxa" w:w="100"/>
-              <w:left w:type="dxa" w:w="140"/>
-              <w:bottom w:type="dxa" w:w="100"/>
-              <w:right w:type="dxa" w:w="140"/>
-            </w:tcMar>
-          </w:tcPr>
-          <w:p>
-            <w:r>
-              <w:rPr>
-                <w:rFonts w:ascii="Roboto" w:cs="Roboto" w:eastAsia="Roboto" w:hAnsi="Roboto"/>
-                <w:b w:val="false"/>
-                <w:bCs w:val="false"/>
-                <w:color w:val="000000"/>
-                <w:sz w:val="20"/>
-                <w:szCs w:val="20"/>
-              </w:rPr>
-              <w:t xml:space="preserve">age_over_50_female</w:t>
-            </w:r>
-          </w:p>
-        </w:tc>
-        <w:tc>
-          <w:tcPr>
-            <w:tcW w:type="dxa" w:w="4151"/>
-            <w:tcBorders>
-              <w:top w:val="single" w:color="CCCCCC" w:sz="4"/>
-              <w:left w:val="single" w:color="CCCCCC" w:sz="4"/>
-              <w:bottom w:val="single" w:color="CCCCCC" w:sz="4"/>
-              <w:right w:val="single" w:color="CCCCCC" w:sz="4"/>
-            </w:tcBorders>
-            <w:tcMar>
-              <w:top w:type="dxa" w:w="100"/>
-              <w:left w:type="dxa" w:w="140"/>
-              <w:bottom w:type="dxa" w:w="100"/>
-              <w:right w:type="dxa" w:w="140"/>
-            </w:tcMar>
-          </w:tcPr>
-          <w:p>
-            <w:r>
-              <w:rPr>
-                <w:rFonts w:ascii="Roboto" w:cs="Roboto" w:eastAsia="Roboto" w:hAnsi="Roboto"/>
-                <w:b w:val="false"/>
-                <w:bCs w:val="false"/>
-                <w:color w:val="000000"/>
-                <w:sz w:val="20"/>
-                <w:szCs w:val="20"/>
-              </w:rPr>
-              <w:t xml:space="preserve">Patient age 56 — within standard adult dosing; no soft escalation triggered (under 75).</w:t>
+              <w:t xml:space="preserve">Iodine above 150 mcg not included given absence of thyroid antibody data on this panel. No iodine included in formulation as no thyroid driver is activated.</w:t>
             </w:r>
           </w:p>
         </w:tc>
@@ -5969,7 +4465,7 @@
           <w:sz w:val="22"/>
           <w:szCs w:val="22"/>
         </w:rPr>
-        <w:t xml:space="preserve">3 binding exclusion(s) applied. These are ingredients held out of the pod because the panel does not measure the data needed to confirm safety, or the panel data crossed a hard exclusion threshold.</w:t>
+        <w:t xml:space="preserve">1 binding exclusion(s) applied. These are ingredients held out of the pod because the panel does not measure the data needed to confirm safety, or the panel data crossed a hard exclusion threshold.</w:t>
       </w:r>
     </w:p>
     <w:tbl>
@@ -6174,191 +4670,7 @@
                 <w:sz w:val="20"/>
                 <w:szCs w:val="20"/>
               </w:rPr>
-              <w:t xml:space="preserve">Copper has been excluded as a precaution because copper status biomarkers were not supplied and the panel shows oxidative stress; per system safety floor, copper is not added without status data. Practitioner discretion if separately assessed.</w:t>
-            </w:r>
-          </w:p>
-        </w:tc>
-      </w:tr>
-      <w:tr>
-        <w:tc>
-          <w:tcPr>
-            <w:tcW w:type="dxa" w:w="1985"/>
-            <w:tcBorders>
-              <w:top w:val="single" w:color="CCCCCC" w:sz="4"/>
-              <w:left w:val="single" w:color="CCCCCC" w:sz="4"/>
-              <w:bottom w:val="single" w:color="CCCCCC" w:sz="4"/>
-              <w:right w:val="single" w:color="CCCCCC" w:sz="4"/>
-            </w:tcBorders>
-            <w:tcMar>
-              <w:top w:type="dxa" w:w="100"/>
-              <w:left w:type="dxa" w:w="140"/>
-              <w:bottom w:type="dxa" w:w="100"/>
-              <w:right w:type="dxa" w:w="140"/>
-            </w:tcMar>
-          </w:tcPr>
-          <w:p>
-            <w:r>
-              <w:rPr>
-                <w:rFonts w:ascii="Roboto" w:cs="Roboto" w:eastAsia="Roboto" w:hAnsi="Roboto"/>
-                <w:b/>
-                <w:bCs/>
-                <w:color w:val="000000"/>
-                <w:sz w:val="20"/>
-                <w:szCs w:val="20"/>
-              </w:rPr>
-              <w:t xml:space="preserve">—</w:t>
-            </w:r>
-          </w:p>
-        </w:tc>
-        <w:tc>
-          <w:tcPr>
-            <w:tcW w:type="dxa" w:w="3429"/>
-            <w:tcBorders>
-              <w:top w:val="single" w:color="CCCCCC" w:sz="4"/>
-              <w:left w:val="single" w:color="CCCCCC" w:sz="4"/>
-              <w:bottom w:val="single" w:color="CCCCCC" w:sz="4"/>
-              <w:right w:val="single" w:color="CCCCCC" w:sz="4"/>
-            </w:tcBorders>
-            <w:tcMar>
-              <w:top w:type="dxa" w:w="100"/>
-              <w:left w:type="dxa" w:w="140"/>
-              <w:bottom w:type="dxa" w:w="100"/>
-              <w:right w:type="dxa" w:w="140"/>
-            </w:tcMar>
-          </w:tcPr>
-          <w:p>
-            <w:r>
-              <w:rPr>
-                <w:rFonts w:ascii="Roboto" w:cs="Roboto" w:eastAsia="Roboto" w:hAnsi="Roboto"/>
-                <w:b w:val="false"/>
-                <w:bCs w:val="false"/>
-                <w:color w:val="000000"/>
-                <w:sz w:val="20"/>
-                <w:szCs w:val="20"/>
-              </w:rPr>
-              <w:t xml:space="preserve">—</w:t>
-            </w:r>
-          </w:p>
-        </w:tc>
-        <w:tc>
-          <w:tcPr>
-            <w:tcW w:type="dxa" w:w="3610"/>
-            <w:tcBorders>
-              <w:top w:val="single" w:color="CCCCCC" w:sz="4"/>
-              <w:left w:val="single" w:color="CCCCCC" w:sz="4"/>
-              <w:bottom w:val="single" w:color="CCCCCC" w:sz="4"/>
-              <w:right w:val="single" w:color="CCCCCC" w:sz="4"/>
-            </w:tcBorders>
-            <w:tcMar>
-              <w:top w:type="dxa" w:w="100"/>
-              <w:left w:type="dxa" w:w="140"/>
-              <w:bottom w:type="dxa" w:w="100"/>
-              <w:right w:type="dxa" w:w="140"/>
-            </w:tcMar>
-          </w:tcPr>
-          <w:p>
-            <w:r>
-              <w:rPr>
-                <w:rFonts w:ascii="Roboto" w:cs="Roboto" w:eastAsia="Roboto" w:hAnsi="Roboto"/>
-                <w:b w:val="false"/>
-                <w:bCs w:val="false"/>
-                <w:color w:val="000000"/>
-                <w:sz w:val="20"/>
-                <w:szCs w:val="20"/>
-              </w:rPr>
-              <w:t xml:space="preserve">Selenium has been omitted in the absence of status data. The practitioner may wish to consider conservative dosing if separately assessed.</w:t>
-            </w:r>
-          </w:p>
-        </w:tc>
-      </w:tr>
-      <w:tr>
-        <w:tc>
-          <w:tcPr>
-            <w:tcW w:type="dxa" w:w="1985"/>
-            <w:tcBorders>
-              <w:top w:val="single" w:color="CCCCCC" w:sz="4"/>
-              <w:left w:val="single" w:color="CCCCCC" w:sz="4"/>
-              <w:bottom w:val="single" w:color="CCCCCC" w:sz="4"/>
-              <w:right w:val="single" w:color="CCCCCC" w:sz="4"/>
-            </w:tcBorders>
-            <w:tcMar>
-              <w:top w:type="dxa" w:w="100"/>
-              <w:left w:type="dxa" w:w="140"/>
-              <w:bottom w:type="dxa" w:w="100"/>
-              <w:right w:type="dxa" w:w="140"/>
-            </w:tcMar>
-          </w:tcPr>
-          <w:p>
-            <w:r>
-              <w:rPr>
-                <w:rFonts w:ascii="Roboto" w:cs="Roboto" w:eastAsia="Roboto" w:hAnsi="Roboto"/>
-                <w:b/>
-                <w:bCs/>
-                <w:color w:val="000000"/>
-                <w:sz w:val="20"/>
-                <w:szCs w:val="20"/>
-              </w:rPr>
-              <w:t xml:space="preserve">—</w:t>
-            </w:r>
-          </w:p>
-        </w:tc>
-        <w:tc>
-          <w:tcPr>
-            <w:tcW w:type="dxa" w:w="3429"/>
-            <w:tcBorders>
-              <w:top w:val="single" w:color="CCCCCC" w:sz="4"/>
-              <w:left w:val="single" w:color="CCCCCC" w:sz="4"/>
-              <w:bottom w:val="single" w:color="CCCCCC" w:sz="4"/>
-              <w:right w:val="single" w:color="CCCCCC" w:sz="4"/>
-            </w:tcBorders>
-            <w:tcMar>
-              <w:top w:type="dxa" w:w="100"/>
-              <w:left w:type="dxa" w:w="140"/>
-              <w:bottom w:type="dxa" w:w="100"/>
-              <w:right w:type="dxa" w:w="140"/>
-            </w:tcMar>
-          </w:tcPr>
-          <w:p>
-            <w:r>
-              <w:rPr>
-                <w:rFonts w:ascii="Roboto" w:cs="Roboto" w:eastAsia="Roboto" w:hAnsi="Roboto"/>
-                <w:b w:val="false"/>
-                <w:bCs w:val="false"/>
-                <w:color w:val="000000"/>
-                <w:sz w:val="20"/>
-                <w:szCs w:val="20"/>
-              </w:rPr>
-              <w:t xml:space="preserve">—</w:t>
-            </w:r>
-          </w:p>
-        </w:tc>
-        <w:tc>
-          <w:tcPr>
-            <w:tcW w:type="dxa" w:w="3610"/>
-            <w:tcBorders>
-              <w:top w:val="single" w:color="CCCCCC" w:sz="4"/>
-              <w:left w:val="single" w:color="CCCCCC" w:sz="4"/>
-              <w:bottom w:val="single" w:color="CCCCCC" w:sz="4"/>
-              <w:right w:val="single" w:color="CCCCCC" w:sz="4"/>
-            </w:tcBorders>
-            <w:tcMar>
-              <w:top w:type="dxa" w:w="100"/>
-              <w:left w:type="dxa" w:w="140"/>
-              <w:bottom w:type="dxa" w:w="100"/>
-              <w:right w:type="dxa" w:w="140"/>
-            </w:tcMar>
-          </w:tcPr>
-          <w:p>
-            <w:r>
-              <w:rPr>
-                <w:rFonts w:ascii="Roboto" w:cs="Roboto" w:eastAsia="Roboto" w:hAnsi="Roboto"/>
-                <w:b w:val="false"/>
-                <w:bCs w:val="false"/>
-                <w:color w:val="000000"/>
-                <w:sz w:val="20"/>
-                <w:szCs w:val="20"/>
-              </w:rPr>
-              <w:t xml:space="preserve">Iron not included without iron status data.</w:t>
+              <w:t xml:space="preserve">Per the standard binding-exclusion floor, iodine doses above 150 mcg would require negative thyroid antibody confirmation. As the panel does not address this and no thyroid driver is active, iodine is excluded from the formulation entirely.</w:t>
             </w:r>
           </w:p>
         </w:tc>
@@ -6396,7 +4708,7 @@
           <w:sz w:val="22"/>
           <w:szCs w:val="22"/>
         </w:rPr>
-        <w:t xml:space="preserve">The practitioner may wish to consider re-testing key markers at a clinically appropriate interval to assess response, particularly the xenobiotic exposure markers (t,t-muconic, methylhippuric isomers, 4-HBA), the oxidative stress marker (8-OHdG), TCA flux markers (isocitric, 2-OG), kynurenine pathway (xanthurenic, quinolinic), and methylation markers (guanidinoacetic, 5-methylcytosine).</w:t>
+        <w:t xml:space="preserve">Re-testing of priority markers at a clinically appropriate interval determined by the treating practitioner may be considered to monitor response. Given the HPA-hypocortisolism pattern and oestrogen metabolism findings, urinary cortisol, oestrogen metabolites (particularly 2-OH Estrone and the 2:16 ratio), and symptom progression are the most informative monitoring points.</w:t>
       </w:r>
     </w:p>
     <w:p>
@@ -6437,7 +4749,7 @@
           <w:sz w:val="20"/>
           <w:szCs w:val="20"/>
         </w:rPr>
-        <w:t xml:space="preserve">8-hydroxy-deoxyguanosine</w:t>
+        <w:t xml:space="preserve">Total 24hr urinary cortisol — response to adaptogenic/B5 support</w:t>
       </w:r>
     </w:p>
     <w:p>
@@ -6462,7 +4774,7 @@
           <w:sz w:val="20"/>
           <w:szCs w:val="20"/>
         </w:rPr>
-        <w:t xml:space="preserve">Leukotriene E4</w:t>
+        <w:t xml:space="preserve">2-OH Estrone and 2-OH(E1+E2)/16-OHE1 ratio — response to DIM and oestrogen metabolism support</w:t>
       </w:r>
     </w:p>
     <w:p>
@@ -6487,7 +4799,7 @@
           <w:sz w:val="20"/>
           <w:szCs w:val="20"/>
         </w:rPr>
-        <w:t xml:space="preserve">t,t-Muconic Acid</w:t>
+        <w:t xml:space="preserve">2-MeOH metabolites — response to methylation cofactor and DIM stack</w:t>
       </w:r>
     </w:p>
     <w:p>
@@ -6512,7 +4824,7 @@
           <w:sz w:val="20"/>
           <w:szCs w:val="20"/>
         </w:rPr>
-        <w:t xml:space="preserve">3-Methylhippuric Acid</w:t>
+        <w:t xml:space="preserve">Estrogen Quotient E3/(E1+E2) — response to overall oestrogen metabolism support</w:t>
       </w:r>
     </w:p>
     <w:p>
@@ -6537,7 +4849,7 @@
           <w:sz w:val="20"/>
           <w:szCs w:val="20"/>
         </w:rPr>
-        <w:t xml:space="preserve">4-Hydroxybenzoic Acid</w:t>
+        <w:t xml:space="preserve">DHEA — concurrent HPA marker</w:t>
       </w:r>
     </w:p>
     <w:p>
@@ -6562,7 +4874,7 @@
           <w:sz w:val="20"/>
           <w:szCs w:val="20"/>
         </w:rPr>
-        <w:t xml:space="preserve">Isocitric Acid and 2-Oxoglutaric Acid</w:t>
+        <w:t xml:space="preserve">Clinical symptom score across HPA-related items (fatigue, sleep, stress tolerance)</w:t>
       </w:r>
     </w:p>
     <w:p>
@@ -6587,7 +4899,7 @@
           <w:sz w:val="20"/>
           <w:szCs w:val="20"/>
         </w:rPr>
-        <w:t xml:space="preserve">Quinolinic / Xanthurenic / Kynurenic</w:t>
+        <w:t xml:space="preserve">If long-term zinc supplementation continues, copper status</w:t>
       </w:r>
     </w:p>
     <w:p>
@@ -6612,57 +4924,7 @@
           <w:sz w:val="20"/>
           <w:szCs w:val="20"/>
         </w:rPr>
-        <w:t xml:space="preserve">Guanidinoacetic Acid</w:t>
-      </w:r>
-    </w:p>
-    <w:p>
-      <w:pPr>
-        <w:spacing w:after="60"/>
-      </w:pPr>
-      <w:r>
-        <w:rPr>
-          <w:rFonts w:ascii="Roboto" w:cs="Roboto" w:eastAsia="Roboto" w:hAnsi="Roboto"/>
-          <w:b/>
-          <w:bCs/>
-          <w:color w:val="C3AF88"/>
-          <w:sz w:val="22"/>
-          <w:szCs w:val="22"/>
-        </w:rPr>
-        <w:t xml:space="preserve">• </w:t>
-      </w:r>
-      <w:r>
-        <w:rPr>
-          <w:rFonts w:ascii="Roboto" w:cs="Roboto" w:eastAsia="Roboto" w:hAnsi="Roboto"/>
-          <w:color w:val="000000"/>
-          <w:sz w:val="20"/>
-          <w:szCs w:val="20"/>
-        </w:rPr>
-        <w:t xml:space="preserve">5-Methylcytosine</w:t>
-      </w:r>
-    </w:p>
-    <w:p>
-      <w:pPr>
-        <w:spacing w:after="60"/>
-      </w:pPr>
-      <w:r>
-        <w:rPr>
-          <w:rFonts w:ascii="Roboto" w:cs="Roboto" w:eastAsia="Roboto" w:hAnsi="Roboto"/>
-          <w:b/>
-          <w:bCs/>
-          <w:color w:val="C3AF88"/>
-          <w:sz w:val="22"/>
-          <w:szCs w:val="22"/>
-        </w:rPr>
-        <w:t xml:space="preserve">• </w:t>
-      </w:r>
-      <w:r>
-        <w:rPr>
-          <w:rFonts w:ascii="Roboto" w:cs="Roboto" w:eastAsia="Roboto" w:hAnsi="Roboto"/>
-          <w:color w:val="000000"/>
-          <w:sz w:val="20"/>
-          <w:szCs w:val="20"/>
-        </w:rPr>
-        <w:t xml:space="preserve">Pyroglutamic Acid</w:t>
+        <w:t xml:space="preserve">25-OH vitamin D if not recently assessed</w:t>
       </w:r>
     </w:p>
     <w:p>
@@ -6678,7 +4940,7 @@
           <w:sz w:val="20"/>
           <w:szCs w:val="20"/>
         </w:rPr>
-        <w:t xml:space="preserve">Re-testing timing is a clinical decision for the treating practitioner.</w:t>
+        <w:t xml:space="preserve">Timing of any follow-up testing is for the treating practitioner to determine based on clinical response and patient context.</w:t>
       </w:r>
     </w:p>
     <w:p>
@@ -6713,7 +4975,7 @@
           <w:sz w:val="22"/>
           <w:szCs w:val="22"/>
         </w:rPr>
-        <w:t xml:space="preserve">The following 7 finding(s) on this panel are within reference and are surfaced as areas of clinical strength to contextualise the abnormal findings above.</w:t>
+        <w:t xml:space="preserve">The following 5 finding(s) on this panel are within reference and are surfaced as areas of clinical strength to contextualise the abnormal findings above.</w:t>
       </w:r>
     </w:p>
     <w:p>
@@ -6738,7 +5000,7 @@
           <w:sz w:val="20"/>
           <w:szCs w:val="20"/>
         </w:rPr>
-        <w:t xml:space="preserve">Cortisol (OA) within reference range — HPA axis not flagged for primary intervention.</w:t>
+        <w:t xml:space="preserve">Endocrine disruptor panel — BPA, PFAS, PFOA, PFOS and heavy metals (Al, As, Cd, Cr, Pb, Hg, Ni) all below or near detection limits within reference, indicating no environmental exposure burden identified on this panel.</w:t>
       </w:r>
     </w:p>
     <w:p>
@@ -6763,7 +5025,7 @@
           <w:sz w:val="20"/>
           <w:szCs w:val="20"/>
         </w:rPr>
-        <w:t xml:space="preserve">Methylmalonic acid and FIGLU within reference range — overt B12/folate deficiency not evident.</w:t>
+        <w:t xml:space="preserve">4-OH Estradiol below detection and 4-OH Estrone at lower reference limit — pattern consistent with low genotoxic catechol oestrogen output per laboratory framework.</w:t>
       </w:r>
     </w:p>
     <w:p>
@@ -6788,7 +5050,7 @@
           <w:sz w:val="20"/>
           <w:szCs w:val="20"/>
         </w:rPr>
-        <w:t xml:space="preserve">Pyridoxic acid (B6 marker) within range — overt B6 deficiency not evident; xanthurenic indicates functional rather than depletion picture.</w:t>
+        <w:t xml:space="preserve">Elevated 4-MeOH E2/4-OH E2 ratio (4.39) — pattern consistent with active methylation of the 4-OH branch per laboratory comment.</w:t>
       </w:r>
     </w:p>
     <w:p>
@@ -6813,7 +5075,7 @@
           <w:sz w:val="20"/>
           <w:szCs w:val="20"/>
         </w:rPr>
-        <w:t xml:space="preserve">Vitamin C (ascorbic acid) within range.</w:t>
+        <w:t xml:space="preserve">Testosterone, DHEA-S, and Pregnanediol within laboratory reference ranges.</w:t>
       </w:r>
     </w:p>
     <w:p>
@@ -6838,57 +5100,7 @@
           <w:sz w:val="20"/>
           <w:szCs w:val="20"/>
         </w:rPr>
-        <w:t xml:space="preserve">Glucaric acid within range.</w:t>
-      </w:r>
-    </w:p>
-    <w:p>
-      <w:pPr>
-        <w:spacing w:after="60"/>
-      </w:pPr>
-      <w:r>
-        <w:rPr>
-          <w:rFonts w:ascii="Roboto" w:cs="Roboto" w:eastAsia="Roboto" w:hAnsi="Roboto"/>
-          <w:b/>
-          <w:bCs/>
-          <w:color w:val="C3AF88"/>
-          <w:sz w:val="22"/>
-          <w:szCs w:val="22"/>
-        </w:rPr>
-        <w:t xml:space="preserve">• </w:t>
-      </w:r>
-      <w:r>
-        <w:rPr>
-          <w:rFonts w:ascii="Roboto" w:cs="Roboto" w:eastAsia="Roboto" w:hAnsi="Roboto"/>
-          <w:color w:val="000000"/>
-          <w:sz w:val="20"/>
-          <w:szCs w:val="20"/>
-        </w:rPr>
-        <w:t xml:space="preserve">Lactic and pyruvic acid within range — gross glycolytic dysfunction not evident.</w:t>
-      </w:r>
-    </w:p>
-    <w:p>
-      <w:pPr>
-        <w:spacing w:after="60"/>
-      </w:pPr>
-      <w:r>
-        <w:rPr>
-          <w:rFonts w:ascii="Roboto" w:cs="Roboto" w:eastAsia="Roboto" w:hAnsi="Roboto"/>
-          <w:b/>
-          <w:bCs/>
-          <w:color w:val="C3AF88"/>
-          <w:sz w:val="22"/>
-          <w:szCs w:val="22"/>
-        </w:rPr>
-        <w:t xml:space="preserve">• </w:t>
-      </w:r>
-      <w:r>
-        <w:rPr>
-          <w:rFonts w:ascii="Roboto" w:cs="Roboto" w:eastAsia="Roboto" w:hAnsi="Roboto"/>
-          <w:color w:val="000000"/>
-          <w:sz w:val="20"/>
-          <w:szCs w:val="20"/>
-        </w:rPr>
-        <w:t xml:space="preserve">Most neurotransmitter metabolites (HVA, VMA, DOPAC, 5-HIAA) within reference range.</w:t>
+        <w:t xml:space="preserve">Absolute Estradiol, Estrone, and Estriol values each individually within the laboratory reference range — the oestrogen quotient finding reflects relative balance rather than absolute deficit or excess.</w:t>
       </w:r>
     </w:p>
     <w:p>
@@ -6948,7 +5160,7 @@
           <w:sz w:val="22"/>
           <w:szCs w:val="22"/>
         </w:rPr>
-        <w:t xml:space="preserve">  Sadowska AM et al. (2007). Antioxidant and anti-inflammatory efficacy of NAC in the treatment of COPD: discordant in vitro and in vivo dose-effects: a review. Pulmonary Pharmacology &amp; Therapeutics.</w:t>
+        <w:t xml:space="preserve">  Dalessandri et al. (2004). Pilot study: effect of 3,3'-diindolylmethane supplements on urinary hormone metabolites in postmenopausal women with a history of early-stage breast cancer. Nutrition and Cancer.</w:t>
       </w:r>
       <w:r>
         <w:rPr>
@@ -6959,7 +5171,7 @@
           <w:sz w:val="18"/>
           <w:szCs w:val="18"/>
         </w:rPr>
-        <w:t xml:space="preserve">  (N-acetyl cysteine (NAC))</w:t>
+        <w:t xml:space="preserve">  (DIM (3,3'-diindolylmethane))</w:t>
       </w:r>
     </w:p>
     <w:p>
@@ -6984,7 +5196,7 @@
           <w:sz w:val="22"/>
           <w:szCs w:val="22"/>
         </w:rPr>
-        <w:t xml:space="preserve">  Abenavoli L et al. (2018). Milk thistle (Silybum marianum): A concise overview on its chemistry, pharmacological, and nutraceutical uses in liver diseases. Phytotherapy Research.</w:t>
+        <w:t xml:space="preserve">  Walaszek et al. (1990). Dietary glucarate-mediated reduction of sensitivity of murine strains to chemical carcinogenesis. Cancer Letters.</w:t>
       </w:r>
       <w:r>
         <w:rPr>
@@ -6995,7 +5207,7 @@
           <w:sz w:val="18"/>
           <w:szCs w:val="18"/>
         </w:rPr>
-        <w:t xml:space="preserve">  (Milk thistle (silymarin))</w:t>
+        <w:t xml:space="preserve">  (Calcium D-glucarate)</w:t>
       </w:r>
     </w:p>
     <w:p>
@@ -7020,7 +5232,7 @@
           <w:sz w:val="22"/>
           <w:szCs w:val="22"/>
         </w:rPr>
-        <w:t xml:space="preserve">  Walaszek Z et al. (1996). Metabolism, uptake, and excretion of a D-glucaric acid salt and its potential use in cancer prevention. Cancer Detection and Prevention.</w:t>
+        <w:t xml:space="preserve">  Abenavoli et al. (2018). Milk thistle (Silybum marianum): A concise overview on its chemistry, pharmacological, and nutraceutical uses in liver diseases. Phytotherapy Research.</w:t>
       </w:r>
       <w:r>
         <w:rPr>
@@ -7031,7 +5243,7 @@
           <w:sz w:val="18"/>
           <w:szCs w:val="18"/>
         </w:rPr>
-        <w:t xml:space="preserve">  (Calcium D-glucarate)</w:t>
+        <w:t xml:space="preserve">  (Milk thistle (silymarin))</w:t>
       </w:r>
     </w:p>
     <w:p>
@@ -7056,7 +5268,7 @@
           <w:sz w:val="22"/>
           <w:szCs w:val="22"/>
         </w:rPr>
-        <w:t xml:space="preserve">  Carr AC and Maggini S (2017). Vitamin C and immune function. Nutrients.</w:t>
+        <w:t xml:space="preserve">  Chow et al. (2010). Resveratrol modulates drug- and carcinogen-metabolizing enzymes in a healthy volunteer study. Cancer Prevention Research.</w:t>
       </w:r>
       <w:r>
         <w:rPr>
@@ -7067,7 +5279,7 @@
           <w:sz w:val="18"/>
           <w:szCs w:val="18"/>
         </w:rPr>
-        <w:t xml:space="preserve">  (Vitamin C (ascorbic acid))</w:t>
+        <w:t xml:space="preserve">  (Resveratrol)</w:t>
       </w:r>
     </w:p>
     <w:p>
@@ -7092,7 +5304,7 @@
           <w:sz w:val="22"/>
           <w:szCs w:val="22"/>
         </w:rPr>
-        <w:t xml:space="preserve">  Gu J et al. (2021). Resveratrol-induced autophagy and apoptosis in cancer cells: mechanisms and therapeutic implications. Frontiers in Pharmacology.</w:t>
+        <w:t xml:space="preserve">  Chandrasekhar et al. (2012). A prospective, randomized double-blind, placebo-controlled study of safety and efficacy of a high-concentration full-spectrum extract of ashwagandha root in reducing stress and anxiety in adults. Indian Journal of Psychological Medicine.</w:t>
       </w:r>
       <w:r>
         <w:rPr>
@@ -7103,7 +5315,7 @@
           <w:sz w:val="18"/>
           <w:szCs w:val="18"/>
         </w:rPr>
-        <w:t xml:space="preserve">  (Resveratrol)</w:t>
+        <w:t xml:space="preserve">  (Ashwagandha)</w:t>
       </w:r>
     </w:p>
     <w:p>
@@ -7128,7 +5340,7 @@
           <w:sz w:val="22"/>
           <w:szCs w:val="22"/>
         </w:rPr>
-        <w:t xml:space="preserve">  Hewlings SJ and Kalman DS (2017). Curcumin: A review of its effects on human health. Foods.</w:t>
+        <w:t xml:space="preserve">  Olsson et al. (2009). A randomised, double-blind, placebo-controlled, parallel-group study of the standardised extract SHR-5 of the roots of Rhodiola rosea in the treatment of subjects with stress-related fatigue. Planta Medica.</w:t>
       </w:r>
       <w:r>
         <w:rPr>
@@ -7139,7 +5351,7 @@
           <w:sz w:val="18"/>
           <w:szCs w:val="18"/>
         </w:rPr>
-        <w:t xml:space="preserve">  (Turmeric (curcumin))</w:t>
+        <w:t xml:space="preserve">  (Rhodiola)</w:t>
       </w:r>
     </w:p>
     <w:p>
@@ -7164,7 +5376,7 @@
           <w:sz w:val="22"/>
           <w:szCs w:val="22"/>
         </w:rPr>
-        <w:t xml:space="preserve">  Siddiqui MZ (2011). Boswellia serrata, a potential antiinflammatory agent: an overview. Indian Journal of Pharmaceutical Sciences.</w:t>
+        <w:t xml:space="preserve">  Scholey et al. (2010). Effects of American ginseng (Panax quinquefolius) on neurocognitive function: an acute, randomised, double-blind, placebo-controlled, crossover study. Psychopharmacology.</w:t>
       </w:r>
       <w:r>
         <w:rPr>
@@ -7175,7 +5387,7 @@
           <w:sz w:val="18"/>
           <w:szCs w:val="18"/>
         </w:rPr>
-        <w:t xml:space="preserve">  (Boswellia serrata)</w:t>
+        <w:t xml:space="preserve">  (American ginseng (Panax quinquefolius))</w:t>
       </w:r>
     </w:p>
     <w:p>
@@ -7200,7 +5412,7 @@
           <w:sz w:val="22"/>
           <w:szCs w:val="22"/>
         </w:rPr>
-        <w:t xml:space="preserve">  Li Y et al. (2016). Quercetin, inflammation and immunity. Nutrients.</w:t>
+        <w:t xml:space="preserve">  Mizuno et al. (2008). Antifatigue effects of coenzyme Q10 during physical fatigue. Nutrition.</w:t>
       </w:r>
       <w:r>
         <w:rPr>
@@ -7211,7 +5423,7 @@
           <w:sz w:val="18"/>
           <w:szCs w:val="18"/>
         </w:rPr>
-        <w:t xml:space="preserve">  (Quercetin)</w:t>
+        <w:t xml:space="preserve">  (Coenzyme Q10)</w:t>
       </w:r>
     </w:p>
     <w:p>
@@ -7236,7 +5448,7 @@
           <w:sz w:val="22"/>
           <w:szCs w:val="22"/>
         </w:rPr>
-        <w:t xml:space="preserve">  Hernández-Camacho JD et al. (2018). Coenzyme Q10 supplementation in aging and disease. Frontiers in Physiology.</w:t>
+        <w:t xml:space="preserve">  Paul &amp; Brady (2017). Comparative bioavailability and utilization of particular forms of B12 supplements with potential to mitigate B12-related genetic polymorphisms. Integrative Medicine.</w:t>
       </w:r>
       <w:r>
         <w:rPr>
@@ -7247,7 +5459,7 @@
           <w:sz w:val="18"/>
           <w:szCs w:val="18"/>
         </w:rPr>
-        <w:t xml:space="preserve">  (Coenzyme Q10)</w:t>
+        <w:t xml:space="preserve">  (Vitamin B12 (methylcobalamin))</w:t>
       </w:r>
     </w:p>
     <w:p>
@@ -7272,7 +5484,7 @@
           <w:sz w:val="22"/>
           <w:szCs w:val="22"/>
         </w:rPr>
-        <w:t xml:space="preserve">  Rochette L et al. (2013). Alpha-lipoic acid: molecular mechanisms and therapeutic potential in diabetes. Canadian Journal of Physiology and Pharmacology.</w:t>
+        <w:t xml:space="preserve">  Xu et al. (2007). Plasma folate, vitamin B12, and one-carbon metabolism nutrients and risk of breast cancer in women. American Journal of Clinical Nutrition.</w:t>
       </w:r>
       <w:r>
         <w:rPr>
@@ -7283,7 +5495,7 @@
           <w:sz w:val="18"/>
           <w:szCs w:val="18"/>
         </w:rPr>
-        <w:t xml:space="preserve">  (Alpha-lipoic acid)</w:t>
+        <w:t xml:space="preserve">  (Folate (as calcium folinate))</w:t>
       </w:r>
     </w:p>
     <w:p>
@@ -7308,7 +5520,7 @@
           <w:sz w:val="22"/>
           <w:szCs w:val="22"/>
         </w:rPr>
-        <w:t xml:space="preserve">  Paul C and Brady DM (2017). Comparative bioavailability and utilization of particular forms of B12 supplements with potential to mitigate B12-related genetic polymorphisms. Integrative Medicine.</w:t>
+        <w:t xml:space="preserve">  Wu et al. (1999). Plasma pyridoxal 5'-phosphate is reduced in premenopausal women undergoing chemotherapy and influences one-carbon metabolism. Journal of Nutrition.</w:t>
       </w:r>
       <w:r>
         <w:rPr>
@@ -7319,7 +5531,7 @@
           <w:sz w:val="18"/>
           <w:szCs w:val="18"/>
         </w:rPr>
-        <w:t xml:space="preserve">  (Methylcobalamin (B12))</w:t>
+        <w:t xml:space="preserve">  (Vitamin B6 (P5P))</w:t>
       </w:r>
     </w:p>
     <w:p>
@@ -7344,7 +5556,7 @@
           <w:sz w:val="22"/>
           <w:szCs w:val="22"/>
         </w:rPr>
-        <w:t xml:space="preserve">  Scaglione F and Panzavolta G (2014). Folate, folic acid and 5-methyltetrahydrofolate are not the same thing. Xenobiotica.</w:t>
+        <w:t xml:space="preserve">  McNulty et al. (2017). Riboflavin, MTHFR genotype and blood pressure: A personalized approach to prevention and treatment of hypertension. Molecular Aspects of Medicine.</w:t>
       </w:r>
       <w:r>
         <w:rPr>
@@ -7355,7 +5567,7 @@
           <w:sz w:val="18"/>
           <w:szCs w:val="18"/>
         </w:rPr>
-        <w:t xml:space="preserve">  (Calcium folinate)</w:t>
+        <w:t xml:space="preserve">  (Riboflavin (B2))</w:t>
       </w:r>
     </w:p>
     <w:p>
@@ -7380,7 +5592,7 @@
           <w:sz w:val="22"/>
           <w:szCs w:val="22"/>
         </w:rPr>
-        <w:t xml:space="preserve">  Oxenkrug G (2013). Insulin resistance and dysregulation of tryptophan-kynurenine and kynurenine-nicotinamide adenine dinucleotide metabolic pathways. Molecular Neurobiology.</w:t>
+        <w:t xml:space="preserve">  Jaroenporn et al. (2008). Effects of pantothenic acid supplementation on adrenal steroid secretion from male rats. Biological &amp; Pharmaceutical Bulletin.</w:t>
       </w:r>
       <w:r>
         <w:rPr>
@@ -7391,7 +5603,7 @@
           <w:sz w:val="18"/>
           <w:szCs w:val="18"/>
         </w:rPr>
-        <w:t xml:space="preserve">  (Pyridoxal-5-phosphate (P5P / active B6))</w:t>
+        <w:t xml:space="preserve">  (Pantothenic acid (B5))</w:t>
       </w:r>
     </w:p>
     <w:p>
@@ -7416,7 +5628,7 @@
           <w:sz w:val="22"/>
           <w:szCs w:val="22"/>
         </w:rPr>
-        <w:t xml:space="preserve">  Powers HJ (2003). Riboflavin (vitamin B-2) and health. American Journal of Clinical Nutrition.</w:t>
+        <w:t xml:space="preserve">  Kennedy (2016). B vitamins and the brain: Mechanisms, dose and efficacy—a review. Nutrients.</w:t>
       </w:r>
       <w:r>
         <w:rPr>
@@ -7427,7 +5639,7 @@
           <w:sz w:val="18"/>
           <w:szCs w:val="18"/>
         </w:rPr>
-        <w:t xml:space="preserve">  (Riboflavin (B2))</w:t>
+        <w:t xml:space="preserve">  (Nicotinamide (B3))</w:t>
       </w:r>
     </w:p>
     <w:p>
@@ -7452,7 +5664,7 @@
           <w:sz w:val="22"/>
           <w:szCs w:val="22"/>
         </w:rPr>
-        <w:t xml:space="preserve">  Schuette SA et al. (1994). Bioavailability of magnesium diglycinate vs magnesium oxide in patients with ileal resection. JPEN Journal of Parenteral and Enteral Nutrition.</w:t>
+        <w:t xml:space="preserve">  Boyle et al. (2017). The effects of magnesium supplementation on subjective anxiety and stress—A systematic review. Nutrients.</w:t>
       </w:r>
       <w:r>
         <w:rPr>
@@ -7488,7 +5700,151 @@
           <w:sz w:val="22"/>
           <w:szCs w:val="22"/>
         </w:rPr>
-        <w:t xml:space="preserve">  Tripkovic L et al. (2012). Comparison of vitamin D2 and vitamin D3 supplementation in raising serum 25-hydroxyvitamin D status: a systematic review and meta-analysis. American Journal of Clinical Nutrition.</w:t>
+        <w:t xml:space="preserve">  Prasad et al. (1996). Zinc status and serum testosterone levels of healthy adults. Nutrition.</w:t>
+      </w:r>
+      <w:r>
+        <w:rPr>
+          <w:rFonts w:ascii="Roboto" w:cs="Roboto" w:eastAsia="Roboto" w:hAnsi="Roboto"/>
+          <w:i/>
+          <w:iCs/>
+          <w:color w:val="000000"/>
+          <w:sz w:val="18"/>
+          <w:szCs w:val="18"/>
+        </w:rPr>
+        <w:t xml:space="preserve">  (Zinc citrate)</w:t>
+      </w:r>
+    </w:p>
+    <w:p>
+      <w:pPr>
+        <w:spacing w:after="120"/>
+      </w:pPr>
+      <w:r>
+        <w:rPr>
+          <w:rFonts w:ascii="Roboto" w:cs="Roboto" w:eastAsia="Roboto" w:hAnsi="Roboto"/>
+          <w:b/>
+          <w:bCs/>
+          <w:color w:val="C3AF88"/>
+          <w:sz w:val="22"/>
+          <w:szCs w:val="22"/>
+        </w:rPr>
+        <w:t xml:space="preserve">[17]</w:t>
+      </w:r>
+      <w:r>
+        <w:rPr>
+          <w:rFonts w:ascii="Roboto" w:cs="Roboto" w:eastAsia="Roboto" w:hAnsi="Roboto"/>
+          <w:color w:val="000000"/>
+          <w:sz w:val="22"/>
+          <w:szCs w:val="22"/>
+        </w:rPr>
+        <w:t xml:space="preserve">  Cavalieri &amp; Rogan (2016). Depurinating estrogen-DNA adducts, generators of cancer initiation: their minimization leads to cancer prevention. Clinical and Translational Medicine.</w:t>
+      </w:r>
+      <w:r>
+        <w:rPr>
+          <w:rFonts w:ascii="Roboto" w:cs="Roboto" w:eastAsia="Roboto" w:hAnsi="Roboto"/>
+          <w:i/>
+          <w:iCs/>
+          <w:color w:val="000000"/>
+          <w:sz w:val="18"/>
+          <w:szCs w:val="18"/>
+        </w:rPr>
+        <w:t xml:space="preserve">  (N-acetyl cysteine (NAC))</w:t>
+      </w:r>
+    </w:p>
+    <w:p>
+      <w:pPr>
+        <w:spacing w:after="120"/>
+      </w:pPr>
+      <w:r>
+        <w:rPr>
+          <w:rFonts w:ascii="Roboto" w:cs="Roboto" w:eastAsia="Roboto" w:hAnsi="Roboto"/>
+          <w:b/>
+          <w:bCs/>
+          <w:color w:val="C3AF88"/>
+          <w:sz w:val="22"/>
+          <w:szCs w:val="22"/>
+        </w:rPr>
+        <w:t xml:space="preserve">[18]</w:t>
+      </w:r>
+      <w:r>
+        <w:rPr>
+          <w:rFonts w:ascii="Roboto" w:cs="Roboto" w:eastAsia="Roboto" w:hAnsi="Roboto"/>
+          <w:color w:val="000000"/>
+          <w:sz w:val="22"/>
+          <w:szCs w:val="22"/>
+        </w:rPr>
+        <w:t xml:space="preserve">  Zhu &amp; Liehr (1994). Quercetin increases the severity of estradiol-induced tumorigenesis in hamster kidney. Toxicology and Applied Pharmacology.</w:t>
+      </w:r>
+      <w:r>
+        <w:rPr>
+          <w:rFonts w:ascii="Roboto" w:cs="Roboto" w:eastAsia="Roboto" w:hAnsi="Roboto"/>
+          <w:i/>
+          <w:iCs/>
+          <w:color w:val="000000"/>
+          <w:sz w:val="18"/>
+          <w:szCs w:val="18"/>
+        </w:rPr>
+        <w:t xml:space="preserve">  (Quercetin)</w:t>
+      </w:r>
+    </w:p>
+    <w:p>
+      <w:pPr>
+        <w:spacing w:after="120"/>
+      </w:pPr>
+      <w:r>
+        <w:rPr>
+          <w:rFonts w:ascii="Roboto" w:cs="Roboto" w:eastAsia="Roboto" w:hAnsi="Roboto"/>
+          <w:b/>
+          <w:bCs/>
+          <w:color w:val="C3AF88"/>
+          <w:sz w:val="22"/>
+          <w:szCs w:val="22"/>
+        </w:rPr>
+        <w:t xml:space="preserve">[19]</w:t>
+      </w:r>
+      <w:r>
+        <w:rPr>
+          <w:rFonts w:ascii="Roboto" w:cs="Roboto" w:eastAsia="Roboto" w:hAnsi="Roboto"/>
+          <w:color w:val="000000"/>
+          <w:sz w:val="22"/>
+          <w:szCs w:val="22"/>
+        </w:rPr>
+        <w:t xml:space="preserve">  Peters et al. (2001). Vitamin C supplementation attenuates the increases in circulating cortisol, adrenaline and anti-inflammatory polypeptides following ultramarathon running. International Journal of Sports Medicine.</w:t>
+      </w:r>
+      <w:r>
+        <w:rPr>
+          <w:rFonts w:ascii="Roboto" w:cs="Roboto" w:eastAsia="Roboto" w:hAnsi="Roboto"/>
+          <w:i/>
+          <w:iCs/>
+          <w:color w:val="000000"/>
+          <w:sz w:val="18"/>
+          <w:szCs w:val="18"/>
+        </w:rPr>
+        <w:t xml:space="preserve">  (Vitamin C (ascorbic acid))</w:t>
+      </w:r>
+    </w:p>
+    <w:p>
+      <w:pPr>
+        <w:spacing w:after="120"/>
+      </w:pPr>
+      <w:r>
+        <w:rPr>
+          <w:rFonts w:ascii="Roboto" w:cs="Roboto" w:eastAsia="Roboto" w:hAnsi="Roboto"/>
+          <w:b/>
+          <w:bCs/>
+          <w:color w:val="C3AF88"/>
+          <w:sz w:val="22"/>
+          <w:szCs w:val="22"/>
+        </w:rPr>
+        <w:t xml:space="preserve">[20]</w:t>
+      </w:r>
+      <w:r>
+        <w:rPr>
+          <w:rFonts w:ascii="Roboto" w:cs="Roboto" w:eastAsia="Roboto" w:hAnsi="Roboto"/>
+          <w:color w:val="000000"/>
+          <w:sz w:val="22"/>
+          <w:szCs w:val="22"/>
+        </w:rPr>
+        <w:t xml:space="preserve">  Pilz et al. (2011). Effect of vitamin D supplementation on testosterone levels in men. Hormone and Metabolic Research.</w:t>
       </w:r>
       <w:r>
         <w:rPr>
@@ -7536,7 +5892,7 @@
           <w:sz w:val="18"/>
           <w:szCs w:val="18"/>
         </w:rPr>
-        <w:t xml:space="preserve">Submission: SUB-2026-003  •  Generated: 30 May 2026, 6:38 pm</w:t>
+        <w:t xml:space="preserve">Submission: SUB-2026-004  •  Generated: 31 May 2026, 8:58 am</w:t>
       </w:r>
     </w:p>
     <w:p>
@@ -7552,7 +5908,7 @@
           <w:sz w:val="18"/>
           <w:szCs w:val="18"/>
         </w:rPr>
-        <w:t xml:space="preserve">Audit Reference: 6D40-90BC-A79D</w:t>
+        <w:t xml:space="preserve">Audit Reference: 8DF4-6DB0-C571</w:t>
       </w:r>
     </w:p>
     <w:sectPr>

</xml_diff>